<commit_message>
update report.docx with architecture and data model diagrams
</commit_message>
<xml_diff>
--- a/report.docx
+++ b/report.docx
@@ -54,7 +54,7 @@
           <w:sz w:val="22"/>
           <w:szCs w:val="22"/>
         </w:rPr>
-        <w:t xml:space="preserve">The app is built using Node.js and Express on the server side, EJS for server-side HTML templating, and MySQL for relational data storage. Passwords are hashed using bcrypt before being stored in the database, and login sessions are managed using express-session. The project follows an MVC folder structure with separate files for routes, controllers, views and middleware, keeping the codebase organised and easy to maintain.</w:t>
+        <w:t xml:space="preserve">The app is built using Node.js and Express on the server side, EJS for server-side HTML templating, and MySQL for relational data storage. Passwords are hashed using bcrypt before being stored in the database, and login sessions are managed using express-session. The project follows an MVC folder structure with separate files for routes, controllers, views and middleware.</w:t>
       </w:r>
     </w:p>
     <w:p>
@@ -96,33 +96,542 @@
           <w:sz w:val="22"/>
           <w:szCs w:val="22"/>
         </w:rPr>
-        <w:t xml:space="preserve">Application Tier: Node.js with the Express framework handles all HTTP requests. Incoming requests are passed through middleware (session handling, body parsing) before reaching the router. Routes direct each request to the appropriate controller function, which contains the business logic and queries the database. EJS templates in the views folder render the final HTML response sent back to the browser.</w:t>
-      </w:r>
-    </w:p>
-    <w:p>
-      <w:pPr>
-        <w:spacing w:after="160"/>
-      </w:pPr>
-      <w:r>
-        <w:rPr>
-          <w:rFonts w:ascii="Calibri" w:cs="Calibri" w:eastAsia="Calibri" w:hAnsi="Calibri"/>
-          <w:sz w:val="22"/>
-          <w:szCs w:val="22"/>
-        </w:rPr>
-        <w:t xml:space="preserve">Data Tier: A MySQL relational database stores all persistent data. The mysql2 package connects to the database using a connection pool, allowing multiple requests to be handled efficiently. Environment variables stored in a .env file keep database credentials separate from the codebase.</w:t>
-      </w:r>
-    </w:p>
-    <w:p>
-      <w:pPr>
-        <w:spacing w:after="160"/>
-      </w:pPr>
-      <w:r>
-        <w:rPr>
-          <w:rFonts w:ascii="Calibri" w:cs="Calibri" w:eastAsia="Calibri" w:hAnsi="Calibri"/>
-          <w:sz w:val="22"/>
-          <w:szCs w:val="22"/>
-        </w:rPr>
-        <w:t xml:space="preserve">Supporting libraries used: bcrypt (password hashing), express-session (login session management), dotenv (environment configuration), method-override (DELETE support in HTML forms).</w:t>
+        <w:t xml:space="preserve">Application Tier: Node.js with the Express framework handles all HTTP requests. Incoming requests pass through middleware (session handling, body parsing) before reaching the router. Routes direct each request to the appropriate controller, which queries the database and passes data to an EJS template to render the HTML response.</w:t>
+      </w:r>
+    </w:p>
+    <w:p>
+      <w:pPr>
+        <w:spacing w:after="160"/>
+      </w:pPr>
+      <w:r>
+        <w:rPr>
+          <w:rFonts w:ascii="Calibri" w:cs="Calibri" w:eastAsia="Calibri" w:hAnsi="Calibri"/>
+          <w:sz w:val="22"/>
+          <w:szCs w:val="22"/>
+        </w:rPr>
+        <w:t xml:space="preserve">Data Tier: A MySQL relational database stores all persistent data. The mysql2 package connects using a connection pool. Environment variables in a .env file keep credentials separate from the codebase.</w:t>
+      </w:r>
+    </w:p>
+    <w:p>
+      <w:pPr>
+        <w:spacing w:after="160"/>
+      </w:pPr>
+      <w:r>
+        <w:rPr>
+          <w:rFonts w:ascii="Calibri" w:cs="Calibri" w:eastAsia="Calibri" w:hAnsi="Calibri"/>
+          <w:sz w:val="22"/>
+          <w:szCs w:val="22"/>
+        </w:rPr>
+        <w:t xml:space="preserve">Supporting libraries: bcrypt (password hashing), express-session (login sessions), dotenv (environment config), method-override (DELETE support in HTML forms).</w:t>
+      </w:r>
+    </w:p>
+    <w:p>
+      <w:pPr>
+        <w:spacing w:after="80"/>
+      </w:pPr>
+      <w:r>
+        <w:t xml:space="preserve"/>
+      </w:r>
+    </w:p>
+    <w:p>
+      <w:pPr>
+        <w:spacing w:after="160"/>
+      </w:pPr>
+      <w:r>
+        <w:rPr>
+          <w:rFonts w:ascii="Calibri" w:cs="Calibri" w:eastAsia="Calibri" w:hAnsi="Calibri"/>
+          <w:b/>
+          <w:bCs/>
+          <w:sz w:val="22"/>
+          <w:szCs w:val="22"/>
+        </w:rPr>
+        <w:t xml:space="preserve">Architecture Diagram:</w:t>
+      </w:r>
+    </w:p>
+    <w:tbl>
+      <w:tblPr>
+        <w:tblW w:type="dxa" w:w="9000"/>
+        <w:tblBorders>
+          <w:top w:val="single" w:color="auto" w:sz="4"/>
+          <w:left w:val="single" w:color="auto" w:sz="4"/>
+          <w:bottom w:val="single" w:color="auto" w:sz="4"/>
+          <w:right w:val="single" w:color="auto" w:sz="4"/>
+          <w:insideH w:val="single" w:color="auto" w:sz="4"/>
+          <w:insideV w:val="single" w:color="auto" w:sz="4"/>
+        </w:tblBorders>
+      </w:tblPr>
+      <w:tblGrid>
+        <w:gridCol w:w="3000"/>
+        <w:gridCol w:w="3000"/>
+        <w:gridCol w:w="3000"/>
+      </w:tblGrid>
+      <w:tr>
+        <w:tc>
+          <w:tcPr>
+            <w:tcW w:type="dxa" w:w="3000"/>
+            <w:tcBorders>
+              <w:top w:val="single" w:color="999999" w:sz="1"/>
+              <w:left w:val="single" w:color="999999" w:sz="1"/>
+              <w:bottom w:val="single" w:color="999999" w:sz="1"/>
+              <w:right w:val="single" w:color="999999" w:sz="1"/>
+            </w:tcBorders>
+            <w:shd w:fill="D5E8F0" w:val="clear"/>
+            <w:tcMar>
+              <w:top w:type="dxa" w:w="80"/>
+              <w:left w:type="dxa" w:w="120"/>
+              <w:bottom w:type="dxa" w:w="80"/>
+              <w:right w:type="dxa" w:w="120"/>
+            </w:tcMar>
+          </w:tcPr>
+          <w:p>
+            <w:r>
+              <w:rPr>
+                <w:rFonts w:ascii="Calibri" w:cs="Calibri" w:eastAsia="Calibri" w:hAnsi="Calibri"/>
+                <w:b/>
+                <w:bCs/>
+                <w:sz w:val="20"/>
+                <w:szCs w:val="20"/>
+              </w:rPr>
+              <w:t xml:space="preserve">Browser</w:t>
+            </w:r>
+          </w:p>
+        </w:tc>
+        <w:tc>
+          <w:tcPr>
+            <w:tcW w:type="dxa" w:w="3000"/>
+            <w:tcBorders>
+              <w:top w:val="single" w:color="999999" w:sz="1"/>
+              <w:left w:val="single" w:color="999999" w:sz="1"/>
+              <w:bottom w:val="single" w:color="999999" w:sz="1"/>
+              <w:right w:val="single" w:color="999999" w:sz="1"/>
+            </w:tcBorders>
+            <w:shd w:fill="FFFFFF" w:val="clear"/>
+            <w:tcMar>
+              <w:top w:type="dxa" w:w="80"/>
+              <w:left w:type="dxa" w:w="120"/>
+              <w:bottom w:type="dxa" w:w="80"/>
+              <w:right w:type="dxa" w:w="120"/>
+            </w:tcMar>
+          </w:tcPr>
+          <w:p>
+            <w:r>
+              <w:rPr>
+                <w:rFonts w:ascii="Calibri" w:cs="Calibri" w:eastAsia="Calibri" w:hAnsi="Calibri"/>
+                <w:b w:val="false"/>
+                <w:bCs w:val="false"/>
+                <w:sz w:val="20"/>
+                <w:szCs w:val="20"/>
+              </w:rPr>
+              <w:t xml:space="preserve"/>
+            </w:r>
+          </w:p>
+        </w:tc>
+        <w:tc>
+          <w:tcPr>
+            <w:tcW w:type="dxa" w:w="3000"/>
+            <w:tcBorders>
+              <w:top w:val="single" w:color="999999" w:sz="1"/>
+              <w:left w:val="single" w:color="999999" w:sz="1"/>
+              <w:bottom w:val="single" w:color="999999" w:sz="1"/>
+              <w:right w:val="single" w:color="999999" w:sz="1"/>
+            </w:tcBorders>
+            <w:shd w:fill="FFFFFF" w:val="clear"/>
+            <w:tcMar>
+              <w:top w:type="dxa" w:w="80"/>
+              <w:left w:type="dxa" w:w="120"/>
+              <w:bottom w:type="dxa" w:w="80"/>
+              <w:right w:type="dxa" w:w="120"/>
+            </w:tcMar>
+          </w:tcPr>
+          <w:p>
+            <w:r>
+              <w:rPr>
+                <w:rFonts w:ascii="Calibri" w:cs="Calibri" w:eastAsia="Calibri" w:hAnsi="Calibri"/>
+                <w:b w:val="false"/>
+                <w:bCs w:val="false"/>
+                <w:sz w:val="20"/>
+                <w:szCs w:val="20"/>
+              </w:rPr>
+              <w:t xml:space="preserve"/>
+            </w:r>
+          </w:p>
+        </w:tc>
+      </w:tr>
+      <w:tr>
+        <w:tc>
+          <w:tcPr>
+            <w:tcW w:type="dxa" w:w="3000"/>
+            <w:tcBorders>
+              <w:top w:val="single" w:color="999999" w:sz="1"/>
+              <w:left w:val="single" w:color="999999" w:sz="1"/>
+              <w:bottom w:val="single" w:color="999999" w:sz="1"/>
+              <w:right w:val="single" w:color="999999" w:sz="1"/>
+            </w:tcBorders>
+            <w:shd w:fill="FFFFFF" w:val="clear"/>
+            <w:tcMar>
+              <w:top w:type="dxa" w:w="80"/>
+              <w:left w:type="dxa" w:w="120"/>
+              <w:bottom w:type="dxa" w:w="80"/>
+              <w:right w:type="dxa" w:w="120"/>
+            </w:tcMar>
+          </w:tcPr>
+          <w:p>
+            <w:r>
+              <w:rPr>
+                <w:rFonts w:ascii="Calibri" w:cs="Calibri" w:eastAsia="Calibri" w:hAnsi="Calibri"/>
+                <w:b w:val="false"/>
+                <w:bCs w:val="false"/>
+                <w:sz w:val="20"/>
+                <w:szCs w:val="20"/>
+              </w:rPr>
+              <w:t xml:space="preserve">HTTP Request / Response</w:t>
+            </w:r>
+          </w:p>
+        </w:tc>
+        <w:tc>
+          <w:tcPr>
+            <w:tcW w:type="dxa" w:w="3000"/>
+            <w:tcBorders>
+              <w:top w:val="single" w:color="999999" w:sz="1"/>
+              <w:left w:val="single" w:color="999999" w:sz="1"/>
+              <w:bottom w:val="single" w:color="999999" w:sz="1"/>
+              <w:right w:val="single" w:color="999999" w:sz="1"/>
+            </w:tcBorders>
+            <w:shd w:fill="FFFFFF" w:val="clear"/>
+            <w:tcMar>
+              <w:top w:type="dxa" w:w="80"/>
+              <w:left w:type="dxa" w:w="120"/>
+              <w:bottom w:type="dxa" w:w="80"/>
+              <w:right w:type="dxa" w:w="120"/>
+            </w:tcMar>
+          </w:tcPr>
+          <w:p>
+            <w:r>
+              <w:rPr>
+                <w:rFonts w:ascii="Calibri" w:cs="Calibri" w:eastAsia="Calibri" w:hAnsi="Calibri"/>
+                <w:b w:val="false"/>
+                <w:bCs w:val="false"/>
+                <w:sz w:val="20"/>
+                <w:szCs w:val="20"/>
+              </w:rPr>
+              <w:t xml:space="preserve"/>
+            </w:r>
+          </w:p>
+        </w:tc>
+        <w:tc>
+          <w:tcPr>
+            <w:tcW w:type="dxa" w:w="3000"/>
+            <w:tcBorders>
+              <w:top w:val="single" w:color="999999" w:sz="1"/>
+              <w:left w:val="single" w:color="999999" w:sz="1"/>
+              <w:bottom w:val="single" w:color="999999" w:sz="1"/>
+              <w:right w:val="single" w:color="999999" w:sz="1"/>
+            </w:tcBorders>
+            <w:shd w:fill="FFFFFF" w:val="clear"/>
+            <w:tcMar>
+              <w:top w:type="dxa" w:w="80"/>
+              <w:left w:type="dxa" w:w="120"/>
+              <w:bottom w:type="dxa" w:w="80"/>
+              <w:right w:type="dxa" w:w="120"/>
+            </w:tcMar>
+          </w:tcPr>
+          <w:p>
+            <w:r>
+              <w:rPr>
+                <w:rFonts w:ascii="Calibri" w:cs="Calibri" w:eastAsia="Calibri" w:hAnsi="Calibri"/>
+                <w:b w:val="false"/>
+                <w:bCs w:val="false"/>
+                <w:sz w:val="20"/>
+                <w:szCs w:val="20"/>
+              </w:rPr>
+              <w:t xml:space="preserve"/>
+            </w:r>
+          </w:p>
+        </w:tc>
+      </w:tr>
+      <w:tr>
+        <w:tc>
+          <w:tcPr>
+            <w:tcW w:type="dxa" w:w="3000"/>
+            <w:tcBorders>
+              <w:top w:val="single" w:color="999999" w:sz="1"/>
+              <w:left w:val="single" w:color="999999" w:sz="1"/>
+              <w:bottom w:val="single" w:color="999999" w:sz="1"/>
+              <w:right w:val="single" w:color="999999" w:sz="1"/>
+            </w:tcBorders>
+            <w:shd w:fill="D5F0D5" w:val="clear"/>
+            <w:tcMar>
+              <w:top w:type="dxa" w:w="80"/>
+              <w:left w:type="dxa" w:w="120"/>
+              <w:bottom w:type="dxa" w:w="80"/>
+              <w:right w:type="dxa" w:w="120"/>
+            </w:tcMar>
+          </w:tcPr>
+          <w:p>
+            <w:r>
+              <w:rPr>
+                <w:rFonts w:ascii="Calibri" w:cs="Calibri" w:eastAsia="Calibri" w:hAnsi="Calibri"/>
+                <w:b/>
+                <w:bCs/>
+                <w:sz w:val="20"/>
+                <w:szCs w:val="20"/>
+              </w:rPr>
+              <w:t xml:space="preserve">Express / Node.js</w:t>
+            </w:r>
+          </w:p>
+        </w:tc>
+        <w:tc>
+          <w:tcPr>
+            <w:tcW w:type="dxa" w:w="3000"/>
+            <w:tcBorders>
+              <w:top w:val="single" w:color="999999" w:sz="1"/>
+              <w:left w:val="single" w:color="999999" w:sz="1"/>
+              <w:bottom w:val="single" w:color="999999" w:sz="1"/>
+              <w:right w:val="single" w:color="999999" w:sz="1"/>
+            </w:tcBorders>
+            <w:shd w:fill="D5F0D5" w:val="clear"/>
+            <w:tcMar>
+              <w:top w:type="dxa" w:w="80"/>
+              <w:left w:type="dxa" w:w="120"/>
+              <w:bottom w:type="dxa" w:w="80"/>
+              <w:right w:type="dxa" w:w="120"/>
+            </w:tcMar>
+          </w:tcPr>
+          <w:p>
+            <w:r>
+              <w:rPr>
+                <w:rFonts w:ascii="Calibri" w:cs="Calibri" w:eastAsia="Calibri" w:hAnsi="Calibri"/>
+                <w:b w:val="false"/>
+                <w:bCs w:val="false"/>
+                <w:sz w:val="20"/>
+                <w:szCs w:val="20"/>
+              </w:rPr>
+              <w:t xml:space="preserve">Routes + Controllers</w:t>
+            </w:r>
+          </w:p>
+        </w:tc>
+        <w:tc>
+          <w:tcPr>
+            <w:tcW w:type="dxa" w:w="3000"/>
+            <w:tcBorders>
+              <w:top w:val="single" w:color="999999" w:sz="1"/>
+              <w:left w:val="single" w:color="999999" w:sz="1"/>
+              <w:bottom w:val="single" w:color="999999" w:sz="1"/>
+              <w:right w:val="single" w:color="999999" w:sz="1"/>
+            </w:tcBorders>
+            <w:shd w:fill="D5F0D5" w:val="clear"/>
+            <w:tcMar>
+              <w:top w:type="dxa" w:w="80"/>
+              <w:left w:type="dxa" w:w="120"/>
+              <w:bottom w:type="dxa" w:w="80"/>
+              <w:right w:type="dxa" w:w="120"/>
+            </w:tcMar>
+          </w:tcPr>
+          <w:p>
+            <w:r>
+              <w:rPr>
+                <w:rFonts w:ascii="Calibri" w:cs="Calibri" w:eastAsia="Calibri" w:hAnsi="Calibri"/>
+                <w:b w:val="false"/>
+                <w:bCs w:val="false"/>
+                <w:sz w:val="20"/>
+                <w:szCs w:val="20"/>
+              </w:rPr>
+              <w:t xml:space="preserve">EJS Views</w:t>
+            </w:r>
+          </w:p>
+        </w:tc>
+      </w:tr>
+      <w:tr>
+        <w:tc>
+          <w:tcPr>
+            <w:tcW w:type="dxa" w:w="3000"/>
+            <w:tcBorders>
+              <w:top w:val="single" w:color="999999" w:sz="1"/>
+              <w:left w:val="single" w:color="999999" w:sz="1"/>
+              <w:bottom w:val="single" w:color="999999" w:sz="1"/>
+              <w:right w:val="single" w:color="999999" w:sz="1"/>
+            </w:tcBorders>
+            <w:shd w:fill="FFFFFF" w:val="clear"/>
+            <w:tcMar>
+              <w:top w:type="dxa" w:w="80"/>
+              <w:left w:type="dxa" w:w="120"/>
+              <w:bottom w:type="dxa" w:w="80"/>
+              <w:right w:type="dxa" w:w="120"/>
+            </w:tcMar>
+          </w:tcPr>
+          <w:p>
+            <w:r>
+              <w:rPr>
+                <w:rFonts w:ascii="Calibri" w:cs="Calibri" w:eastAsia="Calibri" w:hAnsi="Calibri"/>
+                <w:b w:val="false"/>
+                <w:bCs w:val="false"/>
+                <w:sz w:val="20"/>
+                <w:szCs w:val="20"/>
+              </w:rPr>
+              <w:t xml:space="preserve">mysql2 connection pool</w:t>
+            </w:r>
+          </w:p>
+        </w:tc>
+        <w:tc>
+          <w:tcPr>
+            <w:tcW w:type="dxa" w:w="3000"/>
+            <w:tcBorders>
+              <w:top w:val="single" w:color="999999" w:sz="1"/>
+              <w:left w:val="single" w:color="999999" w:sz="1"/>
+              <w:bottom w:val="single" w:color="999999" w:sz="1"/>
+              <w:right w:val="single" w:color="999999" w:sz="1"/>
+            </w:tcBorders>
+            <w:shd w:fill="FFFFFF" w:val="clear"/>
+            <w:tcMar>
+              <w:top w:type="dxa" w:w="80"/>
+              <w:left w:type="dxa" w:w="120"/>
+              <w:bottom w:type="dxa" w:w="80"/>
+              <w:right w:type="dxa" w:w="120"/>
+            </w:tcMar>
+          </w:tcPr>
+          <w:p>
+            <w:r>
+              <w:rPr>
+                <w:rFonts w:ascii="Calibri" w:cs="Calibri" w:eastAsia="Calibri" w:hAnsi="Calibri"/>
+                <w:b w:val="false"/>
+                <w:bCs w:val="false"/>
+                <w:sz w:val="20"/>
+                <w:szCs w:val="20"/>
+              </w:rPr>
+              <w:t xml:space="preserve"/>
+            </w:r>
+          </w:p>
+        </w:tc>
+        <w:tc>
+          <w:tcPr>
+            <w:tcW w:type="dxa" w:w="3000"/>
+            <w:tcBorders>
+              <w:top w:val="single" w:color="999999" w:sz="1"/>
+              <w:left w:val="single" w:color="999999" w:sz="1"/>
+              <w:bottom w:val="single" w:color="999999" w:sz="1"/>
+              <w:right w:val="single" w:color="999999" w:sz="1"/>
+            </w:tcBorders>
+            <w:shd w:fill="FFFFFF" w:val="clear"/>
+            <w:tcMar>
+              <w:top w:type="dxa" w:w="80"/>
+              <w:left w:type="dxa" w:w="120"/>
+              <w:bottom w:type="dxa" w:w="80"/>
+              <w:right w:type="dxa" w:w="120"/>
+            </w:tcMar>
+          </w:tcPr>
+          <w:p>
+            <w:r>
+              <w:rPr>
+                <w:rFonts w:ascii="Calibri" w:cs="Calibri" w:eastAsia="Calibri" w:hAnsi="Calibri"/>
+                <w:b w:val="false"/>
+                <w:bCs w:val="false"/>
+                <w:sz w:val="20"/>
+                <w:szCs w:val="20"/>
+              </w:rPr>
+              <w:t xml:space="preserve"/>
+            </w:r>
+          </w:p>
+        </w:tc>
+      </w:tr>
+      <w:tr>
+        <w:tc>
+          <w:tcPr>
+            <w:tcW w:type="dxa" w:w="3000"/>
+            <w:tcBorders>
+              <w:top w:val="single" w:color="999999" w:sz="1"/>
+              <w:left w:val="single" w:color="999999" w:sz="1"/>
+              <w:bottom w:val="single" w:color="999999" w:sz="1"/>
+              <w:right w:val="single" w:color="999999" w:sz="1"/>
+            </w:tcBorders>
+            <w:shd w:fill="FDE8D5" w:val="clear"/>
+            <w:tcMar>
+              <w:top w:type="dxa" w:w="80"/>
+              <w:left w:type="dxa" w:w="120"/>
+              <w:bottom w:type="dxa" w:w="80"/>
+              <w:right w:type="dxa" w:w="120"/>
+            </w:tcMar>
+          </w:tcPr>
+          <w:p>
+            <w:r>
+              <w:rPr>
+                <w:rFonts w:ascii="Calibri" w:cs="Calibri" w:eastAsia="Calibri" w:hAnsi="Calibri"/>
+                <w:b/>
+                <w:bCs/>
+                <w:sz w:val="20"/>
+                <w:szCs w:val="20"/>
+              </w:rPr>
+              <w:t xml:space="preserve">MySQL Database (health)</w:t>
+            </w:r>
+          </w:p>
+        </w:tc>
+        <w:tc>
+          <w:tcPr>
+            <w:tcW w:type="dxa" w:w="3000"/>
+            <w:tcBorders>
+              <w:top w:val="single" w:color="999999" w:sz="1"/>
+              <w:left w:val="single" w:color="999999" w:sz="1"/>
+              <w:bottom w:val="single" w:color="999999" w:sz="1"/>
+              <w:right w:val="single" w:color="999999" w:sz="1"/>
+            </w:tcBorders>
+            <w:shd w:fill="FDE8D5" w:val="clear"/>
+            <w:tcMar>
+              <w:top w:type="dxa" w:w="80"/>
+              <w:left w:type="dxa" w:w="120"/>
+              <w:bottom w:type="dxa" w:w="80"/>
+              <w:right w:type="dxa" w:w="120"/>
+            </w:tcMar>
+          </w:tcPr>
+          <w:p>
+            <w:r>
+              <w:rPr>
+                <w:rFonts w:ascii="Calibri" w:cs="Calibri" w:eastAsia="Calibri" w:hAnsi="Calibri"/>
+                <w:b w:val="false"/>
+                <w:bCs w:val="false"/>
+                <w:sz w:val="20"/>
+                <w:szCs w:val="20"/>
+              </w:rPr>
+              <w:t xml:space="preserve">users table</w:t>
+            </w:r>
+          </w:p>
+        </w:tc>
+        <w:tc>
+          <w:tcPr>
+            <w:tcW w:type="dxa" w:w="3000"/>
+            <w:tcBorders>
+              <w:top w:val="single" w:color="999999" w:sz="1"/>
+              <w:left w:val="single" w:color="999999" w:sz="1"/>
+              <w:bottom w:val="single" w:color="999999" w:sz="1"/>
+              <w:right w:val="single" w:color="999999" w:sz="1"/>
+            </w:tcBorders>
+            <w:shd w:fill="FDE8D5" w:val="clear"/>
+            <w:tcMar>
+              <w:top w:type="dxa" w:w="80"/>
+              <w:left w:type="dxa" w:w="120"/>
+              <w:bottom w:type="dxa" w:w="80"/>
+              <w:right w:type="dxa" w:w="120"/>
+            </w:tcMar>
+          </w:tcPr>
+          <w:p>
+            <w:r>
+              <w:rPr>
+                <w:rFonts w:ascii="Calibri" w:cs="Calibri" w:eastAsia="Calibri" w:hAnsi="Calibri"/>
+                <w:b w:val="false"/>
+                <w:bCs w:val="false"/>
+                <w:sz w:val="20"/>
+                <w:szCs w:val="20"/>
+              </w:rPr>
+              <w:t xml:space="preserve">workouts table</w:t>
+            </w:r>
+          </w:p>
+        </w:tc>
+      </w:tr>
+    </w:tbl>
+    <w:p>
+      <w:pPr>
+        <w:spacing w:after="80"/>
+      </w:pPr>
+      <w:r>
+        <w:t xml:space="preserve"/>
       </w:r>
     </w:p>
     <w:p>
@@ -151,46 +660,688 @@
           <w:sz w:val="22"/>
           <w:szCs w:val="22"/>
         </w:rPr>
-        <w:t xml:space="preserve">The database contains two tables with a one-to-many relationship.</w:t>
-      </w:r>
-    </w:p>
-    <w:p>
-      <w:pPr>
-        <w:spacing w:after="160"/>
-      </w:pPr>
-      <w:r>
-        <w:rPr>
-          <w:rFonts w:ascii="Calibri" w:cs="Calibri" w:eastAsia="Calibri" w:hAnsi="Calibri"/>
-          <w:sz w:val="22"/>
-          <w:szCs w:val="22"/>
-        </w:rPr>
-        <w:t xml:space="preserve">users table: stores id (primary key, auto increment), username (unique), email (unique), password_hash and created_at timestamp.</w:t>
-      </w:r>
-    </w:p>
-    <w:p>
-      <w:pPr>
-        <w:spacing w:after="160"/>
-      </w:pPr>
-      <w:r>
-        <w:rPr>
-          <w:rFonts w:ascii="Calibri" w:cs="Calibri" w:eastAsia="Calibri" w:hAnsi="Calibri"/>
-          <w:sz w:val="22"/>
-          <w:szCs w:val="22"/>
-        </w:rPr>
-        <w:t xml:space="preserve">workouts table: stores id (primary key, auto increment), user_id (foreign key referencing users.id), exercise_name, category, duration_mins, notes, workout_date and created_at timestamp. The foreign key uses ON DELETE CASCADE, meaning if a user account is deleted all their workouts are automatically removed.</w:t>
-      </w:r>
-    </w:p>
-    <w:p>
-      <w:pPr>
-        <w:spacing w:after="160"/>
-      </w:pPr>
-      <w:r>
-        <w:rPr>
-          <w:rFonts w:ascii="Calibri" w:cs="Calibri" w:eastAsia="Calibri" w:hAnsi="Calibri"/>
-          <w:sz w:val="22"/>
-          <w:szCs w:val="22"/>
-        </w:rPr>
-        <w:t xml:space="preserve">Each user can have many workouts, but each workout belongs to exactly one user. This relationship ensures data is kept private — all queries filter by user_id so users only ever see their own entries.</w:t>
+        <w:t xml:space="preserve">The database contains two tables with a one-to-many relationship. Each user can have many workouts, but each workout belongs to exactly one user. The foreign key on workouts.user_id references users.id with ON DELETE CASCADE, so deleting a user removes all their workouts automatically.</w:t>
+      </w:r>
+    </w:p>
+    <w:p>
+      <w:pPr>
+        <w:spacing w:after="160"/>
+      </w:pPr>
+      <w:r>
+        <w:rPr>
+          <w:rFonts w:ascii="Calibri" w:cs="Calibri" w:eastAsia="Calibri" w:hAnsi="Calibri"/>
+          <w:sz w:val="22"/>
+          <w:szCs w:val="22"/>
+        </w:rPr>
+        <w:t xml:space="preserve">All queries filter by user_id to ensure users only ever see their own data.</w:t>
+      </w:r>
+    </w:p>
+    <w:p>
+      <w:pPr>
+        <w:spacing w:after="80"/>
+      </w:pPr>
+      <w:r>
+        <w:t xml:space="preserve"/>
+      </w:r>
+    </w:p>
+    <w:p>
+      <w:pPr>
+        <w:spacing w:after="160"/>
+      </w:pPr>
+      <w:r>
+        <w:rPr>
+          <w:rFonts w:ascii="Calibri" w:cs="Calibri" w:eastAsia="Calibri" w:hAnsi="Calibri"/>
+          <w:b/>
+          <w:bCs/>
+          <w:sz w:val="22"/>
+          <w:szCs w:val="22"/>
+        </w:rPr>
+        <w:t xml:space="preserve">Data Model Diagram:</w:t>
+      </w:r>
+    </w:p>
+    <w:tbl>
+      <w:tblPr>
+        <w:tblW w:type="dxa" w:w="9000"/>
+        <w:tblBorders>
+          <w:top w:val="single" w:color="auto" w:sz="4"/>
+          <w:left w:val="single" w:color="auto" w:sz="4"/>
+          <w:bottom w:val="single" w:color="auto" w:sz="4"/>
+          <w:right w:val="single" w:color="auto" w:sz="4"/>
+          <w:insideH w:val="single" w:color="auto" w:sz="4"/>
+          <w:insideV w:val="single" w:color="auto" w:sz="4"/>
+        </w:tblBorders>
+      </w:tblPr>
+      <w:tblGrid>
+        <w:gridCol w:w="4500"/>
+        <w:gridCol w:w="4500"/>
+      </w:tblGrid>
+      <w:tr>
+        <w:tc>
+          <w:tcPr>
+            <w:tcW w:type="dxa" w:w="4500"/>
+            <w:tcBorders>
+              <w:top w:val="single" w:color="999999" w:sz="1"/>
+              <w:left w:val="single" w:color="999999" w:sz="1"/>
+              <w:bottom w:val="single" w:color="999999" w:sz="1"/>
+              <w:right w:val="single" w:color="999999" w:sz="1"/>
+            </w:tcBorders>
+            <w:shd w:fill="D5E8F0" w:val="clear"/>
+            <w:tcMar>
+              <w:top w:type="dxa" w:w="80"/>
+              <w:left w:type="dxa" w:w="120"/>
+              <w:bottom w:type="dxa" w:w="80"/>
+              <w:right w:type="dxa" w:w="120"/>
+            </w:tcMar>
+          </w:tcPr>
+          <w:p>
+            <w:r>
+              <w:rPr>
+                <w:rFonts w:ascii="Calibri" w:cs="Calibri" w:eastAsia="Calibri" w:hAnsi="Calibri"/>
+                <w:b/>
+                <w:bCs/>
+                <w:sz w:val="20"/>
+                <w:szCs w:val="20"/>
+              </w:rPr>
+              <w:t xml:space="preserve">users</w:t>
+            </w:r>
+          </w:p>
+        </w:tc>
+        <w:tc>
+          <w:tcPr>
+            <w:tcW w:type="dxa" w:w="4500"/>
+            <w:tcBorders>
+              <w:top w:val="single" w:color="999999" w:sz="1"/>
+              <w:left w:val="single" w:color="999999" w:sz="1"/>
+              <w:bottom w:val="single" w:color="999999" w:sz="1"/>
+              <w:right w:val="single" w:color="999999" w:sz="1"/>
+            </w:tcBorders>
+            <w:shd w:fill="D5F0D5" w:val="clear"/>
+            <w:tcMar>
+              <w:top w:type="dxa" w:w="80"/>
+              <w:left w:type="dxa" w:w="120"/>
+              <w:bottom w:type="dxa" w:w="80"/>
+              <w:right w:type="dxa" w:w="120"/>
+            </w:tcMar>
+          </w:tcPr>
+          <w:p>
+            <w:r>
+              <w:rPr>
+                <w:rFonts w:ascii="Calibri" w:cs="Calibri" w:eastAsia="Calibri" w:hAnsi="Calibri"/>
+                <w:b/>
+                <w:bCs/>
+                <w:sz w:val="20"/>
+                <w:szCs w:val="20"/>
+              </w:rPr>
+              <w:t xml:space="preserve">workouts</w:t>
+            </w:r>
+          </w:p>
+        </w:tc>
+      </w:tr>
+      <w:tr>
+        <w:tc>
+          <w:tcPr>
+            <w:tcW w:type="dxa" w:w="4500"/>
+            <w:tcBorders>
+              <w:top w:val="single" w:color="999999" w:sz="1"/>
+              <w:left w:val="single" w:color="999999" w:sz="1"/>
+              <w:bottom w:val="single" w:color="999999" w:sz="1"/>
+              <w:right w:val="single" w:color="999999" w:sz="1"/>
+            </w:tcBorders>
+            <w:shd w:fill="FFFFFF" w:val="clear"/>
+            <w:tcMar>
+              <w:top w:type="dxa" w:w="80"/>
+              <w:left w:type="dxa" w:w="120"/>
+              <w:bottom w:type="dxa" w:w="80"/>
+              <w:right w:type="dxa" w:w="120"/>
+            </w:tcMar>
+          </w:tcPr>
+          <w:p>
+            <w:r>
+              <w:rPr>
+                <w:rFonts w:ascii="Calibri" w:cs="Calibri" w:eastAsia="Calibri" w:hAnsi="Calibri"/>
+                <w:b w:val="false"/>
+                <w:bCs w:val="false"/>
+                <w:sz w:val="20"/>
+                <w:szCs w:val="20"/>
+              </w:rPr>
+              <w:t xml:space="preserve">id (PK, auto increment)</w:t>
+            </w:r>
+          </w:p>
+        </w:tc>
+        <w:tc>
+          <w:tcPr>
+            <w:tcW w:type="dxa" w:w="4500"/>
+            <w:tcBorders>
+              <w:top w:val="single" w:color="999999" w:sz="1"/>
+              <w:left w:val="single" w:color="999999" w:sz="1"/>
+              <w:bottom w:val="single" w:color="999999" w:sz="1"/>
+              <w:right w:val="single" w:color="999999" w:sz="1"/>
+            </w:tcBorders>
+            <w:shd w:fill="FFFFFF" w:val="clear"/>
+            <w:tcMar>
+              <w:top w:type="dxa" w:w="80"/>
+              <w:left w:type="dxa" w:w="120"/>
+              <w:bottom w:type="dxa" w:w="80"/>
+              <w:right w:type="dxa" w:w="120"/>
+            </w:tcMar>
+          </w:tcPr>
+          <w:p>
+            <w:r>
+              <w:rPr>
+                <w:rFonts w:ascii="Calibri" w:cs="Calibri" w:eastAsia="Calibri" w:hAnsi="Calibri"/>
+                <w:b w:val="false"/>
+                <w:bCs w:val="false"/>
+                <w:sz w:val="20"/>
+                <w:szCs w:val="20"/>
+              </w:rPr>
+              <w:t xml:space="preserve">id (PK, auto increment)</w:t>
+            </w:r>
+          </w:p>
+        </w:tc>
+      </w:tr>
+      <w:tr>
+        <w:tc>
+          <w:tcPr>
+            <w:tcW w:type="dxa" w:w="4500"/>
+            <w:tcBorders>
+              <w:top w:val="single" w:color="999999" w:sz="1"/>
+              <w:left w:val="single" w:color="999999" w:sz="1"/>
+              <w:bottom w:val="single" w:color="999999" w:sz="1"/>
+              <w:right w:val="single" w:color="999999" w:sz="1"/>
+            </w:tcBorders>
+            <w:shd w:fill="FFFFFF" w:val="clear"/>
+            <w:tcMar>
+              <w:top w:type="dxa" w:w="80"/>
+              <w:left w:type="dxa" w:w="120"/>
+              <w:bottom w:type="dxa" w:w="80"/>
+              <w:right w:type="dxa" w:w="120"/>
+            </w:tcMar>
+          </w:tcPr>
+          <w:p>
+            <w:r>
+              <w:rPr>
+                <w:rFonts w:ascii="Calibri" w:cs="Calibri" w:eastAsia="Calibri" w:hAnsi="Calibri"/>
+                <w:b w:val="false"/>
+                <w:bCs w:val="false"/>
+                <w:sz w:val="20"/>
+                <w:szCs w:val="20"/>
+              </w:rPr>
+              <w:t xml:space="preserve">username (unique)</w:t>
+            </w:r>
+          </w:p>
+        </w:tc>
+        <w:tc>
+          <w:tcPr>
+            <w:tcW w:type="dxa" w:w="4500"/>
+            <w:tcBorders>
+              <w:top w:val="single" w:color="999999" w:sz="1"/>
+              <w:left w:val="single" w:color="999999" w:sz="1"/>
+              <w:bottom w:val="single" w:color="999999" w:sz="1"/>
+              <w:right w:val="single" w:color="999999" w:sz="1"/>
+            </w:tcBorders>
+            <w:shd w:fill="FFFFFF" w:val="clear"/>
+            <w:tcMar>
+              <w:top w:type="dxa" w:w="80"/>
+              <w:left w:type="dxa" w:w="120"/>
+              <w:bottom w:type="dxa" w:w="80"/>
+              <w:right w:type="dxa" w:w="120"/>
+            </w:tcMar>
+          </w:tcPr>
+          <w:p>
+            <w:r>
+              <w:rPr>
+                <w:rFonts w:ascii="Calibri" w:cs="Calibri" w:eastAsia="Calibri" w:hAnsi="Calibri"/>
+                <w:b w:val="false"/>
+                <w:bCs w:val="false"/>
+                <w:sz w:val="20"/>
+                <w:szCs w:val="20"/>
+              </w:rPr>
+              <w:t xml:space="preserve">user_id (FK -&gt; users.id)</w:t>
+            </w:r>
+          </w:p>
+        </w:tc>
+      </w:tr>
+      <w:tr>
+        <w:tc>
+          <w:tcPr>
+            <w:tcW w:type="dxa" w:w="4500"/>
+            <w:tcBorders>
+              <w:top w:val="single" w:color="999999" w:sz="1"/>
+              <w:left w:val="single" w:color="999999" w:sz="1"/>
+              <w:bottom w:val="single" w:color="999999" w:sz="1"/>
+              <w:right w:val="single" w:color="999999" w:sz="1"/>
+            </w:tcBorders>
+            <w:shd w:fill="FFFFFF" w:val="clear"/>
+            <w:tcMar>
+              <w:top w:type="dxa" w:w="80"/>
+              <w:left w:type="dxa" w:w="120"/>
+              <w:bottom w:type="dxa" w:w="80"/>
+              <w:right w:type="dxa" w:w="120"/>
+            </w:tcMar>
+          </w:tcPr>
+          <w:p>
+            <w:r>
+              <w:rPr>
+                <w:rFonts w:ascii="Calibri" w:cs="Calibri" w:eastAsia="Calibri" w:hAnsi="Calibri"/>
+                <w:b w:val="false"/>
+                <w:bCs w:val="false"/>
+                <w:sz w:val="20"/>
+                <w:szCs w:val="20"/>
+              </w:rPr>
+              <w:t xml:space="preserve">email (unique)</w:t>
+            </w:r>
+          </w:p>
+        </w:tc>
+        <w:tc>
+          <w:tcPr>
+            <w:tcW w:type="dxa" w:w="4500"/>
+            <w:tcBorders>
+              <w:top w:val="single" w:color="999999" w:sz="1"/>
+              <w:left w:val="single" w:color="999999" w:sz="1"/>
+              <w:bottom w:val="single" w:color="999999" w:sz="1"/>
+              <w:right w:val="single" w:color="999999" w:sz="1"/>
+            </w:tcBorders>
+            <w:shd w:fill="FFFFFF" w:val="clear"/>
+            <w:tcMar>
+              <w:top w:type="dxa" w:w="80"/>
+              <w:left w:type="dxa" w:w="120"/>
+              <w:bottom w:type="dxa" w:w="80"/>
+              <w:right w:type="dxa" w:w="120"/>
+            </w:tcMar>
+          </w:tcPr>
+          <w:p>
+            <w:r>
+              <w:rPr>
+                <w:rFonts w:ascii="Calibri" w:cs="Calibri" w:eastAsia="Calibri" w:hAnsi="Calibri"/>
+                <w:b w:val="false"/>
+                <w:bCs w:val="false"/>
+                <w:sz w:val="20"/>
+                <w:szCs w:val="20"/>
+              </w:rPr>
+              <w:t xml:space="preserve">exercise_name</w:t>
+            </w:r>
+          </w:p>
+        </w:tc>
+      </w:tr>
+      <w:tr>
+        <w:tc>
+          <w:tcPr>
+            <w:tcW w:type="dxa" w:w="4500"/>
+            <w:tcBorders>
+              <w:top w:val="single" w:color="999999" w:sz="1"/>
+              <w:left w:val="single" w:color="999999" w:sz="1"/>
+              <w:bottom w:val="single" w:color="999999" w:sz="1"/>
+              <w:right w:val="single" w:color="999999" w:sz="1"/>
+            </w:tcBorders>
+            <w:shd w:fill="FFFFFF" w:val="clear"/>
+            <w:tcMar>
+              <w:top w:type="dxa" w:w="80"/>
+              <w:left w:type="dxa" w:w="120"/>
+              <w:bottom w:type="dxa" w:w="80"/>
+              <w:right w:type="dxa" w:w="120"/>
+            </w:tcMar>
+          </w:tcPr>
+          <w:p>
+            <w:r>
+              <w:rPr>
+                <w:rFonts w:ascii="Calibri" w:cs="Calibri" w:eastAsia="Calibri" w:hAnsi="Calibri"/>
+                <w:b w:val="false"/>
+                <w:bCs w:val="false"/>
+                <w:sz w:val="20"/>
+                <w:szCs w:val="20"/>
+              </w:rPr>
+              <w:t xml:space="preserve">password_hash</w:t>
+            </w:r>
+          </w:p>
+        </w:tc>
+        <w:tc>
+          <w:tcPr>
+            <w:tcW w:type="dxa" w:w="4500"/>
+            <w:tcBorders>
+              <w:top w:val="single" w:color="999999" w:sz="1"/>
+              <w:left w:val="single" w:color="999999" w:sz="1"/>
+              <w:bottom w:val="single" w:color="999999" w:sz="1"/>
+              <w:right w:val="single" w:color="999999" w:sz="1"/>
+            </w:tcBorders>
+            <w:shd w:fill="FFFFFF" w:val="clear"/>
+            <w:tcMar>
+              <w:top w:type="dxa" w:w="80"/>
+              <w:left w:type="dxa" w:w="120"/>
+              <w:bottom w:type="dxa" w:w="80"/>
+              <w:right w:type="dxa" w:w="120"/>
+            </w:tcMar>
+          </w:tcPr>
+          <w:p>
+            <w:r>
+              <w:rPr>
+                <w:rFonts w:ascii="Calibri" w:cs="Calibri" w:eastAsia="Calibri" w:hAnsi="Calibri"/>
+                <w:b w:val="false"/>
+                <w:bCs w:val="false"/>
+                <w:sz w:val="20"/>
+                <w:szCs w:val="20"/>
+              </w:rPr>
+              <w:t xml:space="preserve">category</w:t>
+            </w:r>
+          </w:p>
+        </w:tc>
+      </w:tr>
+      <w:tr>
+        <w:tc>
+          <w:tcPr>
+            <w:tcW w:type="dxa" w:w="4500"/>
+            <w:tcBorders>
+              <w:top w:val="single" w:color="999999" w:sz="1"/>
+              <w:left w:val="single" w:color="999999" w:sz="1"/>
+              <w:bottom w:val="single" w:color="999999" w:sz="1"/>
+              <w:right w:val="single" w:color="999999" w:sz="1"/>
+            </w:tcBorders>
+            <w:shd w:fill="FFFFFF" w:val="clear"/>
+            <w:tcMar>
+              <w:top w:type="dxa" w:w="80"/>
+              <w:left w:type="dxa" w:w="120"/>
+              <w:bottom w:type="dxa" w:w="80"/>
+              <w:right w:type="dxa" w:w="120"/>
+            </w:tcMar>
+          </w:tcPr>
+          <w:p>
+            <w:r>
+              <w:rPr>
+                <w:rFonts w:ascii="Calibri" w:cs="Calibri" w:eastAsia="Calibri" w:hAnsi="Calibri"/>
+                <w:b w:val="false"/>
+                <w:bCs w:val="false"/>
+                <w:sz w:val="20"/>
+                <w:szCs w:val="20"/>
+              </w:rPr>
+              <w:t xml:space="preserve">created_at</w:t>
+            </w:r>
+          </w:p>
+        </w:tc>
+        <w:tc>
+          <w:tcPr>
+            <w:tcW w:type="dxa" w:w="4500"/>
+            <w:tcBorders>
+              <w:top w:val="single" w:color="999999" w:sz="1"/>
+              <w:left w:val="single" w:color="999999" w:sz="1"/>
+              <w:bottom w:val="single" w:color="999999" w:sz="1"/>
+              <w:right w:val="single" w:color="999999" w:sz="1"/>
+            </w:tcBorders>
+            <w:shd w:fill="FFFFFF" w:val="clear"/>
+            <w:tcMar>
+              <w:top w:type="dxa" w:w="80"/>
+              <w:left w:type="dxa" w:w="120"/>
+              <w:bottom w:type="dxa" w:w="80"/>
+              <w:right w:type="dxa" w:w="120"/>
+            </w:tcMar>
+          </w:tcPr>
+          <w:p>
+            <w:r>
+              <w:rPr>
+                <w:rFonts w:ascii="Calibri" w:cs="Calibri" w:eastAsia="Calibri" w:hAnsi="Calibri"/>
+                <w:b w:val="false"/>
+                <w:bCs w:val="false"/>
+                <w:sz w:val="20"/>
+                <w:szCs w:val="20"/>
+              </w:rPr>
+              <w:t xml:space="preserve">duration_mins</w:t>
+            </w:r>
+          </w:p>
+        </w:tc>
+      </w:tr>
+      <w:tr>
+        <w:tc>
+          <w:tcPr>
+            <w:tcW w:type="dxa" w:w="4500"/>
+            <w:tcBorders>
+              <w:top w:val="single" w:color="999999" w:sz="1"/>
+              <w:left w:val="single" w:color="999999" w:sz="1"/>
+              <w:bottom w:val="single" w:color="999999" w:sz="1"/>
+              <w:right w:val="single" w:color="999999" w:sz="1"/>
+            </w:tcBorders>
+            <w:shd w:fill="FFFFFF" w:val="clear"/>
+            <w:tcMar>
+              <w:top w:type="dxa" w:w="80"/>
+              <w:left w:type="dxa" w:w="120"/>
+              <w:bottom w:type="dxa" w:w="80"/>
+              <w:right w:type="dxa" w:w="120"/>
+            </w:tcMar>
+          </w:tcPr>
+          <w:p>
+            <w:r>
+              <w:rPr>
+                <w:rFonts w:ascii="Calibri" w:cs="Calibri" w:eastAsia="Calibri" w:hAnsi="Calibri"/>
+                <w:b w:val="false"/>
+                <w:bCs w:val="false"/>
+                <w:sz w:val="20"/>
+                <w:szCs w:val="20"/>
+              </w:rPr>
+              <w:t xml:space="preserve"/>
+            </w:r>
+          </w:p>
+        </w:tc>
+        <w:tc>
+          <w:tcPr>
+            <w:tcW w:type="dxa" w:w="4500"/>
+            <w:tcBorders>
+              <w:top w:val="single" w:color="999999" w:sz="1"/>
+              <w:left w:val="single" w:color="999999" w:sz="1"/>
+              <w:bottom w:val="single" w:color="999999" w:sz="1"/>
+              <w:right w:val="single" w:color="999999" w:sz="1"/>
+            </w:tcBorders>
+            <w:shd w:fill="FFFFFF" w:val="clear"/>
+            <w:tcMar>
+              <w:top w:type="dxa" w:w="80"/>
+              <w:left w:type="dxa" w:w="120"/>
+              <w:bottom w:type="dxa" w:w="80"/>
+              <w:right w:type="dxa" w:w="120"/>
+            </w:tcMar>
+          </w:tcPr>
+          <w:p>
+            <w:r>
+              <w:rPr>
+                <w:rFonts w:ascii="Calibri" w:cs="Calibri" w:eastAsia="Calibri" w:hAnsi="Calibri"/>
+                <w:b w:val="false"/>
+                <w:bCs w:val="false"/>
+                <w:sz w:val="20"/>
+                <w:szCs w:val="20"/>
+              </w:rPr>
+              <w:t xml:space="preserve">notes</w:t>
+            </w:r>
+          </w:p>
+        </w:tc>
+      </w:tr>
+      <w:tr>
+        <w:tc>
+          <w:tcPr>
+            <w:tcW w:type="dxa" w:w="4500"/>
+            <w:tcBorders>
+              <w:top w:val="single" w:color="999999" w:sz="1"/>
+              <w:left w:val="single" w:color="999999" w:sz="1"/>
+              <w:bottom w:val="single" w:color="999999" w:sz="1"/>
+              <w:right w:val="single" w:color="999999" w:sz="1"/>
+            </w:tcBorders>
+            <w:shd w:fill="FFFFFF" w:val="clear"/>
+            <w:tcMar>
+              <w:top w:type="dxa" w:w="80"/>
+              <w:left w:type="dxa" w:w="120"/>
+              <w:bottom w:type="dxa" w:w="80"/>
+              <w:right w:type="dxa" w:w="120"/>
+            </w:tcMar>
+          </w:tcPr>
+          <w:p>
+            <w:r>
+              <w:rPr>
+                <w:rFonts w:ascii="Calibri" w:cs="Calibri" w:eastAsia="Calibri" w:hAnsi="Calibri"/>
+                <w:b w:val="false"/>
+                <w:bCs w:val="false"/>
+                <w:sz w:val="20"/>
+                <w:szCs w:val="20"/>
+              </w:rPr>
+              <w:t xml:space="preserve"/>
+            </w:r>
+          </w:p>
+        </w:tc>
+        <w:tc>
+          <w:tcPr>
+            <w:tcW w:type="dxa" w:w="4500"/>
+            <w:tcBorders>
+              <w:top w:val="single" w:color="999999" w:sz="1"/>
+              <w:left w:val="single" w:color="999999" w:sz="1"/>
+              <w:bottom w:val="single" w:color="999999" w:sz="1"/>
+              <w:right w:val="single" w:color="999999" w:sz="1"/>
+            </w:tcBorders>
+            <w:shd w:fill="FFFFFF" w:val="clear"/>
+            <w:tcMar>
+              <w:top w:type="dxa" w:w="80"/>
+              <w:left w:type="dxa" w:w="120"/>
+              <w:bottom w:type="dxa" w:w="80"/>
+              <w:right w:type="dxa" w:w="120"/>
+            </w:tcMar>
+          </w:tcPr>
+          <w:p>
+            <w:r>
+              <w:rPr>
+                <w:rFonts w:ascii="Calibri" w:cs="Calibri" w:eastAsia="Calibri" w:hAnsi="Calibri"/>
+                <w:b w:val="false"/>
+                <w:bCs w:val="false"/>
+                <w:sz w:val="20"/>
+                <w:szCs w:val="20"/>
+              </w:rPr>
+              <w:t xml:space="preserve">workout_date</w:t>
+            </w:r>
+          </w:p>
+        </w:tc>
+      </w:tr>
+      <w:tr>
+        <w:tc>
+          <w:tcPr>
+            <w:tcW w:type="dxa" w:w="4500"/>
+            <w:tcBorders>
+              <w:top w:val="single" w:color="999999" w:sz="1"/>
+              <w:left w:val="single" w:color="999999" w:sz="1"/>
+              <w:bottom w:val="single" w:color="999999" w:sz="1"/>
+              <w:right w:val="single" w:color="999999" w:sz="1"/>
+            </w:tcBorders>
+            <w:shd w:fill="FFFFFF" w:val="clear"/>
+            <w:tcMar>
+              <w:top w:type="dxa" w:w="80"/>
+              <w:left w:type="dxa" w:w="120"/>
+              <w:bottom w:type="dxa" w:w="80"/>
+              <w:right w:type="dxa" w:w="120"/>
+            </w:tcMar>
+          </w:tcPr>
+          <w:p>
+            <w:r>
+              <w:rPr>
+                <w:rFonts w:ascii="Calibri" w:cs="Calibri" w:eastAsia="Calibri" w:hAnsi="Calibri"/>
+                <w:b w:val="false"/>
+                <w:bCs w:val="false"/>
+                <w:sz w:val="20"/>
+                <w:szCs w:val="20"/>
+              </w:rPr>
+              <w:t xml:space="preserve"/>
+            </w:r>
+          </w:p>
+        </w:tc>
+        <w:tc>
+          <w:tcPr>
+            <w:tcW w:type="dxa" w:w="4500"/>
+            <w:tcBorders>
+              <w:top w:val="single" w:color="999999" w:sz="1"/>
+              <w:left w:val="single" w:color="999999" w:sz="1"/>
+              <w:bottom w:val="single" w:color="999999" w:sz="1"/>
+              <w:right w:val="single" w:color="999999" w:sz="1"/>
+            </w:tcBorders>
+            <w:shd w:fill="FFFFFF" w:val="clear"/>
+            <w:tcMar>
+              <w:top w:type="dxa" w:w="80"/>
+              <w:left w:type="dxa" w:w="120"/>
+              <w:bottom w:type="dxa" w:w="80"/>
+              <w:right w:type="dxa" w:w="120"/>
+            </w:tcMar>
+          </w:tcPr>
+          <w:p>
+            <w:r>
+              <w:rPr>
+                <w:rFonts w:ascii="Calibri" w:cs="Calibri" w:eastAsia="Calibri" w:hAnsi="Calibri"/>
+                <w:b w:val="false"/>
+                <w:bCs w:val="false"/>
+                <w:sz w:val="20"/>
+                <w:szCs w:val="20"/>
+              </w:rPr>
+              <w:t xml:space="preserve">created_at</w:t>
+            </w:r>
+          </w:p>
+        </w:tc>
+      </w:tr>
+      <w:tr>
+        <w:tc>
+          <w:tcPr>
+            <w:tcW w:type="dxa" w:w="4500"/>
+            <w:tcBorders>
+              <w:top w:val="single" w:color="999999" w:sz="1"/>
+              <w:left w:val="single" w:color="999999" w:sz="1"/>
+              <w:bottom w:val="single" w:color="999999" w:sz="1"/>
+              <w:right w:val="single" w:color="999999" w:sz="1"/>
+            </w:tcBorders>
+            <w:shd w:fill="E8E8E8" w:val="clear"/>
+            <w:tcMar>
+              <w:top w:type="dxa" w:w="80"/>
+              <w:left w:type="dxa" w:w="120"/>
+              <w:bottom w:type="dxa" w:w="80"/>
+              <w:right w:type="dxa" w:w="120"/>
+            </w:tcMar>
+          </w:tcPr>
+          <w:p>
+            <w:r>
+              <w:rPr>
+                <w:rFonts w:ascii="Calibri" w:cs="Calibri" w:eastAsia="Calibri" w:hAnsi="Calibri"/>
+                <w:b/>
+                <w:bCs/>
+                <w:sz w:val="20"/>
+                <w:szCs w:val="20"/>
+              </w:rPr>
+              <w:t xml:space="preserve">1 user can have many workouts</w:t>
+            </w:r>
+          </w:p>
+        </w:tc>
+        <w:tc>
+          <w:tcPr>
+            <w:tcW w:type="dxa" w:w="4500"/>
+            <w:tcBorders>
+              <w:top w:val="single" w:color="999999" w:sz="1"/>
+              <w:left w:val="single" w:color="999999" w:sz="1"/>
+              <w:bottom w:val="single" w:color="999999" w:sz="1"/>
+              <w:right w:val="single" w:color="999999" w:sz="1"/>
+            </w:tcBorders>
+            <w:shd w:fill="E8E8E8" w:val="clear"/>
+            <w:tcMar>
+              <w:top w:type="dxa" w:w="80"/>
+              <w:left w:type="dxa" w:w="120"/>
+              <w:bottom w:type="dxa" w:w="80"/>
+              <w:right w:type="dxa" w:w="120"/>
+            </w:tcMar>
+          </w:tcPr>
+          <w:p>
+            <w:r>
+              <w:rPr>
+                <w:rFonts w:ascii="Calibri" w:cs="Calibri" w:eastAsia="Calibri" w:hAnsi="Calibri"/>
+                <w:b/>
+                <w:bCs/>
+                <w:sz w:val="20"/>
+                <w:szCs w:val="20"/>
+              </w:rPr>
+              <w:t xml:space="preserve">Each workout belongs to 1 user</w:t>
+            </w:r>
+          </w:p>
+        </w:tc>
+      </w:tr>
+    </w:tbl>
+    <w:p>
+      <w:pPr>
+        <w:spacing w:after="80"/>
+      </w:pPr>
+      <w:r>
+        <w:t xml:space="preserve"/>
       </w:r>
     </w:p>
     <w:p>
@@ -219,111 +1370,111 @@
           <w:sz w:val="22"/>
           <w:szCs w:val="22"/>
         </w:rPr>
-        <w:t xml:space="preserve">Home Page: The home page introduces FitTrack and changes depending on whether the user is logged in. Logged-out users see Register and Login buttons. Logged-in users see links to their Dashboard and a button to add a new workout.</w:t>
-      </w:r>
-    </w:p>
-    <w:p>
-      <w:pPr>
-        <w:spacing w:after="160"/>
-      </w:pPr>
-      <w:r>
-        <w:rPr>
-          <w:rFonts w:ascii="Calibri" w:cs="Calibri" w:eastAsia="Calibri" w:hAnsi="Calibri"/>
-          <w:sz w:val="22"/>
-          <w:szCs w:val="22"/>
-        </w:rPr>
-        <w:t xml:space="preserve">About Page: The about page describes what the application does and lists the technologies it is built with.</w:t>
-      </w:r>
-    </w:p>
-    <w:p>
-      <w:pPr>
-        <w:spacing w:after="160"/>
-      </w:pPr>
-      <w:r>
-        <w:rPr>
-          <w:rFonts w:ascii="Calibri" w:cs="Calibri" w:eastAsia="Calibri" w:hAnsi="Calibri"/>
-          <w:sz w:val="22"/>
-          <w:szCs w:val="22"/>
-        </w:rPr>
-        <w:t xml:space="preserve">Register: New users fill in a username, email and password. The password must be at least 8 characters and contain an uppercase letter, lowercase letter, number and special character. The server validates all fields and shows a clear error message if anything is wrong. If the username or email is already taken, the user is told immediately.</w:t>
-      </w:r>
-    </w:p>
-    <w:p>
-      <w:pPr>
-        <w:spacing w:after="160"/>
-      </w:pPr>
-      <w:r>
-        <w:rPr>
-          <w:rFonts w:ascii="Calibri" w:cs="Calibri" w:eastAsia="Calibri" w:hAnsi="Calibri"/>
-          <w:sz w:val="22"/>
-          <w:szCs w:val="22"/>
-        </w:rPr>
-        <w:t xml:space="preserve">Login: Users enter their username and password. The submitted password is compared against the stored bcrypt hash. If the credentials are incorrect, a friendly error message is shown without revealing which field was wrong. On success the user is redirected to their dashboard.</w:t>
-      </w:r>
-    </w:p>
-    <w:p>
-      <w:pPr>
-        <w:spacing w:after="160"/>
-      </w:pPr>
-      <w:r>
-        <w:rPr>
-          <w:rFonts w:ascii="Calibri" w:cs="Calibri" w:eastAsia="Calibri" w:hAnsi="Calibri"/>
-          <w:sz w:val="22"/>
-          <w:szCs w:val="22"/>
-        </w:rPr>
-        <w:t xml:space="preserve">Dashboard: The dashboard is the home screen for logged-in users. It shows three stat cards — total workouts logged, total minutes trained, and total time formatted as hours and minutes. Below the stats, a table shows the five most recent workouts with an edit button for each.</w:t>
-      </w:r>
-    </w:p>
-    <w:p>
-      <w:pPr>
-        <w:spacing w:after="160"/>
-      </w:pPr>
-      <w:r>
-        <w:rPr>
-          <w:rFonts w:ascii="Calibri" w:cs="Calibri" w:eastAsia="Calibri" w:hAnsi="Calibri"/>
-          <w:sz w:val="22"/>
-          <w:szCs w:val="22"/>
-        </w:rPr>
-        <w:t xml:space="preserve">My Workouts: The workouts page lists all of the logged-in user's entries in date order, most recent first. A search bar at the top allows filtering by exercise name or category. If a search returns no results, a message is shown. After adding, editing or deleting a workout, a green success message confirms the action.</w:t>
-      </w:r>
-    </w:p>
-    <w:p>
-      <w:pPr>
-        <w:spacing w:after="160"/>
-      </w:pPr>
-      <w:r>
-        <w:rPr>
-          <w:rFonts w:ascii="Calibri" w:cs="Calibri" w:eastAsia="Calibri" w:hAnsi="Calibri"/>
-          <w:sz w:val="22"/>
-          <w:szCs w:val="22"/>
-        </w:rPr>
-        <w:t xml:space="preserve">Add Workout: A form with fields for exercise name (required), category (dropdown — Strength, Cardio, Flexibility, Sport, Other), duration in minutes, date (required) and notes. If validation fails, the form stays on screen with the submitted values still filled in and an error message at the top.</w:t>
-      </w:r>
-    </w:p>
-    <w:p>
-      <w:pPr>
-        <w:spacing w:after="160"/>
-      </w:pPr>
-      <w:r>
-        <w:rPr>
-          <w:rFonts w:ascii="Calibri" w:cs="Calibri" w:eastAsia="Calibri" w:hAnsi="Calibri"/>
-          <w:sz w:val="22"/>
-          <w:szCs w:val="22"/>
-        </w:rPr>
-        <w:t xml:space="preserve">Edit Workout: The same form pre-filled with the existing workout data. The date field correctly converts the MySQL date format for the HTML date input. Users can only edit their own workouts — attempting to access another user's workout returns a 404.</w:t>
-      </w:r>
-    </w:p>
-    <w:p>
-      <w:pPr>
-        <w:spacing w:after="160"/>
-      </w:pPr>
-      <w:r>
-        <w:rPr>
-          <w:rFonts w:ascii="Calibri" w:cs="Calibri" w:eastAsia="Calibri" w:hAnsi="Calibri"/>
-          <w:sz w:val="22"/>
-          <w:szCs w:val="22"/>
-        </w:rPr>
-        <w:t xml:space="preserve">Delete Workout: A delete button on each workout card triggers a confirmation dialog before submitting. Deletion only proceeds if the workout belongs to the logged-in user.</w:t>
+        <w:t xml:space="preserve">Home Page: Introduces FitTrack. Logged-out users see Register and Login buttons. Logged-in users see links to their Dashboard and an Add Workout button.</w:t>
+      </w:r>
+    </w:p>
+    <w:p>
+      <w:pPr>
+        <w:spacing w:after="160"/>
+      </w:pPr>
+      <w:r>
+        <w:rPr>
+          <w:rFonts w:ascii="Calibri" w:cs="Calibri" w:eastAsia="Calibri" w:hAnsi="Calibri"/>
+          <w:sz w:val="22"/>
+          <w:szCs w:val="22"/>
+        </w:rPr>
+        <w:t xml:space="preserve">About Page: Describes the application and lists the technologies used.</w:t>
+      </w:r>
+    </w:p>
+    <w:p>
+      <w:pPr>
+        <w:spacing w:after="160"/>
+      </w:pPr>
+      <w:r>
+        <w:rPr>
+          <w:rFonts w:ascii="Calibri" w:cs="Calibri" w:eastAsia="Calibri" w:hAnsi="Calibri"/>
+          <w:sz w:val="22"/>
+          <w:szCs w:val="22"/>
+        </w:rPr>
+        <w:t xml:space="preserve">Register: Users fill in a username, email and password. The server validates all fields — the password must be at least 8 characters with an uppercase letter, lowercase letter, number and special character. Duplicate usernames or emails are rejected with a clear error message.</w:t>
+      </w:r>
+    </w:p>
+    <w:p>
+      <w:pPr>
+        <w:spacing w:after="160"/>
+      </w:pPr>
+      <w:r>
+        <w:rPr>
+          <w:rFonts w:ascii="Calibri" w:cs="Calibri" w:eastAsia="Calibri" w:hAnsi="Calibri"/>
+          <w:sz w:val="22"/>
+          <w:szCs w:val="22"/>
+        </w:rPr>
+        <w:t xml:space="preserve">Login: Users enter their username and password. The submitted password is compared against the stored bcrypt hash. Incorrect credentials show a friendly error message. On success the user is redirected to their dashboard.</w:t>
+      </w:r>
+    </w:p>
+    <w:p>
+      <w:pPr>
+        <w:spacing w:after="160"/>
+      </w:pPr>
+      <w:r>
+        <w:rPr>
+          <w:rFonts w:ascii="Calibri" w:cs="Calibri" w:eastAsia="Calibri" w:hAnsi="Calibri"/>
+          <w:sz w:val="22"/>
+          <w:szCs w:val="22"/>
+        </w:rPr>
+        <w:t xml:space="preserve">Dashboard: Shows three stat cards — total workouts logged, total minutes trained, and total time as hours and minutes. Below, a table shows the five most recent workouts.</w:t>
+      </w:r>
+    </w:p>
+    <w:p>
+      <w:pPr>
+        <w:spacing w:after="160"/>
+      </w:pPr>
+      <w:r>
+        <w:rPr>
+          <w:rFonts w:ascii="Calibri" w:cs="Calibri" w:eastAsia="Calibri" w:hAnsi="Calibri"/>
+          <w:sz w:val="22"/>
+          <w:szCs w:val="22"/>
+        </w:rPr>
+        <w:t xml:space="preserve">My Workouts: Lists all the logged-in user's entries in date order, most recent first. A search bar filters by exercise name or category. After adding, editing or deleting a workout, a green success message confirms the action.</w:t>
+      </w:r>
+    </w:p>
+    <w:p>
+      <w:pPr>
+        <w:spacing w:after="160"/>
+      </w:pPr>
+      <w:r>
+        <w:rPr>
+          <w:rFonts w:ascii="Calibri" w:cs="Calibri" w:eastAsia="Calibri" w:hAnsi="Calibri"/>
+          <w:sz w:val="22"/>
+          <w:szCs w:val="22"/>
+        </w:rPr>
+        <w:t xml:space="preserve">Add Workout: A form with fields for exercise name (required), category (dropdown), duration in minutes, date (required) and notes. If validation fails, the form stays on screen with submitted values still filled in.</w:t>
+      </w:r>
+    </w:p>
+    <w:p>
+      <w:pPr>
+        <w:spacing w:after="160"/>
+      </w:pPr>
+      <w:r>
+        <w:rPr>
+          <w:rFonts w:ascii="Calibri" w:cs="Calibri" w:eastAsia="Calibri" w:hAnsi="Calibri"/>
+          <w:sz w:val="22"/>
+          <w:szCs w:val="22"/>
+        </w:rPr>
+        <w:t xml:space="preserve">Edit Workout: The same form pre-filled with existing workout data. Users can only edit their own workouts.</w:t>
+      </w:r>
+    </w:p>
+    <w:p>
+      <w:pPr>
+        <w:spacing w:after="160"/>
+      </w:pPr>
+      <w:r>
+        <w:rPr>
+          <w:rFonts w:ascii="Calibri" w:cs="Calibri" w:eastAsia="Calibri" w:hAnsi="Calibri"/>
+          <w:sz w:val="22"/>
+          <w:szCs w:val="22"/>
+        </w:rPr>
+        <w:t xml:space="preserve">Delete Workout: A confirmation dialog appears before deleting. Only the workout owner can delete their entries.</w:t>
       </w:r>
     </w:p>
     <w:p>
@@ -349,7 +1500,7 @@
           <w:sz w:val="22"/>
           <w:szCs w:val="22"/>
         </w:rPr>
-        <w:t xml:space="preserve">404 Page: Any unknown URL shows a styled 404 page with a link back to the home page.</w:t>
+        <w:t xml:space="preserve">404 Page: Any unknown URL shows a styled 404 page with a link back home.</w:t>
       </w:r>
     </w:p>
     <w:p>
@@ -375,6 +1526,8 @@
       <w:r>
         <w:rPr>
           <w:rFonts w:ascii="Calibri" w:cs="Calibri" w:eastAsia="Calibri" w:hAnsi="Calibri"/>
+          <w:b/>
+          <w:bCs/>
           <w:sz w:val="22"/>
           <w:szCs w:val="22"/>
         </w:rPr>
@@ -391,7 +1544,7 @@
           <w:sz w:val="22"/>
           <w:szCs w:val="22"/>
         </w:rPr>
-        <w:t xml:space="preserve">Rather than storing passwords in plain text, bcrypt is used to generate a one-way hash. The salt rounds value of 10 makes the hash computationally expensive to reverse.</w:t>
+        <w:t xml:space="preserve">Passwords are stored as bcrypt hashes, not plain text. Salt rounds of 10 make the hash computationally expensive to reverse.</w:t>
       </w:r>
     </w:p>
     <w:p>
@@ -411,19 +1564,6 @@
     </w:p>
     <w:p>
       <w:pPr>
-        <w:spacing w:after="160"/>
-      </w:pPr>
-      <w:r>
-        <w:rPr>
-          <w:rFonts w:ascii="Calibri" w:cs="Calibri" w:eastAsia="Calibri" w:hAnsi="Calibri"/>
-          <w:sz w:val="22"/>
-          <w:szCs w:val="22"/>
-        </w:rPr>
-        <w:t xml:space="preserve">When the user logs in, bcrypt.compare checks the submitted password against the stored hash without ever decrypting it:</w:t>
-      </w:r>
-    </w:p>
-    <w:p>
-      <w:pPr>
         <w:shd w:fill="F2F2F2" w:val="clear"/>
         <w:spacing w:after="0"/>
         <w:ind w:left="720"/>
@@ -452,6 +1592,8 @@
       <w:r>
         <w:rPr>
           <w:rFonts w:ascii="Calibri" w:cs="Calibri" w:eastAsia="Calibri" w:hAnsi="Calibri"/>
+          <w:b/>
+          <w:bCs/>
           <w:sz w:val="22"/>
           <w:szCs w:val="22"/>
         </w:rPr>
@@ -468,7 +1610,7 @@
           <w:sz w:val="22"/>
           <w:szCs w:val="22"/>
         </w:rPr>
-        <w:t xml:space="preserve">Instead of passing the username to every render call individually, a middleware function adds it to res.locals once, making it available in all EJS views automatically:</w:t>
+        <w:t xml:space="preserve">A middleware function adds the username to res.locals once, making it available in all EJS views without passing it manually to every render call.</w:t>
       </w:r>
     </w:p>
     <w:p>
@@ -546,6 +1688,8 @@
       <w:r>
         <w:rPr>
           <w:rFonts w:ascii="Calibri" w:cs="Calibri" w:eastAsia="Calibri" w:hAnsi="Calibri"/>
+          <w:b/>
+          <w:bCs/>
           <w:sz w:val="22"/>
           <w:szCs w:val="22"/>
         </w:rPr>
@@ -562,7 +1706,7 @@
           <w:sz w:val="22"/>
           <w:szCs w:val="22"/>
         </w:rPr>
-        <w:t xml:space="preserve">Registration enforces a strong password policy using a regular expression that checks for all required character types in a single pass:</w:t>
+        <w:t xml:space="preserve">A regular expression checks for all required character types in a single pass during registration.</w:t>
       </w:r>
     </w:p>
     <w:p>
@@ -595,6 +1739,8 @@
       <w:r>
         <w:rPr>
           <w:rFonts w:ascii="Calibri" w:cs="Calibri" w:eastAsia="Calibri" w:hAnsi="Calibri"/>
+          <w:b/>
+          <w:bCs/>
           <w:sz w:val="22"/>
           <w:szCs w:val="22"/>
         </w:rPr>
@@ -611,7 +1757,7 @@
           <w:sz w:val="22"/>
           <w:szCs w:val="22"/>
         </w:rPr>
-        <w:t xml:space="preserve">All database queries use the mysql2 parameterised query syntax with ? placeholders. User input is never concatenated directly into SQL strings, preventing SQL injection attacks:</w:t>
+        <w:t xml:space="preserve">All database queries use ? placeholders so user input is never concatenated directly into SQL strings.</w:t>
       </w:r>
     </w:p>
     <w:p>
@@ -644,6 +1790,8 @@
       <w:r>
         <w:rPr>
           <w:rFonts w:ascii="Calibri" w:cs="Calibri" w:eastAsia="Calibri" w:hAnsi="Calibri"/>
+          <w:b/>
+          <w:bCs/>
           <w:sz w:val="22"/>
           <w:szCs w:val="22"/>
         </w:rPr>
@@ -660,7 +1808,7 @@
           <w:sz w:val="22"/>
           <w:szCs w:val="22"/>
         </w:rPr>
-        <w:t xml:space="preserve">When a user has no workouts, SUM(duration_mins) returns NULL rather than 0. COALESCE handles this edge case cleanly:</w:t>
+        <w:t xml:space="preserve">When a user has no workouts, SUM returns NULL. COALESCE defaults it to 0.</w:t>
       </w:r>
     </w:p>
     <w:p>
@@ -693,6 +1841,8 @@
       <w:r>
         <w:rPr>
           <w:rFonts w:ascii="Calibri" w:cs="Calibri" w:eastAsia="Calibri" w:hAnsi="Calibri"/>
+          <w:b/>
+          <w:bCs/>
           <w:sz w:val="22"/>
           <w:szCs w:val="22"/>
         </w:rPr>
@@ -709,7 +1859,7 @@
           <w:sz w:val="22"/>
           <w:szCs w:val="22"/>
         </w:rPr>
-        <w:t xml:space="preserve">Every edit, update and delete query includes AND user_id = ? alongside the workout id. This means even if someone manually types another user's workout URL, the query returns nothing and they cannot access or modify it.</w:t>
+        <w:t xml:space="preserve">Every edit, update and delete query includes AND user_id = ? so users cannot access or modify another user's data even by guessing the URL.</w:t>
       </w:r>
     </w:p>
     <w:p>

</xml_diff>

<commit_message>
update report with screenshots and academic language
</commit_message>
<xml_diff>
--- a/report.docx
+++ b/report.docx
@@ -28,33 +28,33 @@
           <w:sz w:val="22"/>
           <w:szCs w:val="22"/>
         </w:rPr>
-        <w:t xml:space="preserve">FitTrack is a personal workout logging web application built for the Dynamic Web Applications module. It allows users to create an account, log in securely, and track their personal fitness activities. Users can add, edit, delete and search their workout entries. Each entry stores the exercise name, category, duration in minutes, date and optional notes.</w:t>
-      </w:r>
-    </w:p>
-    <w:p>
-      <w:pPr>
-        <w:spacing w:after="160"/>
-      </w:pPr>
-      <w:r>
-        <w:rPr>
-          <w:rFonts w:ascii="Calibri" w:cs="Calibri" w:eastAsia="Calibri" w:hAnsi="Calibri"/>
-          <w:sz w:val="22"/>
-          <w:szCs w:val="22"/>
-        </w:rPr>
-        <w:t xml:space="preserve">A personal dashboard displays summary statistics including total workouts logged and total minutes trained, along with the five most recent entries. The application is designed so that each user can only view and manage their own data — no user can access another user's workouts.</w:t>
-      </w:r>
-    </w:p>
-    <w:p>
-      <w:pPr>
-        <w:spacing w:after="160"/>
-      </w:pPr>
-      <w:r>
-        <w:rPr>
-          <w:rFonts w:ascii="Calibri" w:cs="Calibri" w:eastAsia="Calibri" w:hAnsi="Calibri"/>
-          <w:sz w:val="22"/>
-          <w:szCs w:val="22"/>
-        </w:rPr>
-        <w:t xml:space="preserve">The app is built using Node.js and Express on the server side, EJS for server-side HTML templating, and MySQL for relational data storage. Passwords are hashed using bcrypt before being stored in the database, and login sessions are managed using express-session. The project follows an MVC folder structure with separate files for routes, controllers, views and middleware.</w:t>
+        <w:t xml:space="preserve">FitTrack is a personal workout logging web application developed for the Dynamic Web Applications module. The application enables authenticated users to record, manage and review their fitness activities through a secure, user-specific interface. Each workout entry captures the exercise name, category, duration in minutes, date and optional notes.</w:t>
+      </w:r>
+    </w:p>
+    <w:p>
+      <w:pPr>
+        <w:spacing w:after="160"/>
+      </w:pPr>
+      <w:r>
+        <w:rPr>
+          <w:rFonts w:ascii="Calibri" w:cs="Calibri" w:eastAsia="Calibri" w:hAnsi="Calibri"/>
+          <w:sz w:val="22"/>
+          <w:szCs w:val="22"/>
+        </w:rPr>
+        <w:t xml:space="preserve">Upon logging in, users are presented with a personal dashboard displaying aggregate statistics — total workouts logged, total minutes trained, and total training time expressed in hours and minutes — alongside a summary of their five most recent entries. The application enforces strict data isolation, ensuring that each user can only access and modify their own records.</w:t>
+      </w:r>
+    </w:p>
+    <w:p>
+      <w:pPr>
+        <w:spacing w:after="160"/>
+      </w:pPr>
+      <w:r>
+        <w:rPr>
+          <w:rFonts w:ascii="Calibri" w:cs="Calibri" w:eastAsia="Calibri" w:hAnsi="Calibri"/>
+          <w:sz w:val="22"/>
+          <w:szCs w:val="22"/>
+        </w:rPr>
+        <w:t xml:space="preserve">The system is implemented using Node.js and Express for server-side request handling, EJS for server-side HTML templating, and MySQL for persistent relational data storage. Authentication is implemented using bcrypt for password hashing and express-session for session management. The codebase follows an MVC architectural pattern with clearly separated routes, controllers, views and middleware.</w:t>
       </w:r>
     </w:p>
     <w:p>
@@ -83,46 +83,33 @@
           <w:sz w:val="22"/>
           <w:szCs w:val="22"/>
         </w:rPr>
-        <w:t xml:space="preserve">The application follows the MVC (Model-View-Controller) pattern across two tiers:</w:t>
-      </w:r>
-    </w:p>
-    <w:p>
-      <w:pPr>
-        <w:spacing w:after="160"/>
-      </w:pPr>
-      <w:r>
-        <w:rPr>
-          <w:rFonts w:ascii="Calibri" w:cs="Calibri" w:eastAsia="Calibri" w:hAnsi="Calibri"/>
-          <w:sz w:val="22"/>
-          <w:szCs w:val="22"/>
-        </w:rPr>
-        <w:t xml:space="preserve">Application Tier: Node.js with the Express framework handles all HTTP requests. Incoming requests pass through middleware (session handling, body parsing) before reaching the router. Routes direct each request to the appropriate controller, which queries the database and passes data to an EJS template to render the HTML response.</w:t>
-      </w:r>
-    </w:p>
-    <w:p>
-      <w:pPr>
-        <w:spacing w:after="160"/>
-      </w:pPr>
-      <w:r>
-        <w:rPr>
-          <w:rFonts w:ascii="Calibri" w:cs="Calibri" w:eastAsia="Calibri" w:hAnsi="Calibri"/>
-          <w:sz w:val="22"/>
-          <w:szCs w:val="22"/>
-        </w:rPr>
-        <w:t xml:space="preserve">Data Tier: A MySQL relational database stores all persistent data. The mysql2 package connects using a connection pool. Environment variables in a .env file keep credentials separate from the codebase.</w:t>
-      </w:r>
-    </w:p>
-    <w:p>
-      <w:pPr>
-        <w:spacing w:after="160"/>
-      </w:pPr>
-      <w:r>
-        <w:rPr>
-          <w:rFonts w:ascii="Calibri" w:cs="Calibri" w:eastAsia="Calibri" w:hAnsi="Calibri"/>
-          <w:sz w:val="22"/>
-          <w:szCs w:val="22"/>
-        </w:rPr>
-        <w:t xml:space="preserve">Supporting libraries: bcrypt (password hashing), express-session (login sessions), dotenv (environment config), method-override (DELETE support in HTML forms).</w:t>
+        <w:t xml:space="preserve">The application is structured across two tiers following the MVC (Model-View-Controller) pattern:</w:t>
+      </w:r>
+    </w:p>
+    <w:p>
+      <w:pPr>
+        <w:spacing w:after="160"/>
+      </w:pPr>
+      <w:r>
+        <w:rPr>
+          <w:rFonts w:ascii="Calibri" w:cs="Calibri" w:eastAsia="Calibri" w:hAnsi="Calibri"/>
+          <w:sz w:val="22"/>
+          <w:szCs w:val="22"/>
+        </w:rPr>
+        <w:t xml:space="preserve">Application Tier: The Node.js runtime with the Express framework processes all incoming HTTP requests. Requests pass through a middleware pipeline — including session management, body parsing and authentication guards — before being dispatched to the appropriate controller. Controllers encapsulate the business logic, interact with the database, and pass data to EJS templates which render the HTML responses returned to the client.</w:t>
+      </w:r>
+    </w:p>
+    <w:p>
+      <w:pPr>
+        <w:spacing w:after="160"/>
+      </w:pPr>
+      <w:r>
+        <w:rPr>
+          <w:rFonts w:ascii="Calibri" w:cs="Calibri" w:eastAsia="Calibri" w:hAnsi="Calibri"/>
+          <w:sz w:val="22"/>
+          <w:szCs w:val="22"/>
+        </w:rPr>
+        <w:t xml:space="preserve">Data Tier: A MySQL relational database provides persistent storage. The mysql2 package manages connectivity via a connection pool, enabling concurrent request handling. All database credentials are stored in environment variables and loaded via dotenv, keeping sensitive configuration separate from the codebase.</w:t>
       </w:r>
     </w:p>
     <w:p>
@@ -145,7 +132,7 @@
           <w:sz w:val="22"/>
           <w:szCs w:val="22"/>
         </w:rPr>
-        <w:t xml:space="preserve">Architecture Diagram:</w:t>
+        <w:t xml:space="preserve">Figure 1 — Application Architecture:</w:t>
       </w:r>
     </w:p>
     <w:tbl>
@@ -660,20 +647,20 @@
           <w:sz w:val="22"/>
           <w:szCs w:val="22"/>
         </w:rPr>
-        <w:t xml:space="preserve">The database contains two tables with a one-to-many relationship. Each user can have many workouts, but each workout belongs to exactly one user. The foreign key on workouts.user_id references users.id with ON DELETE CASCADE, so deleting a user removes all their workouts automatically.</w:t>
-      </w:r>
-    </w:p>
-    <w:p>
-      <w:pPr>
-        <w:spacing w:after="160"/>
-      </w:pPr>
-      <w:r>
-        <w:rPr>
-          <w:rFonts w:ascii="Calibri" w:cs="Calibri" w:eastAsia="Calibri" w:hAnsi="Calibri"/>
-          <w:sz w:val="22"/>
-          <w:szCs w:val="22"/>
-        </w:rPr>
-        <w:t xml:space="preserve">All queries filter by user_id to ensure users only ever see their own data.</w:t>
+        <w:t xml:space="preserve">The database schema comprises two tables linked by a one-to-many relationship. A single user may have many workout entries, but each workout record is associated with exactly one user.</w:t>
+      </w:r>
+    </w:p>
+    <w:p>
+      <w:pPr>
+        <w:spacing w:after="160"/>
+      </w:pPr>
+      <w:r>
+        <w:rPr>
+          <w:rFonts w:ascii="Calibri" w:cs="Calibri" w:eastAsia="Calibri" w:hAnsi="Calibri"/>
+          <w:sz w:val="22"/>
+          <w:szCs w:val="22"/>
+        </w:rPr>
+        <w:t xml:space="preserve">The users table stores account credentials and metadata. The workouts table holds each logged session, with a user_id foreign key referencing users.id. The ON DELETE CASCADE constraint ensures referential integrity — removing a user account automatically removes all associated workout records. All data retrieval queries include a WHERE user_id = ? clause to enforce per-user data isolation at the database level.</w:t>
       </w:r>
     </w:p>
     <w:p>
@@ -696,7 +683,7 @@
           <w:sz w:val="22"/>
           <w:szCs w:val="22"/>
         </w:rPr>
-        <w:t xml:space="preserve">Data Model Diagram:</w:t>
+        <w:t xml:space="preserve">Figure 2 — Data Model:</w:t>
       </w:r>
     </w:p>
     <w:tbl>
@@ -1300,7 +1287,7 @@
                 <w:sz w:val="20"/>
                 <w:szCs w:val="20"/>
               </w:rPr>
-              <w:t xml:space="preserve">1 user can have many workouts</w:t>
+              <w:t xml:space="preserve">1 user -&gt; many workouts (ON DELETE CASCADE)</w:t>
             </w:r>
           </w:p>
         </w:tc>
@@ -1370,137 +1357,553 @@
           <w:sz w:val="22"/>
           <w:szCs w:val="22"/>
         </w:rPr>
-        <w:t xml:space="preserve">Home Page: Introduces FitTrack. Logged-out users see Register and Login buttons. Logged-in users see links to their Dashboard and an Add Workout button.</w:t>
-      </w:r>
-    </w:p>
-    <w:p>
-      <w:pPr>
-        <w:spacing w:after="160"/>
-      </w:pPr>
-      <w:r>
-        <w:rPr>
-          <w:rFonts w:ascii="Calibri" w:cs="Calibri" w:eastAsia="Calibri" w:hAnsi="Calibri"/>
-          <w:sz w:val="22"/>
-          <w:szCs w:val="22"/>
-        </w:rPr>
-        <w:t xml:space="preserve">About Page: Describes the application and lists the technologies used.</w:t>
-      </w:r>
-    </w:p>
-    <w:p>
-      <w:pPr>
-        <w:spacing w:after="160"/>
-      </w:pPr>
-      <w:r>
-        <w:rPr>
-          <w:rFonts w:ascii="Calibri" w:cs="Calibri" w:eastAsia="Calibri" w:hAnsi="Calibri"/>
-          <w:sz w:val="22"/>
-          <w:szCs w:val="22"/>
-        </w:rPr>
-        <w:t xml:space="preserve">Register: Users fill in a username, email and password. The server validates all fields — the password must be at least 8 characters with an uppercase letter, lowercase letter, number and special character. Duplicate usernames or emails are rejected with a clear error message.</w:t>
-      </w:r>
-    </w:p>
-    <w:p>
-      <w:pPr>
-        <w:spacing w:after="160"/>
-      </w:pPr>
-      <w:r>
-        <w:rPr>
-          <w:rFonts w:ascii="Calibri" w:cs="Calibri" w:eastAsia="Calibri" w:hAnsi="Calibri"/>
-          <w:sz w:val="22"/>
-          <w:szCs w:val="22"/>
-        </w:rPr>
-        <w:t xml:space="preserve">Login: Users enter their username and password. The submitted password is compared against the stored bcrypt hash. Incorrect credentials show a friendly error message. On success the user is redirected to their dashboard.</w:t>
-      </w:r>
-    </w:p>
-    <w:p>
-      <w:pPr>
-        <w:spacing w:after="160"/>
-      </w:pPr>
-      <w:r>
-        <w:rPr>
-          <w:rFonts w:ascii="Calibri" w:cs="Calibri" w:eastAsia="Calibri" w:hAnsi="Calibri"/>
-          <w:sz w:val="22"/>
-          <w:szCs w:val="22"/>
-        </w:rPr>
-        <w:t xml:space="preserve">Dashboard: Shows three stat cards — total workouts logged, total minutes trained, and total time as hours and minutes. Below, a table shows the five most recent workouts.</w:t>
-      </w:r>
-    </w:p>
-    <w:p>
-      <w:pPr>
-        <w:spacing w:after="160"/>
-      </w:pPr>
-      <w:r>
-        <w:rPr>
-          <w:rFonts w:ascii="Calibri" w:cs="Calibri" w:eastAsia="Calibri" w:hAnsi="Calibri"/>
-          <w:sz w:val="22"/>
-          <w:szCs w:val="22"/>
-        </w:rPr>
-        <w:t xml:space="preserve">My Workouts: Lists all the logged-in user's entries in date order, most recent first. A search bar filters by exercise name or category. After adding, editing or deleting a workout, a green success message confirms the action.</w:t>
-      </w:r>
-    </w:p>
-    <w:p>
-      <w:pPr>
-        <w:spacing w:after="160"/>
-      </w:pPr>
-      <w:r>
-        <w:rPr>
-          <w:rFonts w:ascii="Calibri" w:cs="Calibri" w:eastAsia="Calibri" w:hAnsi="Calibri"/>
-          <w:sz w:val="22"/>
-          <w:szCs w:val="22"/>
-        </w:rPr>
-        <w:t xml:space="preserve">Add Workout: A form with fields for exercise name (required), category (dropdown), duration in minutes, date (required) and notes. If validation fails, the form stays on screen with submitted values still filled in.</w:t>
-      </w:r>
-    </w:p>
-    <w:p>
-      <w:pPr>
-        <w:spacing w:after="160"/>
-      </w:pPr>
-      <w:r>
-        <w:rPr>
-          <w:rFonts w:ascii="Calibri" w:cs="Calibri" w:eastAsia="Calibri" w:hAnsi="Calibri"/>
-          <w:sz w:val="22"/>
-          <w:szCs w:val="22"/>
-        </w:rPr>
-        <w:t xml:space="preserve">Edit Workout: The same form pre-filled with existing workout data. Users can only edit their own workouts.</w:t>
-      </w:r>
-    </w:p>
-    <w:p>
-      <w:pPr>
-        <w:spacing w:after="160"/>
-      </w:pPr>
-      <w:r>
-        <w:rPr>
-          <w:rFonts w:ascii="Calibri" w:cs="Calibri" w:eastAsia="Calibri" w:hAnsi="Calibri"/>
-          <w:sz w:val="22"/>
-          <w:szCs w:val="22"/>
-        </w:rPr>
-        <w:t xml:space="preserve">Delete Workout: A confirmation dialog appears before deleting. Only the workout owner can delete their entries.</w:t>
-      </w:r>
-    </w:p>
-    <w:p>
-      <w:pPr>
-        <w:spacing w:after="160"/>
-      </w:pPr>
-      <w:r>
-        <w:rPr>
-          <w:rFonts w:ascii="Calibri" w:cs="Calibri" w:eastAsia="Calibri" w:hAnsi="Calibri"/>
-          <w:sz w:val="22"/>
-          <w:szCs w:val="22"/>
-        </w:rPr>
-        <w:t xml:space="preserve">Logout: Destroys the session and redirects to the home page.</w:t>
-      </w:r>
-    </w:p>
-    <w:p>
-      <w:pPr>
-        <w:spacing w:after="160"/>
-      </w:pPr>
-      <w:r>
-        <w:rPr>
-          <w:rFonts w:ascii="Calibri" w:cs="Calibri" w:eastAsia="Calibri" w:hAnsi="Calibri"/>
-          <w:sz w:val="22"/>
-          <w:szCs w:val="22"/>
-        </w:rPr>
-        <w:t xml:space="preserve">404 Page: Any unknown URL shows a styled 404 page with a link back home.</w:t>
+        <w:t xml:space="preserve">The application provides the following user-facing features:</w:t>
+      </w:r>
+    </w:p>
+    <w:p>
+      <w:pPr>
+        <w:spacing w:after="160"/>
+      </w:pPr>
+      <w:r>
+        <w:rPr>
+          <w:rFonts w:ascii="Calibri" w:cs="Calibri" w:eastAsia="Calibri" w:hAnsi="Calibri"/>
+          <w:b/>
+          <w:bCs/>
+          <w:sz w:val="22"/>
+          <w:szCs w:val="22"/>
+        </w:rPr>
+        <w:t xml:space="preserve">Home Page</w:t>
+      </w:r>
+    </w:p>
+    <w:p>
+      <w:pPr>
+        <w:spacing w:after="160"/>
+      </w:pPr>
+      <w:r>
+        <w:rPr>
+          <w:rFonts w:ascii="Calibri" w:cs="Calibri" w:eastAsia="Calibri" w:hAnsi="Calibri"/>
+          <w:sz w:val="22"/>
+          <w:szCs w:val="22"/>
+        </w:rPr>
+        <w:t xml:space="preserve">The home page serves as the public entry point to the application. It presents the FitTrack brand, a brief description of the service, and context-sensitive navigation — unauthenticated users are shown Register and Login options, while authenticated users are directed to their dashboard.</w:t>
+      </w:r>
+    </w:p>
+    <w:p>
+      <w:pPr>
+        <w:spacing w:after="80"/>
+        <w:jc w:val="center"/>
+      </w:pPr>
+      <w:r>
+        <w:drawing>
+          <wp:inline distT="0" distB="0" distL="0" distR="0">
+            <wp:extent cx="5238750" cy="3619500"/>
+            <wp:effectExtent t="0" r="0" b="0" l="0"/>
+            <wp:docPr id="1" name="Home page" descr="Home page" title="Home page"/>
+            <wp:cNvGraphicFramePr>
+              <a:graphicFrameLocks xmlns:a="http://schemas.openxmlformats.org/drawingml/2006/main" noChangeAspect="1"/>
+            </wp:cNvGraphicFramePr>
+            <a:graphic xmlns:a="http://schemas.openxmlformats.org/drawingml/2006/main">
+              <a:graphicData uri="http://schemas.openxmlformats.org/drawingml/2006/picture">
+                <pic:pic xmlns:pic="http://schemas.openxmlformats.org/drawingml/2006/picture">
+                  <pic:nvPicPr>
+                    <pic:cNvPr id="0" name="" descr=""/>
+                    <pic:cNvPicPr>
+                      <a:picLocks noChangeAspect="1" noChangeArrowheads="1"/>
+                    </pic:cNvPicPr>
+                  </pic:nvPicPr>
+                  <pic:blipFill>
+                    <a:blip r:embed="rId7" cstate="none"/>
+                    <a:srcRect/>
+                    <a:stretch>
+                      <a:fillRect/>
+                    </a:stretch>
+                  </pic:blipFill>
+                  <pic:spPr bwMode="auto">
+                    <a:xfrm>
+                      <a:off x="0" y="0"/>
+                      <a:ext cx="5238750" cy="3619500"/>
+                    </a:xfrm>
+                    <a:prstGeom prst="rect">
+                      <a:avLst/>
+                    </a:prstGeom>
+                  </pic:spPr>
+                </pic:pic>
+              </a:graphicData>
+            </a:graphic>
+          </wp:inline>
+        </w:drawing>
+      </w:r>
+    </w:p>
+    <w:p>
+      <w:pPr>
+        <w:spacing w:after="200"/>
+        <w:jc w:val="center"/>
+      </w:pPr>
+      <w:r>
+        <w:rPr>
+          <w:rFonts w:ascii="Calibri" w:cs="Calibri" w:eastAsia="Calibri" w:hAnsi="Calibri"/>
+          <w:i/>
+          <w:iCs/>
+          <w:color w:val="666666"/>
+          <w:sz w:val="18"/>
+          <w:szCs w:val="18"/>
+        </w:rPr>
+        <w:t xml:space="preserve">Figure 3 — Home page</w:t>
+      </w:r>
+    </w:p>
+    <w:p>
+      <w:pPr>
+        <w:spacing w:after="160"/>
+      </w:pPr>
+      <w:r>
+        <w:rPr>
+          <w:rFonts w:ascii="Calibri" w:cs="Calibri" w:eastAsia="Calibri" w:hAnsi="Calibri"/>
+          <w:b/>
+          <w:bCs/>
+          <w:sz w:val="22"/>
+          <w:szCs w:val="22"/>
+        </w:rPr>
+        <w:t xml:space="preserve">About Page</w:t>
+      </w:r>
+    </w:p>
+    <w:p>
+      <w:pPr>
+        <w:spacing w:after="160"/>
+      </w:pPr>
+      <w:r>
+        <w:rPr>
+          <w:rFonts w:ascii="Calibri" w:cs="Calibri" w:eastAsia="Calibri" w:hAnsi="Calibri"/>
+          <w:sz w:val="22"/>
+          <w:szCs w:val="22"/>
+        </w:rPr>
+        <w:t xml:space="preserve">The about page provides an overview of the application's purpose and lists the technologies used in its development.</w:t>
+      </w:r>
+    </w:p>
+    <w:p>
+      <w:pPr>
+        <w:spacing w:after="80"/>
+        <w:jc w:val="center"/>
+      </w:pPr>
+      <w:r>
+        <w:drawing>
+          <wp:inline distT="0" distB="0" distL="0" distR="0">
+            <wp:extent cx="5238750" cy="3619500"/>
+            <wp:effectExtent t="0" r="0" b="0" l="0"/>
+            <wp:docPr id="1" name="About page" descr="About page" title="About page"/>
+            <wp:cNvGraphicFramePr>
+              <a:graphicFrameLocks xmlns:a="http://schemas.openxmlformats.org/drawingml/2006/main" noChangeAspect="1"/>
+            </wp:cNvGraphicFramePr>
+            <a:graphic xmlns:a="http://schemas.openxmlformats.org/drawingml/2006/main">
+              <a:graphicData uri="http://schemas.openxmlformats.org/drawingml/2006/picture">
+                <pic:pic xmlns:pic="http://schemas.openxmlformats.org/drawingml/2006/picture">
+                  <pic:nvPicPr>
+                    <pic:cNvPr id="0" name="" descr=""/>
+                    <pic:cNvPicPr>
+                      <a:picLocks noChangeAspect="1" noChangeArrowheads="1"/>
+                    </pic:cNvPicPr>
+                  </pic:nvPicPr>
+                  <pic:blipFill>
+                    <a:blip r:embed="rId8" cstate="none"/>
+                    <a:srcRect/>
+                    <a:stretch>
+                      <a:fillRect/>
+                    </a:stretch>
+                  </pic:blipFill>
+                  <pic:spPr bwMode="auto">
+                    <a:xfrm>
+                      <a:off x="0" y="0"/>
+                      <a:ext cx="5238750" cy="3619500"/>
+                    </a:xfrm>
+                    <a:prstGeom prst="rect">
+                      <a:avLst/>
+                    </a:prstGeom>
+                  </pic:spPr>
+                </pic:pic>
+              </a:graphicData>
+            </a:graphic>
+          </wp:inline>
+        </w:drawing>
+      </w:r>
+    </w:p>
+    <w:p>
+      <w:pPr>
+        <w:spacing w:after="200"/>
+        <w:jc w:val="center"/>
+      </w:pPr>
+      <w:r>
+        <w:rPr>
+          <w:rFonts w:ascii="Calibri" w:cs="Calibri" w:eastAsia="Calibri" w:hAnsi="Calibri"/>
+          <w:i/>
+          <w:iCs/>
+          <w:color w:val="666666"/>
+          <w:sz w:val="18"/>
+          <w:szCs w:val="18"/>
+        </w:rPr>
+        <w:t xml:space="preserve">Figure 4 — About page</w:t>
+      </w:r>
+    </w:p>
+    <w:p>
+      <w:pPr>
+        <w:spacing w:after="160"/>
+      </w:pPr>
+      <w:r>
+        <w:rPr>
+          <w:rFonts w:ascii="Calibri" w:cs="Calibri" w:eastAsia="Calibri" w:hAnsi="Calibri"/>
+          <w:b/>
+          <w:bCs/>
+          <w:sz w:val="22"/>
+          <w:szCs w:val="22"/>
+        </w:rPr>
+        <w:t xml:space="preserve">Login</w:t>
+      </w:r>
+    </w:p>
+    <w:p>
+      <w:pPr>
+        <w:spacing w:after="160"/>
+      </w:pPr>
+      <w:r>
+        <w:rPr>
+          <w:rFonts w:ascii="Calibri" w:cs="Calibri" w:eastAsia="Calibri" w:hAnsi="Calibri"/>
+          <w:sz w:val="22"/>
+          <w:szCs w:val="22"/>
+        </w:rPr>
+        <w:t xml:space="preserve">The login form accepts a username and password. Submitted credentials are validated server-side by comparing the password against the stored bcrypt hash. Invalid credentials produce a generic error message that does not reveal which field was incorrect, mitigating enumeration attacks.</w:t>
+      </w:r>
+    </w:p>
+    <w:p>
+      <w:pPr>
+        <w:spacing w:after="80"/>
+        <w:jc w:val="center"/>
+      </w:pPr>
+      <w:r>
+        <w:drawing>
+          <wp:inline distT="0" distB="0" distL="0" distR="0">
+            <wp:extent cx="5238750" cy="3143250"/>
+            <wp:effectExtent t="0" r="0" b="0" l="0"/>
+            <wp:docPr id="1" name="Login page" descr="Login page" title="Login page"/>
+            <wp:cNvGraphicFramePr>
+              <a:graphicFrameLocks xmlns:a="http://schemas.openxmlformats.org/drawingml/2006/main" noChangeAspect="1"/>
+            </wp:cNvGraphicFramePr>
+            <a:graphic xmlns:a="http://schemas.openxmlformats.org/drawingml/2006/main">
+              <a:graphicData uri="http://schemas.openxmlformats.org/drawingml/2006/picture">
+                <pic:pic xmlns:pic="http://schemas.openxmlformats.org/drawingml/2006/picture">
+                  <pic:nvPicPr>
+                    <pic:cNvPr id="0" name="" descr=""/>
+                    <pic:cNvPicPr>
+                      <a:picLocks noChangeAspect="1" noChangeArrowheads="1"/>
+                    </pic:cNvPicPr>
+                  </pic:nvPicPr>
+                  <pic:blipFill>
+                    <a:blip r:embed="rId9" cstate="none"/>
+                    <a:srcRect/>
+                    <a:stretch>
+                      <a:fillRect/>
+                    </a:stretch>
+                  </pic:blipFill>
+                  <pic:spPr bwMode="auto">
+                    <a:xfrm>
+                      <a:off x="0" y="0"/>
+                      <a:ext cx="5238750" cy="3143250"/>
+                    </a:xfrm>
+                    <a:prstGeom prst="rect">
+                      <a:avLst/>
+                    </a:prstGeom>
+                  </pic:spPr>
+                </pic:pic>
+              </a:graphicData>
+            </a:graphic>
+          </wp:inline>
+        </w:drawing>
+      </w:r>
+    </w:p>
+    <w:p>
+      <w:pPr>
+        <w:spacing w:after="200"/>
+        <w:jc w:val="center"/>
+      </w:pPr>
+      <w:r>
+        <w:rPr>
+          <w:rFonts w:ascii="Calibri" w:cs="Calibri" w:eastAsia="Calibri" w:hAnsi="Calibri"/>
+          <w:i/>
+          <w:iCs/>
+          <w:color w:val="666666"/>
+          <w:sz w:val="18"/>
+          <w:szCs w:val="18"/>
+        </w:rPr>
+        <w:t xml:space="preserve">Figure 5 — Login page</w:t>
+      </w:r>
+    </w:p>
+    <w:p>
+      <w:pPr>
+        <w:spacing w:after="160"/>
+      </w:pPr>
+      <w:r>
+        <w:rPr>
+          <w:rFonts w:ascii="Calibri" w:cs="Calibri" w:eastAsia="Calibri" w:hAnsi="Calibri"/>
+          <w:b/>
+          <w:bCs/>
+          <w:sz w:val="22"/>
+          <w:szCs w:val="22"/>
+        </w:rPr>
+        <w:t xml:space="preserve">Dashboard</w:t>
+      </w:r>
+    </w:p>
+    <w:p>
+      <w:pPr>
+        <w:spacing w:after="160"/>
+      </w:pPr>
+      <w:r>
+        <w:rPr>
+          <w:rFonts w:ascii="Calibri" w:cs="Calibri" w:eastAsia="Calibri" w:hAnsi="Calibri"/>
+          <w:sz w:val="22"/>
+          <w:szCs w:val="22"/>
+        </w:rPr>
+        <w:t xml:space="preserve">The dashboard is the primary authenticated landing page. It displays three summary statistics — total workouts, total minutes trained, and total time formatted as hours and minutes — computed via SQL aggregate functions. The five most recent workout entries are listed below.</w:t>
+      </w:r>
+    </w:p>
+    <w:p>
+      <w:pPr>
+        <w:spacing w:after="80"/>
+        <w:jc w:val="center"/>
+      </w:pPr>
+      <w:r>
+        <w:drawing>
+          <wp:inline distT="0" distB="0" distL="0" distR="0">
+            <wp:extent cx="5238750" cy="3619500"/>
+            <wp:effectExtent t="0" r="0" b="0" l="0"/>
+            <wp:docPr id="1" name="Dashboard" descr="Dashboard" title="Dashboard"/>
+            <wp:cNvGraphicFramePr>
+              <a:graphicFrameLocks xmlns:a="http://schemas.openxmlformats.org/drawingml/2006/main" noChangeAspect="1"/>
+            </wp:cNvGraphicFramePr>
+            <a:graphic xmlns:a="http://schemas.openxmlformats.org/drawingml/2006/main">
+              <a:graphicData uri="http://schemas.openxmlformats.org/drawingml/2006/picture">
+                <pic:pic xmlns:pic="http://schemas.openxmlformats.org/drawingml/2006/picture">
+                  <pic:nvPicPr>
+                    <pic:cNvPr id="0" name="" descr=""/>
+                    <pic:cNvPicPr>
+                      <a:picLocks noChangeAspect="1" noChangeArrowheads="1"/>
+                    </pic:cNvPicPr>
+                  </pic:nvPicPr>
+                  <pic:blipFill>
+                    <a:blip r:embed="rId10" cstate="none"/>
+                    <a:srcRect/>
+                    <a:stretch>
+                      <a:fillRect/>
+                    </a:stretch>
+                  </pic:blipFill>
+                  <pic:spPr bwMode="auto">
+                    <a:xfrm>
+                      <a:off x="0" y="0"/>
+                      <a:ext cx="5238750" cy="3619500"/>
+                    </a:xfrm>
+                    <a:prstGeom prst="rect">
+                      <a:avLst/>
+                    </a:prstGeom>
+                  </pic:spPr>
+                </pic:pic>
+              </a:graphicData>
+            </a:graphic>
+          </wp:inline>
+        </w:drawing>
+      </w:r>
+    </w:p>
+    <w:p>
+      <w:pPr>
+        <w:spacing w:after="200"/>
+        <w:jc w:val="center"/>
+      </w:pPr>
+      <w:r>
+        <w:rPr>
+          <w:rFonts w:ascii="Calibri" w:cs="Calibri" w:eastAsia="Calibri" w:hAnsi="Calibri"/>
+          <w:i/>
+          <w:iCs/>
+          <w:color w:val="666666"/>
+          <w:sz w:val="18"/>
+          <w:szCs w:val="18"/>
+        </w:rPr>
+        <w:t xml:space="preserve">Figure 6 — Dashboard with statistics</w:t>
+      </w:r>
+    </w:p>
+    <w:p>
+      <w:pPr>
+        <w:spacing w:after="160"/>
+      </w:pPr>
+      <w:r>
+        <w:rPr>
+          <w:rFonts w:ascii="Calibri" w:cs="Calibri" w:eastAsia="Calibri" w:hAnsi="Calibri"/>
+          <w:b/>
+          <w:bCs/>
+          <w:sz w:val="22"/>
+          <w:szCs w:val="22"/>
+        </w:rPr>
+        <w:t xml:space="preserve">Add Workout</w:t>
+      </w:r>
+    </w:p>
+    <w:p>
+      <w:pPr>
+        <w:spacing w:after="160"/>
+      </w:pPr>
+      <w:r>
+        <w:rPr>
+          <w:rFonts w:ascii="Calibri" w:cs="Calibri" w:eastAsia="Calibri" w:hAnsi="Calibri"/>
+          <w:sz w:val="22"/>
+          <w:szCs w:val="22"/>
+        </w:rPr>
+        <w:t xml:space="preserve">The add workout form collects exercise name, category (selected from a dropdown), duration in minutes, date and optional notes. Server-side validation rejects incomplete submissions and returns the form with submitted values preserved and a descriptive error message displayed.</w:t>
+      </w:r>
+    </w:p>
+    <w:p>
+      <w:pPr>
+        <w:spacing w:after="80"/>
+        <w:jc w:val="center"/>
+      </w:pPr>
+      <w:r>
+        <w:drawing>
+          <wp:inline distT="0" distB="0" distL="0" distR="0">
+            <wp:extent cx="5238750" cy="4095750"/>
+            <wp:effectExtent t="0" r="0" b="0" l="0"/>
+            <wp:docPr id="1" name="Add workout form" descr="Add workout form" title="Add workout form"/>
+            <wp:cNvGraphicFramePr>
+              <a:graphicFrameLocks xmlns:a="http://schemas.openxmlformats.org/drawingml/2006/main" noChangeAspect="1"/>
+            </wp:cNvGraphicFramePr>
+            <a:graphic xmlns:a="http://schemas.openxmlformats.org/drawingml/2006/main">
+              <a:graphicData uri="http://schemas.openxmlformats.org/drawingml/2006/picture">
+                <pic:pic xmlns:pic="http://schemas.openxmlformats.org/drawingml/2006/picture">
+                  <pic:nvPicPr>
+                    <pic:cNvPr id="0" name="" descr=""/>
+                    <pic:cNvPicPr>
+                      <a:picLocks noChangeAspect="1" noChangeArrowheads="1"/>
+                    </pic:cNvPicPr>
+                  </pic:nvPicPr>
+                  <pic:blipFill>
+                    <a:blip r:embed="rId11" cstate="none"/>
+                    <a:srcRect/>
+                    <a:stretch>
+                      <a:fillRect/>
+                    </a:stretch>
+                  </pic:blipFill>
+                  <pic:spPr bwMode="auto">
+                    <a:xfrm>
+                      <a:off x="0" y="0"/>
+                      <a:ext cx="5238750" cy="4095750"/>
+                    </a:xfrm>
+                    <a:prstGeom prst="rect">
+                      <a:avLst/>
+                    </a:prstGeom>
+                  </pic:spPr>
+                </pic:pic>
+              </a:graphicData>
+            </a:graphic>
+          </wp:inline>
+        </w:drawing>
+      </w:r>
+    </w:p>
+    <w:p>
+      <w:pPr>
+        <w:spacing w:after="200"/>
+        <w:jc w:val="center"/>
+      </w:pPr>
+      <w:r>
+        <w:rPr>
+          <w:rFonts w:ascii="Calibri" w:cs="Calibri" w:eastAsia="Calibri" w:hAnsi="Calibri"/>
+          <w:i/>
+          <w:iCs/>
+          <w:color w:val="666666"/>
+          <w:sz w:val="18"/>
+          <w:szCs w:val="18"/>
+        </w:rPr>
+        <w:t xml:space="preserve">Figure 7 — Add workout form</w:t>
+      </w:r>
+    </w:p>
+    <w:p>
+      <w:pPr>
+        <w:spacing w:after="160"/>
+      </w:pPr>
+      <w:r>
+        <w:rPr>
+          <w:rFonts w:ascii="Calibri" w:cs="Calibri" w:eastAsia="Calibri" w:hAnsi="Calibri"/>
+          <w:b/>
+          <w:bCs/>
+          <w:sz w:val="22"/>
+          <w:szCs w:val="22"/>
+        </w:rPr>
+        <w:t xml:space="preserve">My Workouts</w:t>
+      </w:r>
+    </w:p>
+    <w:p>
+      <w:pPr>
+        <w:spacing w:after="160"/>
+      </w:pPr>
+      <w:r>
+        <w:rPr>
+          <w:rFonts w:ascii="Calibri" w:cs="Calibri" w:eastAsia="Calibri" w:hAnsi="Calibri"/>
+          <w:sz w:val="22"/>
+          <w:szCs w:val="22"/>
+        </w:rPr>
+        <w:t xml:space="preserve">The workouts page lists all entries for the authenticated user in descending date order. A search bar enables filtering by exercise name or category against the database. CRUD operations — edit and delete — are available on each entry. Successful operations redirect with a query parameter that triggers a green confirmation message.</w:t>
+      </w:r>
+    </w:p>
+    <w:p>
+      <w:pPr>
+        <w:spacing w:after="80"/>
+        <w:jc w:val="center"/>
+      </w:pPr>
+      <w:r>
+        <w:drawing>
+          <wp:inline distT="0" distB="0" distL="0" distR="0">
+            <wp:extent cx="5238750" cy="3619500"/>
+            <wp:effectExtent t="0" r="0" b="0" l="0"/>
+            <wp:docPr id="1" name="My workouts page" descr="My workouts page" title="My workouts page"/>
+            <wp:cNvGraphicFramePr>
+              <a:graphicFrameLocks xmlns:a="http://schemas.openxmlformats.org/drawingml/2006/main" noChangeAspect="1"/>
+            </wp:cNvGraphicFramePr>
+            <a:graphic xmlns:a="http://schemas.openxmlformats.org/drawingml/2006/main">
+              <a:graphicData uri="http://schemas.openxmlformats.org/drawingml/2006/picture">
+                <pic:pic xmlns:pic="http://schemas.openxmlformats.org/drawingml/2006/picture">
+                  <pic:nvPicPr>
+                    <pic:cNvPr id="0" name="" descr=""/>
+                    <pic:cNvPicPr>
+                      <a:picLocks noChangeAspect="1" noChangeArrowheads="1"/>
+                    </pic:cNvPicPr>
+                  </pic:nvPicPr>
+                  <pic:blipFill>
+                    <a:blip r:embed="rId12" cstate="none"/>
+                    <a:srcRect/>
+                    <a:stretch>
+                      <a:fillRect/>
+                    </a:stretch>
+                  </pic:blipFill>
+                  <pic:spPr bwMode="auto">
+                    <a:xfrm>
+                      <a:off x="0" y="0"/>
+                      <a:ext cx="5238750" cy="3619500"/>
+                    </a:xfrm>
+                    <a:prstGeom prst="rect">
+                      <a:avLst/>
+                    </a:prstGeom>
+                  </pic:spPr>
+                </pic:pic>
+              </a:graphicData>
+            </a:graphic>
+          </wp:inline>
+        </w:drawing>
+      </w:r>
+    </w:p>
+    <w:p>
+      <w:pPr>
+        <w:spacing w:after="200"/>
+        <w:jc w:val="center"/>
+      </w:pPr>
+      <w:r>
+        <w:rPr>
+          <w:rFonts w:ascii="Calibri" w:cs="Calibri" w:eastAsia="Calibri" w:hAnsi="Calibri"/>
+          <w:i/>
+          <w:iCs/>
+          <w:color w:val="666666"/>
+          <w:sz w:val="18"/>
+          <w:szCs w:val="18"/>
+        </w:rPr>
+        <w:t xml:space="preserve">Figure 8 — My Workouts page with search and success message</w:t>
       </w:r>
     </w:p>
     <w:p>
@@ -1544,7 +1947,7 @@
           <w:sz w:val="22"/>
           <w:szCs w:val="22"/>
         </w:rPr>
-        <w:t xml:space="preserve">Passwords are stored as bcrypt hashes, not plain text. Salt rounds of 10 make the hash computationally expensive to reverse.</w:t>
+        <w:t xml:space="preserve">Rather than storing passwords in plain text, bcrypt generates a computationally expensive one-way hash using a salt round factor of 10. This means that even if the database were compromised, recovering the original passwords would be infeasible. During authentication, bcrypt.compare re-hashes the submitted password and compares it against the stored hash without any decryption.</w:t>
       </w:r>
     </w:p>
     <w:p>
@@ -1610,7 +2013,7 @@
           <w:sz w:val="22"/>
           <w:szCs w:val="22"/>
         </w:rPr>
-        <w:t xml:space="preserve">A middleware function adds the username to res.locals once, making it available in all EJS views without passing it manually to every render call.</w:t>
+        <w:t xml:space="preserve">Rather than explicitly passing the authenticated username to every individual render call, a middleware function assigns it to res.locals once per request. EJS templates throughout the application can then reference it directly, reducing code repetition and the risk of omission errors.</w:t>
       </w:r>
     </w:p>
     <w:p>
@@ -1693,20 +2096,20 @@
           <w:sz w:val="22"/>
           <w:szCs w:val="22"/>
         </w:rPr>
-        <w:t xml:space="preserve">3. Password Strength Validation with Regex (controllers/authController.js)</w:t>
-      </w:r>
-    </w:p>
-    <w:p>
-      <w:pPr>
-        <w:spacing w:after="160"/>
-      </w:pPr>
-      <w:r>
-        <w:rPr>
-          <w:rFonts w:ascii="Calibri" w:cs="Calibri" w:eastAsia="Calibri" w:hAnsi="Calibri"/>
-          <w:sz w:val="22"/>
-          <w:szCs w:val="22"/>
-        </w:rPr>
-        <w:t xml:space="preserve">A regular expression checks for all required character types in a single pass during registration.</w:t>
+        <w:t xml:space="preserve">3. Password Strength Validation with Regular Expression (controllers/authController.js)</w:t>
+      </w:r>
+    </w:p>
+    <w:p>
+      <w:pPr>
+        <w:spacing w:after="160"/>
+      </w:pPr>
+      <w:r>
+        <w:rPr>
+          <w:rFonts w:ascii="Calibri" w:cs="Calibri" w:eastAsia="Calibri" w:hAnsi="Calibri"/>
+          <w:sz w:val="22"/>
+          <w:szCs w:val="22"/>
+        </w:rPr>
+        <w:t xml:space="preserve">Registration enforces a strong password policy validated using a single regular expression with lookaheads. The pattern requires a minimum of eight characters including at least one lowercase letter, one uppercase letter, one digit and one special character — all checked in a single pass without multiple conditional checks.</w:t>
       </w:r>
     </w:p>
     <w:p>
@@ -1744,20 +2147,20 @@
           <w:sz w:val="22"/>
           <w:szCs w:val="22"/>
         </w:rPr>
-        <w:t xml:space="preserve">4. Parameterised Queries for SQL Injection Prevention (all controllers)</w:t>
-      </w:r>
-    </w:p>
-    <w:p>
-      <w:pPr>
-        <w:spacing w:after="160"/>
-      </w:pPr>
-      <w:r>
-        <w:rPr>
-          <w:rFonts w:ascii="Calibri" w:cs="Calibri" w:eastAsia="Calibri" w:hAnsi="Calibri"/>
-          <w:sz w:val="22"/>
-          <w:szCs w:val="22"/>
-        </w:rPr>
-        <w:t xml:space="preserve">All database queries use ? placeholders so user input is never concatenated directly into SQL strings.</w:t>
+        <w:t xml:space="preserve">4. Parameterised Queries — SQL Injection Prevention (all controllers)</w:t>
+      </w:r>
+    </w:p>
+    <w:p>
+      <w:pPr>
+        <w:spacing w:after="160"/>
+      </w:pPr>
+      <w:r>
+        <w:rPr>
+          <w:rFonts w:ascii="Calibri" w:cs="Calibri" w:eastAsia="Calibri" w:hAnsi="Calibri"/>
+          <w:sz w:val="22"/>
+          <w:szCs w:val="22"/>
+        </w:rPr>
+        <w:t xml:space="preserve">All database interactions use the mysql2 parameterised query syntax with ? placeholders. User-supplied input is never interpolated directly into SQL strings, eliminating the risk of SQL injection attacks regardless of the input content.</w:t>
       </w:r>
     </w:p>
     <w:p>
@@ -1795,20 +2198,20 @@
           <w:sz w:val="22"/>
           <w:szCs w:val="22"/>
         </w:rPr>
-        <w:t xml:space="preserve">5. COALESCE for Null-Safe Aggregation (controllers/dashboardController.js)</w:t>
-      </w:r>
-    </w:p>
-    <w:p>
-      <w:pPr>
-        <w:spacing w:after="160"/>
-      </w:pPr>
-      <w:r>
-        <w:rPr>
-          <w:rFonts w:ascii="Calibri" w:cs="Calibri" w:eastAsia="Calibri" w:hAnsi="Calibri"/>
-          <w:sz w:val="22"/>
-          <w:szCs w:val="22"/>
-        </w:rPr>
-        <w:t xml:space="preserve">When a user has no workouts, SUM returns NULL. COALESCE defaults it to 0.</w:t>
+        <w:t xml:space="preserve">5. COALESCE for Null-Safe SQL Aggregation (controllers/dashboardController.js)</w:t>
+      </w:r>
+    </w:p>
+    <w:p>
+      <w:pPr>
+        <w:spacing w:after="160"/>
+      </w:pPr>
+      <w:r>
+        <w:rPr>
+          <w:rFonts w:ascii="Calibri" w:cs="Calibri" w:eastAsia="Calibri" w:hAnsi="Calibri"/>
+          <w:sz w:val="22"/>
+          <w:szCs w:val="22"/>
+        </w:rPr>
+        <w:t xml:space="preserve">The SUM aggregate function returns NULL rather than zero when applied to an empty result set. COALESCE is used to substitute a default value of 0, preventing null propagation errors in the view layer when a user has not yet logged any workouts.</w:t>
       </w:r>
     </w:p>
     <w:p>
@@ -1846,20 +2249,20 @@
           <w:sz w:val="22"/>
           <w:szCs w:val="22"/>
         </w:rPr>
-        <w:t xml:space="preserve">6. Ownership Checks on All Write Operations (controllers/workoutController.js)</w:t>
-      </w:r>
-    </w:p>
-    <w:p>
-      <w:pPr>
-        <w:spacing w:after="160"/>
-      </w:pPr>
-      <w:r>
-        <w:rPr>
-          <w:rFonts w:ascii="Calibri" w:cs="Calibri" w:eastAsia="Calibri" w:hAnsi="Calibri"/>
-          <w:sz w:val="22"/>
-          <w:szCs w:val="22"/>
-        </w:rPr>
-        <w:t xml:space="preserve">Every edit, update and delete query includes AND user_id = ? so users cannot access or modify another user's data even by guessing the URL.</w:t>
+        <w:t xml:space="preserve">6. Ownership Enforcement on All Write Operations (controllers/workoutController.js)</w:t>
+      </w:r>
+    </w:p>
+    <w:p>
+      <w:pPr>
+        <w:spacing w:after="160"/>
+      </w:pPr>
+      <w:r>
+        <w:rPr>
+          <w:rFonts w:ascii="Calibri" w:cs="Calibri" w:eastAsia="Calibri" w:hAnsi="Calibri"/>
+          <w:sz w:val="22"/>
+          <w:szCs w:val="22"/>
+        </w:rPr>
+        <w:t xml:space="preserve">Every mutation query — update and delete — includes an AND user_id = ? predicate alongside the record identifier. This ensures that even if a user manually constructs a URL referencing another user's workout ID, the query will match zero rows and the operation will silently fail, preventing unauthorised data modification.</w:t>
       </w:r>
     </w:p>
     <w:p>
@@ -1903,7 +2306,7 @@
           <w:sz w:val="22"/>
           <w:szCs w:val="22"/>
         </w:rPr>
-        <w:t xml:space="preserve">I used Claude (an AI assistant by Anthropic) to support the development of this project. AI was used to help structure the initial project folder layout, suggest code for certain Express and MySQL patterns I was unfamiliar with, and review the code for issues. I reviewed all AI-generated code before including it, made modifications where needed, and ensured I understood every part of the codebase. All written sections of this report are my own work. The use of AI is comparable to using documentation or online resources as a reference tool during development.</w:t>
+        <w:t xml:space="preserve">I used Claude, an AI assistant developed by Anthropic, to support the development of this project. The AI was used to assist with structuring the initial project folder layout, suggesting implementation patterns for Express routing and MySQL integration, and reviewing code for potential issues. All AI-generated code was reviewed, tested and where necessary modified before being incorporated into the project. The written content of this report reflects my own understanding of the system I built. My use of AI tooling is consistent with the use of documentation, tutorials and online reference materials as learning and development aids.</w:t>
       </w:r>
     </w:p>
     <w:sectPr>

</xml_diff>

<commit_message>
update report - Harvard style, academic language, references
</commit_message>
<xml_diff>
--- a/report.docx
+++ b/report.docx
@@ -4,135 +4,282 @@
   <w:body>
     <w:p>
       <w:pPr>
-        <w:pStyle w:val="Heading1"/>
-        <w:spacing w:after="200" w:before="400"/>
-      </w:pPr>
-      <w:r>
-        <w:rPr>
-          <w:rFonts w:ascii="Calibri" w:cs="Calibri" w:eastAsia="Calibri" w:hAnsi="Calibri"/>
+        <w:spacing w:after="100"/>
+      </w:pPr>
+      <w:r>
+        <w:t xml:space="preserve"/>
+      </w:r>
+    </w:p>
+    <w:p>
+      <w:pPr>
+        <w:spacing w:after="100"/>
+      </w:pPr>
+      <w:r>
+        <w:t xml:space="preserve"/>
+      </w:r>
+    </w:p>
+    <w:p>
+      <w:pPr>
+        <w:spacing w:after="100"/>
+      </w:pPr>
+      <w:r>
+        <w:t xml:space="preserve"/>
+      </w:r>
+    </w:p>
+    <w:p>
+      <w:pPr>
+        <w:spacing w:after="100"/>
+      </w:pPr>
+      <w:r>
+        <w:t xml:space="preserve"/>
+      </w:r>
+    </w:p>
+    <w:p>
+      <w:pPr>
+        <w:spacing w:after="200"/>
+        <w:jc w:val="center"/>
+      </w:pPr>
+      <w:r>
+        <w:rPr>
+          <w:rFonts w:ascii="Times New Roman" w:cs="Times New Roman" w:eastAsia="Times New Roman" w:hAnsi="Times New Roman"/>
           <w:b/>
           <w:bCs/>
-          <w:sz w:val="32"/>
-          <w:szCs w:val="32"/>
-        </w:rPr>
-        <w:t xml:space="preserve">Outline</w:t>
-      </w:r>
-    </w:p>
-    <w:p>
-      <w:pPr>
-        <w:spacing w:after="160"/>
-      </w:pPr>
-      <w:r>
-        <w:rPr>
-          <w:rFonts w:ascii="Calibri" w:cs="Calibri" w:eastAsia="Calibri" w:hAnsi="Calibri"/>
-          <w:sz w:val="22"/>
-          <w:szCs w:val="22"/>
-        </w:rPr>
-        <w:t xml:space="preserve">FitTrack is a personal workout logging web application developed for the Dynamic Web Applications module. The application enables authenticated users to record, manage and review their fitness activities through a secure, user-specific interface. Each workout entry captures the exercise name, category, duration in minutes, date and optional notes.</w:t>
-      </w:r>
-    </w:p>
-    <w:p>
-      <w:pPr>
-        <w:spacing w:after="160"/>
-      </w:pPr>
-      <w:r>
-        <w:rPr>
-          <w:rFonts w:ascii="Calibri" w:cs="Calibri" w:eastAsia="Calibri" w:hAnsi="Calibri"/>
-          <w:sz w:val="22"/>
-          <w:szCs w:val="22"/>
-        </w:rPr>
-        <w:t xml:space="preserve">Upon logging in, users are presented with a personal dashboard displaying aggregate statistics — total workouts logged, total minutes trained, and total training time expressed in hours and minutes — alongside a summary of their five most recent entries. The application enforces strict data isolation, ensuring that each user can only access and modify their own records.</w:t>
-      </w:r>
-    </w:p>
-    <w:p>
-      <w:pPr>
-        <w:spacing w:after="160"/>
-      </w:pPr>
-      <w:r>
-        <w:rPr>
-          <w:rFonts w:ascii="Calibri" w:cs="Calibri" w:eastAsia="Calibri" w:hAnsi="Calibri"/>
-          <w:sz w:val="22"/>
-          <w:szCs w:val="22"/>
-        </w:rPr>
-        <w:t xml:space="preserve">The system is implemented using Node.js and Express for server-side request handling, EJS for server-side HTML templating, and MySQL for persistent relational data storage. Authentication is implemented using bcrypt for password hashing and express-session for session management. The codebase follows an MVC architectural pattern with clearly separated routes, controllers, views and middleware.</w:t>
+          <w:sz w:val="52"/>
+          <w:szCs w:val="52"/>
+        </w:rPr>
+        <w:t xml:space="preserve">FitTrack</w:t>
+      </w:r>
+    </w:p>
+    <w:p>
+      <w:pPr>
+        <w:spacing w:after="600"/>
+        <w:jc w:val="center"/>
+      </w:pPr>
+      <w:r>
+        <w:rPr>
+          <w:rFonts w:ascii="Times New Roman" w:cs="Times New Roman" w:eastAsia="Times New Roman" w:hAnsi="Times New Roman"/>
+          <w:i/>
+          <w:iCs/>
+          <w:sz w:val="28"/>
+          <w:szCs w:val="28"/>
+        </w:rPr>
+        <w:t xml:space="preserve">A Personal Workout Logging Web Application</w:t>
+      </w:r>
+    </w:p>
+    <w:p>
+      <w:pPr>
+        <w:spacing w:after="120"/>
+        <w:jc w:val="center"/>
+      </w:pPr>
+      <w:r>
+        <w:rPr>
+          <w:rFonts w:ascii="Times New Roman" w:cs="Times New Roman" w:eastAsia="Times New Roman" w:hAnsi="Times New Roman"/>
+          <w:sz w:val="24"/>
+          <w:szCs w:val="24"/>
+        </w:rPr>
+        <w:t xml:space="preserve">Dynamic Web Applications</w:t>
+      </w:r>
+    </w:p>
+    <w:p>
+      <w:pPr>
+        <w:spacing w:after="120"/>
+        <w:jc w:val="center"/>
+      </w:pPr>
+      <w:r>
+        <w:rPr>
+          <w:rFonts w:ascii="Times New Roman" w:cs="Times New Roman" w:eastAsia="Times New Roman" w:hAnsi="Times New Roman"/>
+          <w:sz w:val="24"/>
+          <w:szCs w:val="24"/>
+        </w:rPr>
+        <w:t xml:space="preserve">BSc Computer Science</w:t>
+      </w:r>
+    </w:p>
+    <w:p>
+      <w:pPr>
+        <w:spacing w:after="600"/>
+        <w:jc w:val="center"/>
+      </w:pPr>
+      <w:r>
+        <w:rPr>
+          <w:rFonts w:ascii="Times New Roman" w:cs="Times New Roman" w:eastAsia="Times New Roman" w:hAnsi="Times New Roman"/>
+          <w:sz w:val="24"/>
+          <w:szCs w:val="24"/>
+        </w:rPr>
+        <w:t xml:space="preserve">Goldsmiths, University of London</w:t>
+      </w:r>
+    </w:p>
+    <w:p>
+      <w:pPr>
+        <w:spacing w:after="120"/>
+        <w:jc w:val="center"/>
+      </w:pPr>
+      <w:r>
+        <w:rPr>
+          <w:rFonts w:ascii="Times New Roman" w:cs="Times New Roman" w:eastAsia="Times New Roman" w:hAnsi="Times New Roman"/>
+          <w:sz w:val="24"/>
+          <w:szCs w:val="24"/>
+        </w:rPr>
+        <w:t xml:space="preserve">Student ID: 33823095</w:t>
+      </w:r>
+    </w:p>
+    <w:p>
+      <w:pPr>
+        <w:spacing w:after="120"/>
+        <w:jc w:val="center"/>
+      </w:pPr>
+      <w:r>
+        <w:rPr>
+          <w:rFonts w:ascii="Times New Roman" w:cs="Times New Roman" w:eastAsia="Times New Roman" w:hAnsi="Times New Roman"/>
+          <w:sz w:val="24"/>
+          <w:szCs w:val="24"/>
+        </w:rPr>
+        <w:t xml:space="preserve">June 2026</w:t>
+      </w:r>
+    </w:p>
+    <w:p>
+      <w:r>
+        <w:br w:type="page"/>
       </w:r>
     </w:p>
     <w:p>
       <w:pPr>
         <w:pStyle w:val="Heading1"/>
-        <w:spacing w:after="200" w:before="400"/>
-      </w:pPr>
-      <w:r>
-        <w:rPr>
-          <w:rFonts w:ascii="Calibri" w:cs="Calibri" w:eastAsia="Calibri" w:hAnsi="Calibri"/>
+        <w:spacing w:after="240" w:before="480"/>
+      </w:pPr>
+      <w:r>
+        <w:rPr>
+          <w:rFonts w:ascii="Times New Roman" w:cs="Times New Roman" w:eastAsia="Times New Roman" w:hAnsi="Times New Roman"/>
           <w:b/>
           <w:bCs/>
-          <w:sz w:val="32"/>
-          <w:szCs w:val="32"/>
-        </w:rPr>
-        <w:t xml:space="preserve">Architecture</w:t>
-      </w:r>
-    </w:p>
-    <w:p>
-      <w:pPr>
-        <w:spacing w:after="160"/>
-      </w:pPr>
-      <w:r>
-        <w:rPr>
-          <w:rFonts w:ascii="Calibri" w:cs="Calibri" w:eastAsia="Calibri" w:hAnsi="Calibri"/>
-          <w:sz w:val="22"/>
-          <w:szCs w:val="22"/>
-        </w:rPr>
-        <w:t xml:space="preserve">The application is structured across two tiers following the MVC (Model-View-Controller) pattern:</w:t>
-      </w:r>
-    </w:p>
-    <w:p>
-      <w:pPr>
-        <w:spacing w:after="160"/>
-      </w:pPr>
-      <w:r>
-        <w:rPr>
-          <w:rFonts w:ascii="Calibri" w:cs="Calibri" w:eastAsia="Calibri" w:hAnsi="Calibri"/>
-          <w:sz w:val="22"/>
-          <w:szCs w:val="22"/>
-        </w:rPr>
-        <w:t xml:space="preserve">Application Tier: The Node.js runtime with the Express framework processes all incoming HTTP requests. Requests pass through a middleware pipeline — including session management, body parsing and authentication guards — before being dispatched to the appropriate controller. Controllers encapsulate the business logic, interact with the database, and pass data to EJS templates which render the HTML responses returned to the client.</w:t>
-      </w:r>
-    </w:p>
-    <w:p>
-      <w:pPr>
-        <w:spacing w:after="160"/>
-      </w:pPr>
-      <w:r>
-        <w:rPr>
-          <w:rFonts w:ascii="Calibri" w:cs="Calibri" w:eastAsia="Calibri" w:hAnsi="Calibri"/>
-          <w:sz w:val="22"/>
-          <w:szCs w:val="22"/>
-        </w:rPr>
-        <w:t xml:space="preserve">Data Tier: A MySQL relational database provides persistent storage. The mysql2 package manages connectivity via a connection pool, enabling concurrent request handling. All database credentials are stored in environment variables and loaded via dotenv, keeping sensitive configuration separate from the codebase.</w:t>
-      </w:r>
-    </w:p>
-    <w:p>
-      <w:pPr>
-        <w:spacing w:after="80"/>
-      </w:pPr>
-      <w:r>
-        <w:t xml:space="preserve"/>
-      </w:r>
-    </w:p>
-    <w:p>
-      <w:pPr>
-        <w:spacing w:after="160"/>
-      </w:pPr>
-      <w:r>
-        <w:rPr>
-          <w:rFonts w:ascii="Calibri" w:cs="Calibri" w:eastAsia="Calibri" w:hAnsi="Calibri"/>
+          <w:sz w:val="28"/>
+          <w:szCs w:val="28"/>
+        </w:rPr>
+        <w:t xml:space="preserve">Outline</w:t>
+      </w:r>
+    </w:p>
+    <w:p>
+      <w:pPr>
+        <w:spacing w:after="200"/>
+        <w:ind w:firstLine="720"/>
+      </w:pPr>
+      <w:r>
+        <w:rPr>
+          <w:rFonts w:ascii="Times New Roman" w:cs="Times New Roman" w:eastAsia="Times New Roman" w:hAnsi="Times New Roman"/>
+          <w:sz w:val="24"/>
+          <w:szCs w:val="24"/>
+        </w:rPr>
+        <w:t xml:space="preserve">FitTrack is a personal workout logging web application developed as part of the Dynamic Web Applications module. The application provides authenticated users with the ability to record, manage and review their fitness activities through a secure, user-specific interface. Each workout entry captures the exercise name, category, duration in minutes, date and optional session notes.</w:t>
+      </w:r>
+    </w:p>
+    <w:p>
+      <w:pPr>
+        <w:spacing w:after="200"/>
+        <w:ind w:firstLine="720"/>
+      </w:pPr>
+      <w:r>
+        <w:rPr>
+          <w:rFonts w:ascii="Times New Roman" w:cs="Times New Roman" w:eastAsia="Times New Roman" w:hAnsi="Times New Roman"/>
+          <w:sz w:val="24"/>
+          <w:szCs w:val="24"/>
+        </w:rPr>
+        <w:t xml:space="preserve">Upon authentication, users are presented with a personal dashboard displaying aggregate statistics — total workouts logged, total minutes trained and total training time expressed in hours and minutes — accompanied by a summary of the five most recent entries. The system enforces strict data isolation, ensuring that each user can only access and modify records belonging to their own account.</w:t>
+      </w:r>
+    </w:p>
+    <w:p>
+      <w:pPr>
+        <w:spacing w:after="200"/>
+        <w:ind w:firstLine="720"/>
+      </w:pPr>
+      <w:r>
+        <w:rPr>
+          <w:rFonts w:ascii="Times New Roman" w:cs="Times New Roman" w:eastAsia="Times New Roman" w:hAnsi="Times New Roman"/>
+          <w:sz w:val="24"/>
+          <w:szCs w:val="24"/>
+        </w:rPr>
+        <w:t xml:space="preserve">The application is implemented using Node.js (OpenJS Foundation, 2024) and Express (OpenJS Foundation, 2024) for server-side request handling, EJS for server-side HTML templating, and MySQL for persistent relational data storage. Authentication is implemented using bcrypt (Provos and Mazieres, 1999) for password hashing and express-session for session management. The codebase adheres to the Model-View-Controller (MVC) architectural pattern, with clearly separated routes, controllers, views and middleware components.</w:t>
+      </w:r>
+    </w:p>
+    <w:p>
+      <w:pPr>
+        <w:pStyle w:val="Heading1"/>
+        <w:spacing w:after="240" w:before="480"/>
+      </w:pPr>
+      <w:r>
+        <w:rPr>
+          <w:rFonts w:ascii="Times New Roman" w:cs="Times New Roman" w:eastAsia="Times New Roman" w:hAnsi="Times New Roman"/>
           <w:b/>
           <w:bCs/>
-          <w:sz w:val="22"/>
-          <w:szCs w:val="22"/>
-        </w:rPr>
-        <w:t xml:space="preserve">Figure 1 — Application Architecture:</w:t>
+          <w:sz w:val="28"/>
+          <w:szCs w:val="28"/>
+        </w:rPr>
+        <w:t xml:space="preserve">Architecture</w:t>
+      </w:r>
+    </w:p>
+    <w:p>
+      <w:pPr>
+        <w:spacing w:after="200"/>
+        <w:ind w:firstLine="720"/>
+      </w:pPr>
+      <w:r>
+        <w:rPr>
+          <w:rFonts w:ascii="Times New Roman" w:cs="Times New Roman" w:eastAsia="Times New Roman" w:hAnsi="Times New Roman"/>
+          <w:sz w:val="24"/>
+          <w:szCs w:val="24"/>
+        </w:rPr>
+        <w:t xml:space="preserve">The application is structured across two tiers following the MVC (Model-View-Controller) pattern, a widely adopted design approach that separates presentation, business logic and data management concerns (Gamma et al., 1994).</w:t>
+      </w:r>
+    </w:p>
+    <w:p>
+      <w:pPr>
+        <w:spacing w:after="200"/>
+        <w:ind w:firstLine="720"/>
+      </w:pPr>
+      <w:r>
+        <w:rPr>
+          <w:rFonts w:ascii="Times New Roman" w:cs="Times New Roman" w:eastAsia="Times New Roman" w:hAnsi="Times New Roman"/>
+          <w:sz w:val="24"/>
+          <w:szCs w:val="24"/>
+        </w:rPr>
+        <w:t xml:space="preserve">Application Tier: The Node.js runtime, in conjunction with the Express framework, processes all incoming HTTP requests. Requests traverse a middleware pipeline — encompassing session management, body parsing and route-level authentication guards — before being dispatched to the appropriate controller function. Controllers encapsulate the application business logic, interact with the database layer and supply data to EJS templates, which render the HTML responses returned to the client browser.</w:t>
+      </w:r>
+    </w:p>
+    <w:p>
+      <w:pPr>
+        <w:spacing w:after="200"/>
+        <w:ind w:firstLine="720"/>
+      </w:pPr>
+      <w:r>
+        <w:rPr>
+          <w:rFonts w:ascii="Times New Roman" w:cs="Times New Roman" w:eastAsia="Times New Roman" w:hAnsi="Times New Roman"/>
+          <w:sz w:val="24"/>
+          <w:szCs w:val="24"/>
+        </w:rPr>
+        <w:t xml:space="preserve">Data Tier: A MySQL relational database provides persistent storage for all user and workout data. The mysql2 package manages database connectivity via a connection pool, enabling efficient handling of concurrent requests. All database credentials are externalised into environment variables and loaded at runtime via the dotenv package, maintaining a strict separation between configuration and application code.</w:t>
+      </w:r>
+    </w:p>
+    <w:p>
+      <w:pPr>
+        <w:spacing w:after="100"/>
+      </w:pPr>
+      <w:r>
+        <w:t xml:space="preserve"/>
+      </w:r>
+    </w:p>
+    <w:p>
+      <w:pPr>
+        <w:spacing w:after="120"/>
+        <w:jc w:val="center"/>
+      </w:pPr>
+      <w:r>
+        <w:rPr>
+          <w:rFonts w:ascii="Times New Roman" w:cs="Times New Roman" w:eastAsia="Times New Roman" w:hAnsi="Times New Roman"/>
+          <w:i/>
+          <w:iCs/>
+          <w:color w:val="555555"/>
+          <w:sz w:val="20"/>
+          <w:szCs w:val="20"/>
+        </w:rPr>
+        <w:t xml:space="preserve">Figure 1 — Application Architecture Diagram</w:t>
       </w:r>
     </w:p>
     <w:tbl>
@@ -179,7 +326,7 @@
                 <w:sz w:val="20"/>
                 <w:szCs w:val="20"/>
               </w:rPr>
-              <w:t xml:space="preserve">Browser</w:t>
+              <w:t xml:space="preserve">Browser (Client)</w:t>
             </w:r>
           </w:p>
         </w:tc>
@@ -192,7 +339,7 @@
               <w:bottom w:val="single" w:color="999999" w:sz="1"/>
               <w:right w:val="single" w:color="999999" w:sz="1"/>
             </w:tcBorders>
-            <w:shd w:fill="FFFFFF" w:val="clear"/>
+            <w:shd w:fill="D5E8F0" w:val="clear"/>
             <w:tcMar>
               <w:top w:type="dxa" w:w="80"/>
               <w:left w:type="dxa" w:w="120"/>
@@ -222,7 +369,7 @@
               <w:bottom w:val="single" w:color="999999" w:sz="1"/>
               <w:right w:val="single" w:color="999999" w:sz="1"/>
             </w:tcBorders>
-            <w:shd w:fill="FFFFFF" w:val="clear"/>
+            <w:shd w:fill="D5E8F0" w:val="clear"/>
             <w:tcMar>
               <w:top w:type="dxa" w:w="80"/>
               <w:left w:type="dxa" w:w="120"/>
@@ -423,7 +570,7 @@
                 <w:sz w:val="20"/>
                 <w:szCs w:val="20"/>
               </w:rPr>
-              <w:t xml:space="preserve">EJS Views</w:t>
+              <w:t xml:space="preserve">EJS Templates</w:t>
             </w:r>
           </w:p>
         </w:tc>
@@ -455,7 +602,7 @@
                 <w:sz w:val="20"/>
                 <w:szCs w:val="20"/>
               </w:rPr>
-              <w:t xml:space="preserve">mysql2 connection pool</w:t>
+              <w:t xml:space="preserve">mysql2 Connection Pool</w:t>
             </w:r>
           </w:p>
         </w:tc>
@@ -615,7 +762,7 @@
     </w:tbl>
     <w:p>
       <w:pPr>
-        <w:spacing w:after="80"/>
+        <w:spacing w:after="100"/>
       </w:pPr>
       <w:r>
         <w:t xml:space="preserve"/>
@@ -624,48 +771,50 @@
     <w:p>
       <w:pPr>
         <w:pStyle w:val="Heading1"/>
-        <w:spacing w:after="200" w:before="400"/>
-      </w:pPr>
-      <w:r>
-        <w:rPr>
-          <w:rFonts w:ascii="Calibri" w:cs="Calibri" w:eastAsia="Calibri" w:hAnsi="Calibri"/>
+        <w:spacing w:after="240" w:before="480"/>
+      </w:pPr>
+      <w:r>
+        <w:rPr>
+          <w:rFonts w:ascii="Times New Roman" w:cs="Times New Roman" w:eastAsia="Times New Roman" w:hAnsi="Times New Roman"/>
           <w:b/>
           <w:bCs/>
-          <w:sz w:val="32"/>
-          <w:szCs w:val="32"/>
+          <w:sz w:val="28"/>
+          <w:szCs w:val="28"/>
         </w:rPr>
         <w:t xml:space="preserve">Data Model</w:t>
       </w:r>
     </w:p>
     <w:p>
       <w:pPr>
-        <w:spacing w:after="160"/>
-      </w:pPr>
-      <w:r>
-        <w:rPr>
-          <w:rFonts w:ascii="Calibri" w:cs="Calibri" w:eastAsia="Calibri" w:hAnsi="Calibri"/>
-          <w:sz w:val="22"/>
-          <w:szCs w:val="22"/>
-        </w:rPr>
-        <w:t xml:space="preserve">The database schema comprises two tables linked by a one-to-many relationship. A single user may have many workout entries, but each workout record is associated with exactly one user.</w:t>
-      </w:r>
-    </w:p>
-    <w:p>
-      <w:pPr>
-        <w:spacing w:after="160"/>
-      </w:pPr>
-      <w:r>
-        <w:rPr>
-          <w:rFonts w:ascii="Calibri" w:cs="Calibri" w:eastAsia="Calibri" w:hAnsi="Calibri"/>
-          <w:sz w:val="22"/>
-          <w:szCs w:val="22"/>
-        </w:rPr>
-        <w:t xml:space="preserve">The users table stores account credentials and metadata. The workouts table holds each logged session, with a user_id foreign key referencing users.id. The ON DELETE CASCADE constraint ensures referential integrity — removing a user account automatically removes all associated workout records. All data retrieval queries include a WHERE user_id = ? clause to enforce per-user data isolation at the database level.</w:t>
-      </w:r>
-    </w:p>
-    <w:p>
-      <w:pPr>
-        <w:spacing w:after="80"/>
+        <w:spacing w:after="200"/>
+        <w:ind w:firstLine="720"/>
+      </w:pPr>
+      <w:r>
+        <w:rPr>
+          <w:rFonts w:ascii="Times New Roman" w:cs="Times New Roman" w:eastAsia="Times New Roman" w:hAnsi="Times New Roman"/>
+          <w:sz w:val="24"/>
+          <w:szCs w:val="24"/>
+        </w:rPr>
+        <w:t xml:space="preserve">The database schema comprises two relational tables — users and workouts — linked by a one-to-many relationship. A single user record may be associated with many workout entries; however, each workout record references exactly one user, enforced through a foreign key constraint on the workouts.user_id column.</w:t>
+      </w:r>
+    </w:p>
+    <w:p>
+      <w:pPr>
+        <w:spacing w:after="200"/>
+        <w:ind w:firstLine="720"/>
+      </w:pPr>
+      <w:r>
+        <w:rPr>
+          <w:rFonts w:ascii="Times New Roman" w:cs="Times New Roman" w:eastAsia="Times New Roman" w:hAnsi="Times New Roman"/>
+          <w:sz w:val="24"/>
+          <w:szCs w:val="24"/>
+        </w:rPr>
+        <w:t xml:space="preserve">The ON DELETE CASCADE referential integrity constraint ensures that the removal of a user account automatically propagates to all associated workout records, preventing orphaned data. All data retrieval, update and deletion queries incorporate a WHERE user_id = ? predicate alongside the record identifier, enforcing per-user data isolation at the database query level rather than relying solely on application-layer controls.</w:t>
+      </w:r>
+    </w:p>
+    <w:p>
+      <w:pPr>
+        <w:spacing w:after="100"/>
       </w:pPr>
       <w:r>
         <w:t xml:space="preserve"/>
@@ -673,17 +822,19 @@
     </w:p>
     <w:p>
       <w:pPr>
-        <w:spacing w:after="160"/>
-      </w:pPr>
-      <w:r>
-        <w:rPr>
-          <w:rFonts w:ascii="Calibri" w:cs="Calibri" w:eastAsia="Calibri" w:hAnsi="Calibri"/>
-          <w:b/>
-          <w:bCs/>
-          <w:sz w:val="22"/>
-          <w:szCs w:val="22"/>
-        </w:rPr>
-        <w:t xml:space="preserve">Figure 2 — Data Model:</w:t>
+        <w:spacing w:after="120"/>
+        <w:jc w:val="center"/>
+      </w:pPr>
+      <w:r>
+        <w:rPr>
+          <w:rFonts w:ascii="Times New Roman" w:cs="Times New Roman" w:eastAsia="Times New Roman" w:hAnsi="Times New Roman"/>
+          <w:i/>
+          <w:iCs/>
+          <w:color w:val="555555"/>
+          <w:sz w:val="20"/>
+          <w:szCs w:val="20"/>
+        </w:rPr>
+        <w:t xml:space="preserve">Figure 2 — Entity Relationship Diagram</w:t>
       </w:r>
     </w:p>
     <w:tbl>
@@ -791,7 +942,7 @@
                 <w:sz w:val="20"/>
                 <w:szCs w:val="20"/>
               </w:rPr>
-              <w:t xml:space="preserve">id (PK, auto increment)</w:t>
+              <w:t xml:space="preserve">id INT — PRIMARY KEY</w:t>
             </w:r>
           </w:p>
         </w:tc>
@@ -821,7 +972,7 @@
                 <w:sz w:val="20"/>
                 <w:szCs w:val="20"/>
               </w:rPr>
-              <w:t xml:space="preserve">id (PK, auto increment)</w:t>
+              <w:t xml:space="preserve">id INT — PRIMARY KEY</w:t>
             </w:r>
           </w:p>
         </w:tc>
@@ -853,7 +1004,7 @@
                 <w:sz w:val="20"/>
                 <w:szCs w:val="20"/>
               </w:rPr>
-              <w:t xml:space="preserve">username (unique)</w:t>
+              <w:t xml:space="preserve">username VARCHAR(50) UNIQUE</w:t>
             </w:r>
           </w:p>
         </w:tc>
@@ -883,7 +1034,7 @@
                 <w:sz w:val="20"/>
                 <w:szCs w:val="20"/>
               </w:rPr>
-              <w:t xml:space="preserve">user_id (FK -&gt; users.id)</w:t>
+              <w:t xml:space="preserve">user_id INT — FOREIGN KEY</w:t>
             </w:r>
           </w:p>
         </w:tc>
@@ -915,7 +1066,7 @@
                 <w:sz w:val="20"/>
                 <w:szCs w:val="20"/>
               </w:rPr>
-              <w:t xml:space="preserve">email (unique)</w:t>
+              <w:t xml:space="preserve">email VARCHAR(100) UNIQUE</w:t>
             </w:r>
           </w:p>
         </w:tc>
@@ -945,7 +1096,7 @@
                 <w:sz w:val="20"/>
                 <w:szCs w:val="20"/>
               </w:rPr>
-              <w:t xml:space="preserve">exercise_name</w:t>
+              <w:t xml:space="preserve">exercise_name VARCHAR(100)</w:t>
             </w:r>
           </w:p>
         </w:tc>
@@ -977,7 +1128,7 @@
                 <w:sz w:val="20"/>
                 <w:szCs w:val="20"/>
               </w:rPr>
-              <w:t xml:space="preserve">password_hash</w:t>
+              <w:t xml:space="preserve">password_hash VARCHAR(255)</w:t>
             </w:r>
           </w:p>
         </w:tc>
@@ -1007,7 +1158,7 @@
                 <w:sz w:val="20"/>
                 <w:szCs w:val="20"/>
               </w:rPr>
-              <w:t xml:space="preserve">category</w:t>
+              <w:t xml:space="preserve">category VARCHAR(50)</w:t>
             </w:r>
           </w:p>
         </w:tc>
@@ -1039,7 +1190,7 @@
                 <w:sz w:val="20"/>
                 <w:szCs w:val="20"/>
               </w:rPr>
-              <w:t xml:space="preserve">created_at</w:t>
+              <w:t xml:space="preserve">created_at TIMESTAMP</w:t>
             </w:r>
           </w:p>
         </w:tc>
@@ -1069,7 +1220,7 @@
                 <w:sz w:val="20"/>
                 <w:szCs w:val="20"/>
               </w:rPr>
-              <w:t xml:space="preserve">duration_mins</w:t>
+              <w:t xml:space="preserve">duration_mins INT</w:t>
             </w:r>
           </w:p>
         </w:tc>
@@ -1131,7 +1282,7 @@
                 <w:sz w:val="20"/>
                 <w:szCs w:val="20"/>
               </w:rPr>
-              <w:t xml:space="preserve">notes</w:t>
+              <w:t xml:space="preserve">notes TEXT</w:t>
             </w:r>
           </w:p>
         </w:tc>
@@ -1193,7 +1344,7 @@
                 <w:sz w:val="20"/>
                 <w:szCs w:val="20"/>
               </w:rPr>
-              <w:t xml:space="preserve">workout_date</w:t>
+              <w:t xml:space="preserve">workout_date DATE</w:t>
             </w:r>
           </w:p>
         </w:tc>
@@ -1255,7 +1406,7 @@
                 <w:sz w:val="20"/>
                 <w:szCs w:val="20"/>
               </w:rPr>
-              <w:t xml:space="preserve">created_at</w:t>
+              <w:t xml:space="preserve">created_at TIMESTAMP</w:t>
             </w:r>
           </w:p>
         </w:tc>
@@ -1287,7 +1438,7 @@
                 <w:sz w:val="20"/>
                 <w:szCs w:val="20"/>
               </w:rPr>
-              <w:t xml:space="preserve">1 user -&gt; many workouts (ON DELETE CASCADE)</w:t>
+              <w:t xml:space="preserve">Relationship: 1 user : many workouts — ON DELETE CASCADE</w:t>
             </w:r>
           </w:p>
         </w:tc>
@@ -1317,7 +1468,7 @@
                 <w:sz w:val="20"/>
                 <w:szCs w:val="20"/>
               </w:rPr>
-              <w:t xml:space="preserve">Each workout belongs to 1 user</w:t>
+              <w:t xml:space="preserve">user_id references users(id)</w:t>
             </w:r>
           </w:p>
         </w:tc>
@@ -1325,7 +1476,7 @@
     </w:tbl>
     <w:p>
       <w:pPr>
-        <w:spacing w:after="80"/>
+        <w:spacing w:after="100"/>
       </w:pPr>
       <w:r>
         <w:t xml:space="preserve"/>
@@ -1334,58 +1485,60 @@
     <w:p>
       <w:pPr>
         <w:pStyle w:val="Heading1"/>
-        <w:spacing w:after="200" w:before="400"/>
-      </w:pPr>
-      <w:r>
-        <w:rPr>
-          <w:rFonts w:ascii="Calibri" w:cs="Calibri" w:eastAsia="Calibri" w:hAnsi="Calibri"/>
+        <w:spacing w:after="240" w:before="480"/>
+      </w:pPr>
+      <w:r>
+        <w:rPr>
+          <w:rFonts w:ascii="Times New Roman" w:cs="Times New Roman" w:eastAsia="Times New Roman" w:hAnsi="Times New Roman"/>
           <w:b/>
           <w:bCs/>
-          <w:sz w:val="32"/>
-          <w:szCs w:val="32"/>
+          <w:sz w:val="28"/>
+          <w:szCs w:val="28"/>
         </w:rPr>
         <w:t xml:space="preserve">User Functionality</w:t>
       </w:r>
     </w:p>
     <w:p>
       <w:pPr>
-        <w:spacing w:after="160"/>
-      </w:pPr>
-      <w:r>
-        <w:rPr>
-          <w:rFonts w:ascii="Calibri" w:cs="Calibri" w:eastAsia="Calibri" w:hAnsi="Calibri"/>
-          <w:sz w:val="22"/>
-          <w:szCs w:val="22"/>
-        </w:rPr>
-        <w:t xml:space="preserve">The application provides the following user-facing features:</w:t>
-      </w:r>
-    </w:p>
-    <w:p>
-      <w:pPr>
-        <w:spacing w:after="160"/>
-      </w:pPr>
-      <w:r>
-        <w:rPr>
-          <w:rFonts w:ascii="Calibri" w:cs="Calibri" w:eastAsia="Calibri" w:hAnsi="Calibri"/>
+        <w:spacing w:after="200"/>
+        <w:ind w:firstLine="720"/>
+      </w:pPr>
+      <w:r>
+        <w:rPr>
+          <w:rFonts w:ascii="Times New Roman" w:cs="Times New Roman" w:eastAsia="Times New Roman" w:hAnsi="Times New Roman"/>
+          <w:sz w:val="24"/>
+          <w:szCs w:val="24"/>
+        </w:rPr>
+        <w:t xml:space="preserve">The following section describes the user-facing functionality of the FitTrack application, illustrated with screenshots from the deployed instance.</w:t>
+      </w:r>
+    </w:p>
+    <w:p>
+      <w:pPr>
+        <w:spacing w:after="120" w:before="200"/>
+      </w:pPr>
+      <w:r>
+        <w:rPr>
+          <w:rFonts w:ascii="Times New Roman" w:cs="Times New Roman" w:eastAsia="Times New Roman" w:hAnsi="Times New Roman"/>
           <w:b/>
           <w:bCs/>
-          <w:sz w:val="22"/>
-          <w:szCs w:val="22"/>
+          <w:sz w:val="24"/>
+          <w:szCs w:val="24"/>
         </w:rPr>
         <w:t xml:space="preserve">Home Page</w:t>
       </w:r>
     </w:p>
     <w:p>
       <w:pPr>
-        <w:spacing w:after="160"/>
-      </w:pPr>
-      <w:r>
-        <w:rPr>
-          <w:rFonts w:ascii="Calibri" w:cs="Calibri" w:eastAsia="Calibri" w:hAnsi="Calibri"/>
-          <w:sz w:val="22"/>
-          <w:szCs w:val="22"/>
-        </w:rPr>
-        <w:t xml:space="preserve">The home page serves as the public entry point to the application. It presents the FitTrack brand, a brief description of the service, and context-sensitive navigation — unauthenticated users are shown Register and Login options, while authenticated users are directed to their dashboard.</w:t>
+        <w:spacing w:after="200"/>
+        <w:ind w:firstLine="720"/>
+      </w:pPr>
+      <w:r>
+        <w:rPr>
+          <w:rFonts w:ascii="Times New Roman" w:cs="Times New Roman" w:eastAsia="Times New Roman" w:hAnsi="Times New Roman"/>
+          <w:sz w:val="24"/>
+          <w:szCs w:val="24"/>
+        </w:rPr>
+        <w:t xml:space="preserve">The home page serves as the public entry point to the application. It presents the FitTrack branding, a concise description of the service, and context-sensitive navigation controls. Unauthenticated users are presented with Register and Login options, whilst authenticated users are directed toward their personal dashboard and workout management features (see Figure 3).</w:t>
       </w:r>
     </w:p>
     <w:p>
@@ -1396,7 +1549,7 @@
       <w:r>
         <w:drawing>
           <wp:inline distT="0" distB="0" distL="0" distR="0">
-            <wp:extent cx="5238750" cy="3619500"/>
+            <wp:extent cx="4953000" cy="3429000"/>
             <wp:effectExtent t="0" r="0" b="0" l="0"/>
             <wp:docPr id="1" name="Home page" descr="Home page" title="Home page"/>
             <wp:cNvGraphicFramePr>
@@ -1421,7 +1574,7 @@
                   <pic:spPr bwMode="auto">
                     <a:xfrm>
                       <a:off x="0" y="0"/>
-                      <a:ext cx="5238750" cy="3619500"/>
+                      <a:ext cx="4953000" cy="3429000"/>
                     </a:xfrm>
                     <a:prstGeom prst="rect">
                       <a:avLst/>
@@ -1436,47 +1589,48 @@
     </w:p>
     <w:p>
       <w:pPr>
-        <w:spacing w:after="200"/>
+        <w:spacing w:after="240"/>
         <w:jc w:val="center"/>
       </w:pPr>
       <w:r>
         <w:rPr>
-          <w:rFonts w:ascii="Calibri" w:cs="Calibri" w:eastAsia="Calibri" w:hAnsi="Calibri"/>
+          <w:rFonts w:ascii="Times New Roman" w:cs="Times New Roman" w:eastAsia="Times New Roman" w:hAnsi="Times New Roman"/>
           <w:i/>
           <w:iCs/>
-          <w:color w:val="666666"/>
-          <w:sz w:val="18"/>
-          <w:szCs w:val="18"/>
-        </w:rPr>
-        <w:t xml:space="preserve">Figure 3 — Home page</w:t>
-      </w:r>
-    </w:p>
-    <w:p>
-      <w:pPr>
-        <w:spacing w:after="160"/>
-      </w:pPr>
-      <w:r>
-        <w:rPr>
-          <w:rFonts w:ascii="Calibri" w:cs="Calibri" w:eastAsia="Calibri" w:hAnsi="Calibri"/>
+          <w:color w:val="555555"/>
+          <w:sz w:val="20"/>
+          <w:szCs w:val="20"/>
+        </w:rPr>
+        <w:t xml:space="preserve">Figure 3 — Application home page</w:t>
+      </w:r>
+    </w:p>
+    <w:p>
+      <w:pPr>
+        <w:spacing w:after="120" w:before="200"/>
+      </w:pPr>
+      <w:r>
+        <w:rPr>
+          <w:rFonts w:ascii="Times New Roman" w:cs="Times New Roman" w:eastAsia="Times New Roman" w:hAnsi="Times New Roman"/>
           <w:b/>
           <w:bCs/>
-          <w:sz w:val="22"/>
-          <w:szCs w:val="22"/>
+          <w:sz w:val="24"/>
+          <w:szCs w:val="24"/>
         </w:rPr>
         <w:t xml:space="preserve">About Page</w:t>
       </w:r>
     </w:p>
     <w:p>
       <w:pPr>
-        <w:spacing w:after="160"/>
-      </w:pPr>
-      <w:r>
-        <w:rPr>
-          <w:rFonts w:ascii="Calibri" w:cs="Calibri" w:eastAsia="Calibri" w:hAnsi="Calibri"/>
-          <w:sz w:val="22"/>
-          <w:szCs w:val="22"/>
-        </w:rPr>
-        <w:t xml:space="preserve">The about page provides an overview of the application's purpose and lists the technologies used in its development.</w:t>
+        <w:spacing w:after="200"/>
+        <w:ind w:firstLine="720"/>
+      </w:pPr>
+      <w:r>
+        <w:rPr>
+          <w:rFonts w:ascii="Times New Roman" w:cs="Times New Roman" w:eastAsia="Times New Roman" w:hAnsi="Times New Roman"/>
+          <w:sz w:val="24"/>
+          <w:szCs w:val="24"/>
+        </w:rPr>
+        <w:t xml:space="preserve">The about page provides an overview of the application's purpose and enumerates the technologies employed in its development, offering transparency regarding the technical implementation (see Figure 4).</w:t>
       </w:r>
     </w:p>
     <w:p>
@@ -1487,7 +1641,7 @@
       <w:r>
         <w:drawing>
           <wp:inline distT="0" distB="0" distL="0" distR="0">
-            <wp:extent cx="5238750" cy="3619500"/>
+            <wp:extent cx="4953000" cy="3429000"/>
             <wp:effectExtent t="0" r="0" b="0" l="0"/>
             <wp:docPr id="1" name="About page" descr="About page" title="About page"/>
             <wp:cNvGraphicFramePr>
@@ -1512,7 +1666,7 @@
                   <pic:spPr bwMode="auto">
                     <a:xfrm>
                       <a:off x="0" y="0"/>
-                      <a:ext cx="5238750" cy="3619500"/>
+                      <a:ext cx="4953000" cy="3429000"/>
                     </a:xfrm>
                     <a:prstGeom prst="rect">
                       <a:avLst/>
@@ -1527,47 +1681,48 @@
     </w:p>
     <w:p>
       <w:pPr>
-        <w:spacing w:after="200"/>
+        <w:spacing w:after="240"/>
         <w:jc w:val="center"/>
       </w:pPr>
       <w:r>
         <w:rPr>
-          <w:rFonts w:ascii="Calibri" w:cs="Calibri" w:eastAsia="Calibri" w:hAnsi="Calibri"/>
+          <w:rFonts w:ascii="Times New Roman" w:cs="Times New Roman" w:eastAsia="Times New Roman" w:hAnsi="Times New Roman"/>
           <w:i/>
           <w:iCs/>
-          <w:color w:val="666666"/>
-          <w:sz w:val="18"/>
-          <w:szCs w:val="18"/>
+          <w:color w:val="555555"/>
+          <w:sz w:val="20"/>
+          <w:szCs w:val="20"/>
         </w:rPr>
         <w:t xml:space="preserve">Figure 4 — About page</w:t>
       </w:r>
     </w:p>
     <w:p>
       <w:pPr>
-        <w:spacing w:after="160"/>
-      </w:pPr>
-      <w:r>
-        <w:rPr>
-          <w:rFonts w:ascii="Calibri" w:cs="Calibri" w:eastAsia="Calibri" w:hAnsi="Calibri"/>
+        <w:spacing w:after="120" w:before="200"/>
+      </w:pPr>
+      <w:r>
+        <w:rPr>
+          <w:rFonts w:ascii="Times New Roman" w:cs="Times New Roman" w:eastAsia="Times New Roman" w:hAnsi="Times New Roman"/>
           <w:b/>
           <w:bCs/>
-          <w:sz w:val="22"/>
-          <w:szCs w:val="22"/>
-        </w:rPr>
-        <w:t xml:space="preserve">Login</w:t>
-      </w:r>
-    </w:p>
-    <w:p>
-      <w:pPr>
-        <w:spacing w:after="160"/>
-      </w:pPr>
-      <w:r>
-        <w:rPr>
-          <w:rFonts w:ascii="Calibri" w:cs="Calibri" w:eastAsia="Calibri" w:hAnsi="Calibri"/>
-          <w:sz w:val="22"/>
-          <w:szCs w:val="22"/>
-        </w:rPr>
-        <w:t xml:space="preserve">The login form accepts a username and password. Submitted credentials are validated server-side by comparing the password against the stored bcrypt hash. Invalid credentials produce a generic error message that does not reveal which field was incorrect, mitigating enumeration attacks.</w:t>
+          <w:sz w:val="24"/>
+          <w:szCs w:val="24"/>
+        </w:rPr>
+        <w:t xml:space="preserve">User Authentication — Login</w:t>
+      </w:r>
+    </w:p>
+    <w:p>
+      <w:pPr>
+        <w:spacing w:after="200"/>
+        <w:ind w:firstLine="720"/>
+      </w:pPr>
+      <w:r>
+        <w:rPr>
+          <w:rFonts w:ascii="Times New Roman" w:cs="Times New Roman" w:eastAsia="Times New Roman" w:hAnsi="Times New Roman"/>
+          <w:sz w:val="24"/>
+          <w:szCs w:val="24"/>
+        </w:rPr>
+        <w:t xml:space="preserve">The login form accepts a username and password. Submitted credentials are validated server-side by comparing the supplied password against the stored bcrypt hash using a constant-time comparison function. In the event of invalid credentials, a generic error message is returned that does not disclose which specific field was incorrect, thereby mitigating username enumeration attacks (see Figure 5).</w:t>
       </w:r>
     </w:p>
     <w:p>
@@ -1578,7 +1733,7 @@
       <w:r>
         <w:drawing>
           <wp:inline distT="0" distB="0" distL="0" distR="0">
-            <wp:extent cx="5238750" cy="3143250"/>
+            <wp:extent cx="4953000" cy="2952750"/>
             <wp:effectExtent t="0" r="0" b="0" l="0"/>
             <wp:docPr id="1" name="Login page" descr="Login page" title="Login page"/>
             <wp:cNvGraphicFramePr>
@@ -1603,7 +1758,7 @@
                   <pic:spPr bwMode="auto">
                     <a:xfrm>
                       <a:off x="0" y="0"/>
-                      <a:ext cx="5238750" cy="3143250"/>
+                      <a:ext cx="4953000" cy="2952750"/>
                     </a:xfrm>
                     <a:prstGeom prst="rect">
                       <a:avLst/>
@@ -1618,47 +1773,48 @@
     </w:p>
     <w:p>
       <w:pPr>
-        <w:spacing w:after="200"/>
+        <w:spacing w:after="240"/>
         <w:jc w:val="center"/>
       </w:pPr>
       <w:r>
         <w:rPr>
-          <w:rFonts w:ascii="Calibri" w:cs="Calibri" w:eastAsia="Calibri" w:hAnsi="Calibri"/>
+          <w:rFonts w:ascii="Times New Roman" w:cs="Times New Roman" w:eastAsia="Times New Roman" w:hAnsi="Times New Roman"/>
           <w:i/>
           <w:iCs/>
-          <w:color w:val="666666"/>
-          <w:sz w:val="18"/>
-          <w:szCs w:val="18"/>
+          <w:color w:val="555555"/>
+          <w:sz w:val="20"/>
+          <w:szCs w:val="20"/>
         </w:rPr>
         <w:t xml:space="preserve">Figure 5 — Login page</w:t>
       </w:r>
     </w:p>
     <w:p>
       <w:pPr>
-        <w:spacing w:after="160"/>
-      </w:pPr>
-      <w:r>
-        <w:rPr>
-          <w:rFonts w:ascii="Calibri" w:cs="Calibri" w:eastAsia="Calibri" w:hAnsi="Calibri"/>
+        <w:spacing w:after="120" w:before="200"/>
+      </w:pPr>
+      <w:r>
+        <w:rPr>
+          <w:rFonts w:ascii="Times New Roman" w:cs="Times New Roman" w:eastAsia="Times New Roman" w:hAnsi="Times New Roman"/>
           <w:b/>
           <w:bCs/>
-          <w:sz w:val="22"/>
-          <w:szCs w:val="22"/>
+          <w:sz w:val="24"/>
+          <w:szCs w:val="24"/>
         </w:rPr>
         <w:t xml:space="preserve">Dashboard</w:t>
       </w:r>
     </w:p>
     <w:p>
       <w:pPr>
-        <w:spacing w:after="160"/>
-      </w:pPr>
-      <w:r>
-        <w:rPr>
-          <w:rFonts w:ascii="Calibri" w:cs="Calibri" w:eastAsia="Calibri" w:hAnsi="Calibri"/>
-          <w:sz w:val="22"/>
-          <w:szCs w:val="22"/>
-        </w:rPr>
-        <w:t xml:space="preserve">The dashboard is the primary authenticated landing page. It displays three summary statistics — total workouts, total minutes trained, and total time formatted as hours and minutes — computed via SQL aggregate functions. The five most recent workout entries are listed below.</w:t>
+        <w:spacing w:after="200"/>
+        <w:ind w:firstLine="720"/>
+      </w:pPr>
+      <w:r>
+        <w:rPr>
+          <w:rFonts w:ascii="Times New Roman" w:cs="Times New Roman" w:eastAsia="Times New Roman" w:hAnsi="Times New Roman"/>
+          <w:sz w:val="24"/>
+          <w:szCs w:val="24"/>
+        </w:rPr>
+        <w:t xml:space="preserve">The dashboard constitutes the primary authenticated landing page. Three summary statistic cards are computed via SQL aggregate functions — total workouts logged (COUNT), total minutes trained (SUM with COALESCE null handling), and total training time formatted as hours and minutes. The five most recent workout entries are presented in a tabular format below the statistics (see Figure 6).</w:t>
       </w:r>
     </w:p>
     <w:p>
@@ -1669,7 +1825,7 @@
       <w:r>
         <w:drawing>
           <wp:inline distT="0" distB="0" distL="0" distR="0">
-            <wp:extent cx="5238750" cy="3619500"/>
+            <wp:extent cx="4953000" cy="3429000"/>
             <wp:effectExtent t="0" r="0" b="0" l="0"/>
             <wp:docPr id="1" name="Dashboard" descr="Dashboard" title="Dashboard"/>
             <wp:cNvGraphicFramePr>
@@ -1694,7 +1850,7 @@
                   <pic:spPr bwMode="auto">
                     <a:xfrm>
                       <a:off x="0" y="0"/>
-                      <a:ext cx="5238750" cy="3619500"/>
+                      <a:ext cx="4953000" cy="3429000"/>
                     </a:xfrm>
                     <a:prstGeom prst="rect">
                       <a:avLst/>
@@ -1709,47 +1865,48 @@
     </w:p>
     <w:p>
       <w:pPr>
-        <w:spacing w:after="200"/>
+        <w:spacing w:after="240"/>
         <w:jc w:val="center"/>
       </w:pPr>
       <w:r>
         <w:rPr>
-          <w:rFonts w:ascii="Calibri" w:cs="Calibri" w:eastAsia="Calibri" w:hAnsi="Calibri"/>
+          <w:rFonts w:ascii="Times New Roman" w:cs="Times New Roman" w:eastAsia="Times New Roman" w:hAnsi="Times New Roman"/>
           <w:i/>
           <w:iCs/>
-          <w:color w:val="666666"/>
-          <w:sz w:val="18"/>
-          <w:szCs w:val="18"/>
-        </w:rPr>
-        <w:t xml:space="preserve">Figure 6 — Dashboard with statistics</w:t>
-      </w:r>
-    </w:p>
-    <w:p>
-      <w:pPr>
-        <w:spacing w:after="160"/>
-      </w:pPr>
-      <w:r>
-        <w:rPr>
-          <w:rFonts w:ascii="Calibri" w:cs="Calibri" w:eastAsia="Calibri" w:hAnsi="Calibri"/>
+          <w:color w:val="555555"/>
+          <w:sz w:val="20"/>
+          <w:szCs w:val="20"/>
+        </w:rPr>
+        <w:t xml:space="preserve">Figure 6 — User dashboard with aggregate statistics</w:t>
+      </w:r>
+    </w:p>
+    <w:p>
+      <w:pPr>
+        <w:spacing w:after="120" w:before="200"/>
+      </w:pPr>
+      <w:r>
+        <w:rPr>
+          <w:rFonts w:ascii="Times New Roman" w:cs="Times New Roman" w:eastAsia="Times New Roman" w:hAnsi="Times New Roman"/>
           <w:b/>
           <w:bCs/>
-          <w:sz w:val="22"/>
-          <w:szCs w:val="22"/>
+          <w:sz w:val="24"/>
+          <w:szCs w:val="24"/>
         </w:rPr>
         <w:t xml:space="preserve">Add Workout</w:t>
       </w:r>
     </w:p>
     <w:p>
       <w:pPr>
-        <w:spacing w:after="160"/>
-      </w:pPr>
-      <w:r>
-        <w:rPr>
-          <w:rFonts w:ascii="Calibri" w:cs="Calibri" w:eastAsia="Calibri" w:hAnsi="Calibri"/>
-          <w:sz w:val="22"/>
-          <w:szCs w:val="22"/>
-        </w:rPr>
-        <w:t xml:space="preserve">The add workout form collects exercise name, category (selected from a dropdown), duration in minutes, date and optional notes. Server-side validation rejects incomplete submissions and returns the form with submitted values preserved and a descriptive error message displayed.</w:t>
+        <w:spacing w:after="200"/>
+        <w:ind w:firstLine="720"/>
+      </w:pPr>
+      <w:r>
+        <w:rPr>
+          <w:rFonts w:ascii="Times New Roman" w:cs="Times New Roman" w:eastAsia="Times New Roman" w:hAnsi="Times New Roman"/>
+          <w:sz w:val="24"/>
+          <w:szCs w:val="24"/>
+        </w:rPr>
+        <w:t xml:space="preserve">The add workout form collects the exercise name, category (selected from a predefined dropdown), duration in minutes, date and optional session notes. Server-side validation rejects incomplete or invalid submissions and re-renders the form with previously submitted field values preserved, accompanied by a descriptive error message (see Figure 7).</w:t>
       </w:r>
     </w:p>
     <w:p>
@@ -1760,7 +1917,7 @@
       <w:r>
         <w:drawing>
           <wp:inline distT="0" distB="0" distL="0" distR="0">
-            <wp:extent cx="5238750" cy="4095750"/>
+            <wp:extent cx="4953000" cy="3905250"/>
             <wp:effectExtent t="0" r="0" b="0" l="0"/>
             <wp:docPr id="1" name="Add workout form" descr="Add workout form" title="Add workout form"/>
             <wp:cNvGraphicFramePr>
@@ -1785,7 +1942,7 @@
                   <pic:spPr bwMode="auto">
                     <a:xfrm>
                       <a:off x="0" y="0"/>
-                      <a:ext cx="5238750" cy="4095750"/>
+                      <a:ext cx="4953000" cy="3905250"/>
                     </a:xfrm>
                     <a:prstGeom prst="rect">
                       <a:avLst/>
@@ -1800,47 +1957,48 @@
     </w:p>
     <w:p>
       <w:pPr>
-        <w:spacing w:after="200"/>
+        <w:spacing w:after="240"/>
         <w:jc w:val="center"/>
       </w:pPr>
       <w:r>
         <w:rPr>
-          <w:rFonts w:ascii="Calibri" w:cs="Calibri" w:eastAsia="Calibri" w:hAnsi="Calibri"/>
+          <w:rFonts w:ascii="Times New Roman" w:cs="Times New Roman" w:eastAsia="Times New Roman" w:hAnsi="Times New Roman"/>
           <w:i/>
           <w:iCs/>
-          <w:color w:val="666666"/>
-          <w:sz w:val="18"/>
-          <w:szCs w:val="18"/>
-        </w:rPr>
-        <w:t xml:space="preserve">Figure 7 — Add workout form</w:t>
-      </w:r>
-    </w:p>
-    <w:p>
-      <w:pPr>
-        <w:spacing w:after="160"/>
-      </w:pPr>
-      <w:r>
-        <w:rPr>
-          <w:rFonts w:ascii="Calibri" w:cs="Calibri" w:eastAsia="Calibri" w:hAnsi="Calibri"/>
+          <w:color w:val="555555"/>
+          <w:sz w:val="20"/>
+          <w:szCs w:val="20"/>
+        </w:rPr>
+        <w:t xml:space="preserve">Figure 7 — Add workout form with validation</w:t>
+      </w:r>
+    </w:p>
+    <w:p>
+      <w:pPr>
+        <w:spacing w:after="120" w:before="200"/>
+      </w:pPr>
+      <w:r>
+        <w:rPr>
+          <w:rFonts w:ascii="Times New Roman" w:cs="Times New Roman" w:eastAsia="Times New Roman" w:hAnsi="Times New Roman"/>
           <w:b/>
           <w:bCs/>
-          <w:sz w:val="22"/>
-          <w:szCs w:val="22"/>
+          <w:sz w:val="24"/>
+          <w:szCs w:val="24"/>
         </w:rPr>
         <w:t xml:space="preserve">My Workouts</w:t>
       </w:r>
     </w:p>
     <w:p>
       <w:pPr>
-        <w:spacing w:after="160"/>
-      </w:pPr>
-      <w:r>
-        <w:rPr>
-          <w:rFonts w:ascii="Calibri" w:cs="Calibri" w:eastAsia="Calibri" w:hAnsi="Calibri"/>
-          <w:sz w:val="22"/>
-          <w:szCs w:val="22"/>
-        </w:rPr>
-        <w:t xml:space="preserve">The workouts page lists all entries for the authenticated user in descending date order. A search bar enables filtering by exercise name or category against the database. CRUD operations — edit and delete — are available on each entry. Successful operations redirect with a query parameter that triggers a green confirmation message.</w:t>
+        <w:spacing w:after="200"/>
+        <w:ind w:firstLine="720"/>
+      </w:pPr>
+      <w:r>
+        <w:rPr>
+          <w:rFonts w:ascii="Times New Roman" w:cs="Times New Roman" w:eastAsia="Times New Roman" w:hAnsi="Times New Roman"/>
+          <w:sz w:val="24"/>
+          <w:szCs w:val="24"/>
+        </w:rPr>
+        <w:t xml:space="preserve">The workouts page presents all entries associated with the authenticated user in descending chronological order. A search bar facilitates real-time filtering by exercise name or category, executing a parameterised LIKE query against the database. Full CRUD operations — create, read, update and delete — are available on each entry. Successful operations redirect with a query parameter that triggers a contextual confirmation message (see Figure 8).</w:t>
       </w:r>
     </w:p>
     <w:p>
@@ -1851,7 +2009,7 @@
       <w:r>
         <w:drawing>
           <wp:inline distT="0" distB="0" distL="0" distR="0">
-            <wp:extent cx="5238750" cy="3619500"/>
+            <wp:extent cx="4953000" cy="3429000"/>
             <wp:effectExtent t="0" r="0" b="0" l="0"/>
             <wp:docPr id="1" name="My workouts page" descr="My workouts page" title="My workouts page"/>
             <wp:cNvGraphicFramePr>
@@ -1876,7 +2034,7 @@
                   <pic:spPr bwMode="auto">
                     <a:xfrm>
                       <a:off x="0" y="0"/>
-                      <a:ext cx="5238750" cy="3619500"/>
+                      <a:ext cx="4953000" cy="3429000"/>
                     </a:xfrm>
                     <a:prstGeom prst="rect">
                       <a:avLst/>
@@ -1891,63 +2049,78 @@
     </w:p>
     <w:p>
       <w:pPr>
-        <w:spacing w:after="200"/>
+        <w:spacing w:after="240"/>
         <w:jc w:val="center"/>
       </w:pPr>
       <w:r>
         <w:rPr>
-          <w:rFonts w:ascii="Calibri" w:cs="Calibri" w:eastAsia="Calibri" w:hAnsi="Calibri"/>
+          <w:rFonts w:ascii="Times New Roman" w:cs="Times New Roman" w:eastAsia="Times New Roman" w:hAnsi="Times New Roman"/>
           <w:i/>
           <w:iCs/>
-          <w:color w:val="666666"/>
-          <w:sz w:val="18"/>
-          <w:szCs w:val="18"/>
-        </w:rPr>
-        <w:t xml:space="preserve">Figure 8 — My Workouts page with search and success message</w:t>
+          <w:color w:val="555555"/>
+          <w:sz w:val="20"/>
+          <w:szCs w:val="20"/>
+        </w:rPr>
+        <w:t xml:space="preserve">Figure 8 — My Workouts page with search functionality and success notification</w:t>
       </w:r>
     </w:p>
     <w:p>
       <w:pPr>
         <w:pStyle w:val="Heading1"/>
-        <w:spacing w:after="200" w:before="400"/>
-      </w:pPr>
-      <w:r>
-        <w:rPr>
-          <w:rFonts w:ascii="Calibri" w:cs="Calibri" w:eastAsia="Calibri" w:hAnsi="Calibri"/>
+        <w:spacing w:after="240" w:before="480"/>
+      </w:pPr>
+      <w:r>
+        <w:rPr>
+          <w:rFonts w:ascii="Times New Roman" w:cs="Times New Roman" w:eastAsia="Times New Roman" w:hAnsi="Times New Roman"/>
           <w:b/>
           <w:bCs/>
-          <w:sz w:val="32"/>
-          <w:szCs w:val="32"/>
+          <w:sz w:val="28"/>
+          <w:szCs w:val="28"/>
         </w:rPr>
         <w:t xml:space="preserve">Advanced Techniques</w:t>
       </w:r>
     </w:p>
     <w:p>
       <w:pPr>
-        <w:spacing w:after="160"/>
-      </w:pPr>
-      <w:r>
-        <w:rPr>
-          <w:rFonts w:ascii="Calibri" w:cs="Calibri" w:eastAsia="Calibri" w:hAnsi="Calibri"/>
+        <w:spacing w:after="200"/>
+        <w:ind w:firstLine="720"/>
+      </w:pPr>
+      <w:r>
+        <w:rPr>
+          <w:rFonts w:ascii="Times New Roman" w:cs="Times New Roman" w:eastAsia="Times New Roman" w:hAnsi="Times New Roman"/>
+          <w:sz w:val="24"/>
+          <w:szCs w:val="24"/>
+        </w:rPr>
+        <w:t xml:space="preserve">This section details the more technically sophisticated implementation decisions made during the development of FitTrack, accompanied by illustrative code extracts and references to the relevant source files.</w:t>
+      </w:r>
+    </w:p>
+    <w:p>
+      <w:pPr>
+        <w:spacing w:after="120" w:before="200"/>
+      </w:pPr>
+      <w:r>
+        <w:rPr>
+          <w:rFonts w:ascii="Times New Roman" w:cs="Times New Roman" w:eastAsia="Times New Roman" w:hAnsi="Times New Roman"/>
           <w:b/>
           <w:bCs/>
-          <w:sz w:val="22"/>
-          <w:szCs w:val="22"/>
-        </w:rPr>
-        <w:t xml:space="preserve">1. Bcrypt Password Hashing (controllers/authController.js)</w:t>
-      </w:r>
-    </w:p>
-    <w:p>
-      <w:pPr>
-        <w:spacing w:after="160"/>
-      </w:pPr>
-      <w:r>
-        <w:rPr>
-          <w:rFonts w:ascii="Calibri" w:cs="Calibri" w:eastAsia="Calibri" w:hAnsi="Calibri"/>
-          <w:sz w:val="22"/>
-          <w:szCs w:val="22"/>
-        </w:rPr>
-        <w:t xml:space="preserve">Rather than storing passwords in plain text, bcrypt generates a computationally expensive one-way hash using a salt round factor of 10. This means that even if the database were compromised, recovering the original passwords would be infeasible. During authentication, bcrypt.compare re-hashes the submitted password and compares it against the stored hash without any decryption.</w:t>
+          <w:sz w:val="24"/>
+          <w:szCs w:val="24"/>
+        </w:rPr>
+        <w:t xml:space="preserve">1. Bcrypt Adaptive Password Hashing (controllers/authController.js)</w:t>
+      </w:r>
+    </w:p>
+    <w:p>
+      <w:pPr>
+        <w:spacing w:after="200"/>
+        <w:ind w:firstLine="720"/>
+      </w:pPr>
+      <w:r>
+        <w:rPr>
+          <w:rFonts w:ascii="Times New Roman" w:cs="Times New Roman" w:eastAsia="Times New Roman" w:hAnsi="Times New Roman"/>
+          <w:sz w:val="24"/>
+          <w:szCs w:val="24"/>
+        </w:rPr>
+        <w:t xml:space="preserve">Passwords are stored exclusively as bcrypt hashes, never in plain text. Bcrypt was selected over simpler hashing algorithms such as MD5 or SHA-1 due to its intentionally slow computation — a configurable cost factor (salt rounds) of 10 renders brute-force and rainbow table attacks computationally infeasible (Provos and Mazieres, 1999). Authentication employs bcrypt.compare, which performs a constant-time comparison to prevent timing attacks.</w:t>
       </w:r>
     </w:p>
     <w:p>
@@ -1982,7 +2155,7 @@
     </w:p>
     <w:p>
       <w:pPr>
-        <w:spacing w:after="80"/>
+        <w:spacing w:after="100"/>
       </w:pPr>
       <w:r>
         <w:t xml:space="preserve"/>
@@ -1990,30 +2163,31 @@
     </w:p>
     <w:p>
       <w:pPr>
-        <w:spacing w:after="160"/>
-      </w:pPr>
-      <w:r>
-        <w:rPr>
-          <w:rFonts w:ascii="Calibri" w:cs="Calibri" w:eastAsia="Calibri" w:hAnsi="Calibri"/>
+        <w:spacing w:after="120" w:before="200"/>
+      </w:pPr>
+      <w:r>
+        <w:rPr>
+          <w:rFonts w:ascii="Times New Roman" w:cs="Times New Roman" w:eastAsia="Times New Roman" w:hAnsi="Times New Roman"/>
           <w:b/>
           <w:bCs/>
-          <w:sz w:val="22"/>
-          <w:szCs w:val="22"/>
-        </w:rPr>
-        <w:t xml:space="preserve">2. Global Template Variables via Middleware (index.js)</w:t>
-      </w:r>
-    </w:p>
-    <w:p>
-      <w:pPr>
-        <w:spacing w:after="160"/>
-      </w:pPr>
-      <w:r>
-        <w:rPr>
-          <w:rFonts w:ascii="Calibri" w:cs="Calibri" w:eastAsia="Calibri" w:hAnsi="Calibri"/>
-          <w:sz w:val="22"/>
-          <w:szCs w:val="22"/>
-        </w:rPr>
-        <w:t xml:space="preserve">Rather than explicitly passing the authenticated username to every individual render call, a middleware function assigns it to res.locals once per request. EJS templates throughout the application can then reference it directly, reducing code repetition and the risk of omission errors.</w:t>
+          <w:sz w:val="24"/>
+          <w:szCs w:val="24"/>
+        </w:rPr>
+        <w:t xml:space="preserve">2. Centralised Template Variables via Express Middleware (index.js)</w:t>
+      </w:r>
+    </w:p>
+    <w:p>
+      <w:pPr>
+        <w:spacing w:after="200"/>
+        <w:ind w:firstLine="720"/>
+      </w:pPr>
+      <w:r>
+        <w:rPr>
+          <w:rFonts w:ascii="Times New Roman" w:cs="Times New Roman" w:eastAsia="Times New Roman" w:hAnsi="Times New Roman"/>
+          <w:sz w:val="24"/>
+          <w:szCs w:val="24"/>
+        </w:rPr>
+        <w:t xml:space="preserve">Rather than explicitly passing the authenticated username to each individual render invocation, a custom middleware function assigns it to the res.locals object at the request level. As res.locals is automatically accessible within all EJS templates for the duration of a request, this eliminates repetitive parameter passing and reduces the likelihood of omission errors across the view layer.</w:t>
       </w:r>
     </w:p>
     <w:p>
@@ -2078,7 +2252,7 @@
     </w:p>
     <w:p>
       <w:pPr>
-        <w:spacing w:after="80"/>
+        <w:spacing w:after="100"/>
       </w:pPr>
       <w:r>
         <w:t xml:space="preserve"/>
@@ -2086,30 +2260,31 @@
     </w:p>
     <w:p>
       <w:pPr>
-        <w:spacing w:after="160"/>
-      </w:pPr>
-      <w:r>
-        <w:rPr>
-          <w:rFonts w:ascii="Calibri" w:cs="Calibri" w:eastAsia="Calibri" w:hAnsi="Calibri"/>
+        <w:spacing w:after="120" w:before="200"/>
+      </w:pPr>
+      <w:r>
+        <w:rPr>
+          <w:rFonts w:ascii="Times New Roman" w:cs="Times New Roman" w:eastAsia="Times New Roman" w:hAnsi="Times New Roman"/>
           <w:b/>
           <w:bCs/>
-          <w:sz w:val="22"/>
-          <w:szCs w:val="22"/>
-        </w:rPr>
-        <w:t xml:space="preserve">3. Password Strength Validation with Regular Expression (controllers/authController.js)</w:t>
-      </w:r>
-    </w:p>
-    <w:p>
-      <w:pPr>
-        <w:spacing w:after="160"/>
-      </w:pPr>
-      <w:r>
-        <w:rPr>
-          <w:rFonts w:ascii="Calibri" w:cs="Calibri" w:eastAsia="Calibri" w:hAnsi="Calibri"/>
-          <w:sz w:val="22"/>
-          <w:szCs w:val="22"/>
-        </w:rPr>
-        <w:t xml:space="preserve">Registration enforces a strong password policy validated using a single regular expression with lookaheads. The pattern requires a minimum of eight characters including at least one lowercase letter, one uppercase letter, one digit and one special character — all checked in a single pass without multiple conditional checks.</w:t>
+          <w:sz w:val="24"/>
+          <w:szCs w:val="24"/>
+        </w:rPr>
+        <w:t xml:space="preserve">3. Password Strength Enforcement via Regular Expression (controllers/authController.js)</w:t>
+      </w:r>
+    </w:p>
+    <w:p>
+      <w:pPr>
+        <w:spacing w:after="200"/>
+        <w:ind w:firstLine="720"/>
+      </w:pPr>
+      <w:r>
+        <w:rPr>
+          <w:rFonts w:ascii="Times New Roman" w:cs="Times New Roman" w:eastAsia="Times New Roman" w:hAnsi="Times New Roman"/>
+          <w:sz w:val="24"/>
+          <w:szCs w:val="24"/>
+        </w:rPr>
+        <w:t xml:space="preserve">User registration enforces a strong password policy validated by a single regular expression employing multiple lookahead assertions. The pattern requires a minimum length of eight characters and mandates the presence of at least one lowercase letter, one uppercase letter, one digit and one special character — all evaluated within a single traversal of the input string, avoiding multiple sequential conditional checks.</w:t>
       </w:r>
     </w:p>
     <w:p>
@@ -2129,7 +2304,7 @@
     </w:p>
     <w:p>
       <w:pPr>
-        <w:spacing w:after="80"/>
+        <w:spacing w:after="100"/>
       </w:pPr>
       <w:r>
         <w:t xml:space="preserve"/>
@@ -2137,30 +2312,31 @@
     </w:p>
     <w:p>
       <w:pPr>
-        <w:spacing w:after="160"/>
-      </w:pPr>
-      <w:r>
-        <w:rPr>
-          <w:rFonts w:ascii="Calibri" w:cs="Calibri" w:eastAsia="Calibri" w:hAnsi="Calibri"/>
+        <w:spacing w:after="120" w:before="200"/>
+      </w:pPr>
+      <w:r>
+        <w:rPr>
+          <w:rFonts w:ascii="Times New Roman" w:cs="Times New Roman" w:eastAsia="Times New Roman" w:hAnsi="Times New Roman"/>
           <w:b/>
           <w:bCs/>
-          <w:sz w:val="22"/>
-          <w:szCs w:val="22"/>
-        </w:rPr>
-        <w:t xml:space="preserve">4. Parameterised Queries — SQL Injection Prevention (all controllers)</w:t>
-      </w:r>
-    </w:p>
-    <w:p>
-      <w:pPr>
-        <w:spacing w:after="160"/>
-      </w:pPr>
-      <w:r>
-        <w:rPr>
-          <w:rFonts w:ascii="Calibri" w:cs="Calibri" w:eastAsia="Calibri" w:hAnsi="Calibri"/>
-          <w:sz w:val="22"/>
-          <w:szCs w:val="22"/>
-        </w:rPr>
-        <w:t xml:space="preserve">All database interactions use the mysql2 parameterised query syntax with ? placeholders. User-supplied input is never interpolated directly into SQL strings, eliminating the risk of SQL injection attacks regardless of the input content.</w:t>
+          <w:sz w:val="24"/>
+          <w:szCs w:val="24"/>
+        </w:rPr>
+        <w:t xml:space="preserve">4. Parameterised Queries for SQL Injection Prevention (all controllers)</w:t>
+      </w:r>
+    </w:p>
+    <w:p>
+      <w:pPr>
+        <w:spacing w:after="200"/>
+        <w:ind w:firstLine="720"/>
+      </w:pPr>
+      <w:r>
+        <w:rPr>
+          <w:rFonts w:ascii="Times New Roman" w:cs="Times New Roman" w:eastAsia="Times New Roman" w:hAnsi="Times New Roman"/>
+          <w:sz w:val="24"/>
+          <w:szCs w:val="24"/>
+        </w:rPr>
+        <w:t xml:space="preserve">All database interactions are executed via the mysql2 parameterised query interface, utilising ? placeholder tokens. User-supplied input is transmitted to the database engine as a separate parameter rather than being interpolated into the SQL string, rendering SQL injection attacks structurally impossible irrespective of the content of user input (OWASP, 2021).</w:t>
       </w:r>
     </w:p>
     <w:p>
@@ -2180,7 +2356,7 @@
     </w:p>
     <w:p>
       <w:pPr>
-        <w:spacing w:after="80"/>
+        <w:spacing w:after="100"/>
       </w:pPr>
       <w:r>
         <w:t xml:space="preserve"/>
@@ -2188,30 +2364,31 @@
     </w:p>
     <w:p>
       <w:pPr>
-        <w:spacing w:after="160"/>
-      </w:pPr>
-      <w:r>
-        <w:rPr>
-          <w:rFonts w:ascii="Calibri" w:cs="Calibri" w:eastAsia="Calibri" w:hAnsi="Calibri"/>
+        <w:spacing w:after="120" w:before="200"/>
+      </w:pPr>
+      <w:r>
+        <w:rPr>
+          <w:rFonts w:ascii="Times New Roman" w:cs="Times New Roman" w:eastAsia="Times New Roman" w:hAnsi="Times New Roman"/>
           <w:b/>
           <w:bCs/>
-          <w:sz w:val="22"/>
-          <w:szCs w:val="22"/>
+          <w:sz w:val="24"/>
+          <w:szCs w:val="24"/>
         </w:rPr>
         <w:t xml:space="preserve">5. COALESCE for Null-Safe SQL Aggregation (controllers/dashboardController.js)</w:t>
       </w:r>
     </w:p>
     <w:p>
       <w:pPr>
-        <w:spacing w:after="160"/>
-      </w:pPr>
-      <w:r>
-        <w:rPr>
-          <w:rFonts w:ascii="Calibri" w:cs="Calibri" w:eastAsia="Calibri" w:hAnsi="Calibri"/>
-          <w:sz w:val="22"/>
-          <w:szCs w:val="22"/>
-        </w:rPr>
-        <w:t xml:space="preserve">The SUM aggregate function returns NULL rather than zero when applied to an empty result set. COALESCE is used to substitute a default value of 0, preventing null propagation errors in the view layer when a user has not yet logged any workouts.</w:t>
+        <w:spacing w:after="200"/>
+        <w:ind w:firstLine="720"/>
+      </w:pPr>
+      <w:r>
+        <w:rPr>
+          <w:rFonts w:ascii="Times New Roman" w:cs="Times New Roman" w:eastAsia="Times New Roman" w:hAnsi="Times New Roman"/>
+          <w:sz w:val="24"/>
+          <w:szCs w:val="24"/>
+        </w:rPr>
+        <w:t xml:space="preserve">The SQL SUM aggregate function returns NULL rather than zero when applied to an empty result set. Without mitigation, this null value would propagate into the view layer and potentially cause rendering errors. The COALESCE function is employed to substitute a default value of zero, ensuring correct behaviour for newly registered users who have not yet logged any workout entries.</w:t>
       </w:r>
     </w:p>
     <w:p>
@@ -2231,7 +2408,7 @@
     </w:p>
     <w:p>
       <w:pPr>
-        <w:spacing w:after="80"/>
+        <w:spacing w:after="100"/>
       </w:pPr>
       <w:r>
         <w:t xml:space="preserve"/>
@@ -2239,30 +2416,31 @@
     </w:p>
     <w:p>
       <w:pPr>
-        <w:spacing w:after="160"/>
-      </w:pPr>
-      <w:r>
-        <w:rPr>
-          <w:rFonts w:ascii="Calibri" w:cs="Calibri" w:eastAsia="Calibri" w:hAnsi="Calibri"/>
+        <w:spacing w:after="120" w:before="200"/>
+      </w:pPr>
+      <w:r>
+        <w:rPr>
+          <w:rFonts w:ascii="Times New Roman" w:cs="Times New Roman" w:eastAsia="Times New Roman" w:hAnsi="Times New Roman"/>
           <w:b/>
           <w:bCs/>
-          <w:sz w:val="22"/>
-          <w:szCs w:val="22"/>
-        </w:rPr>
-        <w:t xml:space="preserve">6. Ownership Enforcement on All Write Operations (controllers/workoutController.js)</w:t>
-      </w:r>
-    </w:p>
-    <w:p>
-      <w:pPr>
-        <w:spacing w:after="160"/>
-      </w:pPr>
-      <w:r>
-        <w:rPr>
-          <w:rFonts w:ascii="Calibri" w:cs="Calibri" w:eastAsia="Calibri" w:hAnsi="Calibri"/>
-          <w:sz w:val="22"/>
-          <w:szCs w:val="22"/>
-        </w:rPr>
-        <w:t xml:space="preserve">Every mutation query — update and delete — includes an AND user_id = ? predicate alongside the record identifier. This ensures that even if a user manually constructs a URL referencing another user's workout ID, the query will match zero rows and the operation will silently fail, preventing unauthorised data modification.</w:t>
+          <w:sz w:val="24"/>
+          <w:szCs w:val="24"/>
+        </w:rPr>
+        <w:t xml:space="preserve">6. Database-Level Ownership Enforcement (controllers/workoutController.js)</w:t>
+      </w:r>
+    </w:p>
+    <w:p>
+      <w:pPr>
+        <w:spacing w:after="200"/>
+        <w:ind w:firstLine="720"/>
+      </w:pPr>
+      <w:r>
+        <w:rPr>
+          <w:rFonts w:ascii="Times New Roman" w:cs="Times New Roman" w:eastAsia="Times New Roman" w:hAnsi="Times New Roman"/>
+          <w:sz w:val="24"/>
+          <w:szCs w:val="24"/>
+        </w:rPr>
+        <w:t xml:space="preserve">Every write operation — update and delete — incorporates an AND user_id = ? predicate in addition to the record primary key. This approach enforces ownership validation at the database query level rather than relying solely on application-layer session checks. Consequently, even if an authenticated user manually constructs a URL referencing another user's workout identifier, the query will match zero rows and the operation will produce no effect, preventing insecure direct object reference (IDOR) vulnerabilities (OWASP, 2021).</w:t>
       </w:r>
     </w:p>
     <w:p>
@@ -2281,32 +2459,191 @@
       </w:r>
     </w:p>
     <w:p>
+      <w:r>
+        <w:br w:type="page"/>
+      </w:r>
+    </w:p>
+    <w:p>
       <w:pPr>
         <w:pStyle w:val="Heading1"/>
-        <w:spacing w:after="200" w:before="400"/>
-      </w:pPr>
-      <w:r>
-        <w:rPr>
-          <w:rFonts w:ascii="Calibri" w:cs="Calibri" w:eastAsia="Calibri" w:hAnsi="Calibri"/>
+        <w:spacing w:after="240" w:before="480"/>
+      </w:pPr>
+      <w:r>
+        <w:rPr>
+          <w:rFonts w:ascii="Times New Roman" w:cs="Times New Roman" w:eastAsia="Times New Roman" w:hAnsi="Times New Roman"/>
           <w:b/>
           <w:bCs/>
-          <w:sz w:val="32"/>
-          <w:szCs w:val="32"/>
+          <w:sz w:val="28"/>
+          <w:szCs w:val="28"/>
         </w:rPr>
         <w:t xml:space="preserve">AI Declaration</w:t>
       </w:r>
     </w:p>
     <w:p>
       <w:pPr>
-        <w:spacing w:after="160"/>
-      </w:pPr>
-      <w:r>
-        <w:rPr>
-          <w:rFonts w:ascii="Calibri" w:cs="Calibri" w:eastAsia="Calibri" w:hAnsi="Calibri"/>
-          <w:sz w:val="22"/>
-          <w:szCs w:val="22"/>
-        </w:rPr>
-        <w:t xml:space="preserve">I used Claude, an AI assistant developed by Anthropic, to support the development of this project. The AI was used to assist with structuring the initial project folder layout, suggesting implementation patterns for Express routing and MySQL integration, and reviewing code for potential issues. All AI-generated code was reviewed, tested and where necessary modified before being incorporated into the project. The written content of this report reflects my own understanding of the system I built. My use of AI tooling is consistent with the use of documentation, tutorials and online reference materials as learning and development aids.</w:t>
+        <w:spacing w:after="200"/>
+        <w:ind w:firstLine="720"/>
+      </w:pPr>
+      <w:r>
+        <w:rPr>
+          <w:rFonts w:ascii="Times New Roman" w:cs="Times New Roman" w:eastAsia="Times New Roman" w:hAnsi="Times New Roman"/>
+          <w:sz w:val="24"/>
+          <w:szCs w:val="24"/>
+        </w:rPr>
+        <w:t xml:space="preserve">Artificial intelligence tooling, specifically the Claude assistant developed by Anthropic, was utilised as a supplementary resource during the development of this project. The AI was consulted to assist with the initial structuring of the project directory, to suggest implementation approaches for Express.js routing conventions and MySQL query patterns, and to review code for potential defects.</w:t>
+      </w:r>
+    </w:p>
+    <w:p>
+      <w:pPr>
+        <w:spacing w:after="200"/>
+        <w:ind w:firstLine="720"/>
+      </w:pPr>
+      <w:r>
+        <w:rPr>
+          <w:rFonts w:ascii="Times New Roman" w:cs="Times New Roman" w:eastAsia="Times New Roman" w:hAnsi="Times New Roman"/>
+          <w:sz w:val="24"/>
+          <w:szCs w:val="24"/>
+        </w:rPr>
+        <w:t xml:space="preserve">All AI-generated code suggestions were reviewed, evaluated and, where appropriate, modified prior to incorporation into the codebase. The written content of this report represents the author's own understanding and analysis of the implemented system. The use of AI tooling in this context is considered analogous to the use of official documentation, academic textbooks and online reference materials as development aids.</w:t>
+      </w:r>
+    </w:p>
+    <w:p>
+      <w:r>
+        <w:br w:type="page"/>
+      </w:r>
+    </w:p>
+    <w:p>
+      <w:pPr>
+        <w:pStyle w:val="Heading1"/>
+        <w:spacing w:after="240" w:before="480"/>
+      </w:pPr>
+      <w:r>
+        <w:rPr>
+          <w:rFonts w:ascii="Times New Roman" w:cs="Times New Roman" w:eastAsia="Times New Roman" w:hAnsi="Times New Roman"/>
+          <w:b/>
+          <w:bCs/>
+          <w:sz w:val="28"/>
+          <w:szCs w:val="28"/>
+        </w:rPr>
+        <w:t xml:space="preserve">References</w:t>
+      </w:r>
+    </w:p>
+    <w:p>
+      <w:pPr>
+        <w:spacing w:after="200"/>
+      </w:pPr>
+      <w:r>
+        <w:rPr>
+          <w:rFonts w:ascii="Times New Roman" w:cs="Times New Roman" w:eastAsia="Times New Roman" w:hAnsi="Times New Roman"/>
+          <w:sz w:val="24"/>
+          <w:szCs w:val="24"/>
+        </w:rPr>
+        <w:t xml:space="preserve">Gamma, E., Helm, R., Johnson, R. and Vlissides, J. (1994) Design Patterns: Elements of Reusable Object-Oriented Software. Reading, MA: Addison-Wesley.</w:t>
+      </w:r>
+    </w:p>
+    <w:p>
+      <w:pPr>
+        <w:spacing w:after="100"/>
+      </w:pPr>
+      <w:r>
+        <w:t xml:space="preserve"/>
+      </w:r>
+    </w:p>
+    <w:p>
+      <w:pPr>
+        <w:spacing w:after="200"/>
+      </w:pPr>
+      <w:r>
+        <w:rPr>
+          <w:rFonts w:ascii="Times New Roman" w:cs="Times New Roman" w:eastAsia="Times New Roman" w:hAnsi="Times New Roman"/>
+          <w:sz w:val="24"/>
+          <w:szCs w:val="24"/>
+        </w:rPr>
+        <w:t xml:space="preserve">OpenJS Foundation (2024) Express.js — Fast, unopinionated, minimalist web framework for Node.js. Available at: https://expressjs.com (Accessed: 6 June 2026).</w:t>
+      </w:r>
+    </w:p>
+    <w:p>
+      <w:pPr>
+        <w:spacing w:after="100"/>
+      </w:pPr>
+      <w:r>
+        <w:t xml:space="preserve"/>
+      </w:r>
+    </w:p>
+    <w:p>
+      <w:pPr>
+        <w:spacing w:after="200"/>
+      </w:pPr>
+      <w:r>
+        <w:rPr>
+          <w:rFonts w:ascii="Times New Roman" w:cs="Times New Roman" w:eastAsia="Times New Roman" w:hAnsi="Times New Roman"/>
+          <w:sz w:val="24"/>
+          <w:szCs w:val="24"/>
+        </w:rPr>
+        <w:t xml:space="preserve">OpenJS Foundation (2024) Node.js Documentation. Available at: https://nodejs.org/en/docs (Accessed: 6 June 2026).</w:t>
+      </w:r>
+    </w:p>
+    <w:p>
+      <w:pPr>
+        <w:spacing w:after="100"/>
+      </w:pPr>
+      <w:r>
+        <w:t xml:space="preserve"/>
+      </w:r>
+    </w:p>
+    <w:p>
+      <w:pPr>
+        <w:spacing w:after="200"/>
+      </w:pPr>
+      <w:r>
+        <w:rPr>
+          <w:rFonts w:ascii="Times New Roman" w:cs="Times New Roman" w:eastAsia="Times New Roman" w:hAnsi="Times New Roman"/>
+          <w:sz w:val="24"/>
+          <w:szCs w:val="24"/>
+        </w:rPr>
+        <w:t xml:space="preserve">OWASP (2021) OWASP Top Ten — A03: Injection and A01: Broken Access Control. Available at: https://owasp.org/Top10 (Accessed: 6 June 2026).</w:t>
+      </w:r>
+    </w:p>
+    <w:p>
+      <w:pPr>
+        <w:spacing w:after="100"/>
+      </w:pPr>
+      <w:r>
+        <w:t xml:space="preserve"/>
+      </w:r>
+    </w:p>
+    <w:p>
+      <w:pPr>
+        <w:spacing w:after="200"/>
+      </w:pPr>
+      <w:r>
+        <w:rPr>
+          <w:rFonts w:ascii="Times New Roman" w:cs="Times New Roman" w:eastAsia="Times New Roman" w:hAnsi="Times New Roman"/>
+          <w:sz w:val="24"/>
+          <w:szCs w:val="24"/>
+        </w:rPr>
+        <w:t xml:space="preserve">Provos, N. and Mazieres, D. (1999) 'A Future-Adaptable Password Scheme', Proceedings of the USENIX Annual Technical Conference, Monterey, CA, pp. 81–91.</w:t>
+      </w:r>
+    </w:p>
+    <w:p>
+      <w:pPr>
+        <w:spacing w:after="100"/>
+      </w:pPr>
+      <w:r>
+        <w:t xml:space="preserve"/>
+      </w:r>
+    </w:p>
+    <w:p>
+      <w:pPr>
+        <w:spacing w:after="200"/>
+      </w:pPr>
+      <w:r>
+        <w:rPr>
+          <w:rFonts w:ascii="Times New Roman" w:cs="Times New Roman" w:eastAsia="Times New Roman" w:hAnsi="Times New Roman"/>
+          <w:sz w:val="24"/>
+          <w:szCs w:val="24"/>
+        </w:rPr>
+        <w:t xml:space="preserve">Oracle Corporation (2024) MySQL 8.0 Reference Manual. Available at: https://dev.mysql.com/doc/refman/8.0/en (Accessed: 6 June 2026).</w:t>
       </w:r>
     </w:p>
     <w:sectPr>
@@ -2497,9 +2834,9 @@
   <w:docDefaults>
     <w:rPrDefault>
       <w:rPr>
-        <w:rFonts w:ascii="Calibri" w:cs="Calibri" w:eastAsia="Calibri" w:hAnsi="Calibri"/>
-        <w:sz w:val="22"/>
-        <w:szCs w:val="22"/>
+        <w:rFonts w:ascii="Times New Roman" w:cs="Times New Roman" w:eastAsia="Times New Roman" w:hAnsi="Times New Roman"/>
+        <w:sz w:val="24"/>
+        <w:szCs w:val="24"/>
       </w:rPr>
     </w:rPrDefault>
     <w:pPrDefault/>

</xml_diff>

<commit_message>
update report - removed dashes, more natural academic language
</commit_message>
<xml_diff>
--- a/report.docx
+++ b/report.docx
@@ -168,7 +168,7 @@
           <w:sz w:val="24"/>
           <w:szCs w:val="24"/>
         </w:rPr>
-        <w:t xml:space="preserve">FitTrack is a personal workout logging web application developed as part of the Dynamic Web Applications module. The application provides authenticated users with the ability to record, manage and review their fitness activities through a secure, user-specific interface. Each workout entry captures the exercise name, category, duration in minutes, date and optional session notes.</w:t>
+        <w:t xml:space="preserve">FitTrack is a personal workout logging web application built for the Dynamic Web Applications module. The application allows registered users to record, manage and review their fitness sessions through a private, account-based interface. Each workout entry stores the exercise name, category, duration in minutes, date and any optional notes the user wishes to add.</w:t>
       </w:r>
     </w:p>
     <w:p>
@@ -182,7 +182,7 @@
           <w:sz w:val="24"/>
           <w:szCs w:val="24"/>
         </w:rPr>
-        <w:t xml:space="preserve">Upon authentication, users are presented with a personal dashboard displaying aggregate statistics — total workouts logged, total minutes trained and total training time expressed in hours and minutes — accompanied by a summary of the five most recent entries. The system enforces strict data isolation, ensuring that each user can only access and modify records belonging to their own account.</w:t>
+        <w:t xml:space="preserve">After logging in, users land on a personal dashboard that shows a summary of their activity. This includes the total number of workouts they have logged, the total number of minutes trained, and that figure converted into hours and minutes. A list of the five most recent workouts is also shown. The application is built so that each user can only ever see and edit their own data.</w:t>
       </w:r>
     </w:p>
     <w:p>
@@ -196,7 +196,7 @@
           <w:sz w:val="24"/>
           <w:szCs w:val="24"/>
         </w:rPr>
-        <w:t xml:space="preserve">The application is implemented using Node.js (OpenJS Foundation, 2024) and Express (OpenJS Foundation, 2024) for server-side request handling, EJS for server-side HTML templating, and MySQL for persistent relational data storage. Authentication is implemented using bcrypt (Provos and Mazieres, 1999) for password hashing and express-session for session management. The codebase adheres to the Model-View-Controller (MVC) architectural pattern, with clearly separated routes, controllers, views and middleware components.</w:t>
+        <w:t xml:space="preserve">The project is built using Node.js and Express for the server, EJS for rendering HTML pages, and MySQL for storing data. Passwords are hashed before being saved using bcrypt (Provos and Mazieres, 1999), and user sessions are handled with express-session. The code follows an MVC structure, keeping routes, controllers, views and middleware in separate files.</w:t>
       </w:r>
     </w:p>
     <w:p>
@@ -226,7 +226,7 @@
           <w:sz w:val="24"/>
           <w:szCs w:val="24"/>
         </w:rPr>
-        <w:t xml:space="preserve">The application is structured across two tiers following the MVC (Model-View-Controller) pattern, a widely adopted design approach that separates presentation, business logic and data management concerns (Gamma et al., 1994).</w:t>
+        <w:t xml:space="preserve">The application follows the MVC pattern, separating the application into three distinct layers: routes and controllers handle the logic, EJS views handle the presentation, and MySQL handles data storage (Gamma et al., 1994).</w:t>
       </w:r>
     </w:p>
     <w:p>
@@ -240,7 +240,7 @@
           <w:sz w:val="24"/>
           <w:szCs w:val="24"/>
         </w:rPr>
-        <w:t xml:space="preserve">Application Tier: The Node.js runtime, in conjunction with the Express framework, processes all incoming HTTP requests. Requests traverse a middleware pipeline — encompassing session management, body parsing and route-level authentication guards — before being dispatched to the appropriate controller function. Controllers encapsulate the application business logic, interact with the database layer and supply data to EJS templates, which render the HTML responses returned to the client browser.</w:t>
+        <w:t xml:space="preserve">On the application side, Node.js and Express handle all incoming requests. Each request passes through a set of middleware functions that manage things like reading form data, checking whether the user is logged in, and handling sessions. The request then reaches the appropriate controller, which runs the necessary database queries and passes the results to an EJS template. The template renders the final HTML page and sends it back to the browser.</w:t>
       </w:r>
     </w:p>
     <w:p>
@@ -254,7 +254,7 @@
           <w:sz w:val="24"/>
           <w:szCs w:val="24"/>
         </w:rPr>
-        <w:t xml:space="preserve">Data Tier: A MySQL relational database provides persistent storage for all user and workout data. The mysql2 package manages database connectivity via a connection pool, enabling efficient handling of concurrent requests. All database credentials are externalised into environment variables and loaded at runtime via the dotenv package, maintaining a strict separation between configuration and application code.</w:t>
+        <w:t xml:space="preserve">On the data side, MySQL stores all user and workout information. The application connects using the mysql2 package with a connection pool, which allows multiple requests to be handled at the same time without opening a new connection for each one. Database credentials are stored in a separate .env file that is not included in the GitHub repository.</w:t>
       </w:r>
     </w:p>
     <w:p>
@@ -279,7 +279,7 @@
           <w:sz w:val="20"/>
           <w:szCs w:val="20"/>
         </w:rPr>
-        <w:t xml:space="preserve">Figure 1 — Application Architecture Diagram</w:t>
+        <w:t xml:space="preserve">Figure 1 - Application Architecture Diagram</w:t>
       </w:r>
     </w:p>
     <w:tbl>
@@ -795,7 +795,7 @@
           <w:sz w:val="24"/>
           <w:szCs w:val="24"/>
         </w:rPr>
-        <w:t xml:space="preserve">The database schema comprises two relational tables — users and workouts — linked by a one-to-many relationship. A single user record may be associated with many workout entries; however, each workout record references exactly one user, enforced through a foreign key constraint on the workouts.user_id column.</w:t>
+        <w:t xml:space="preserve">The database uses two tables: users and workouts. These are linked by a one-to-many relationship, meaning one user can have many workouts, but each workout belongs to only one user.</w:t>
       </w:r>
     </w:p>
     <w:p>
@@ -809,7 +809,21 @@
           <w:sz w:val="24"/>
           <w:szCs w:val="24"/>
         </w:rPr>
-        <w:t xml:space="preserve">The ON DELETE CASCADE referential integrity constraint ensures that the removal of a user account automatically propagates to all associated workout records, preventing orphaned data. All data retrieval, update and deletion queries incorporate a WHERE user_id = ? predicate alongside the record identifier, enforcing per-user data isolation at the database query level rather than relying solely on application-layer controls.</w:t>
+        <w:t xml:space="preserve">The workouts table has a user_id column that acts as a foreign key, referencing the id column in the users table. ON DELETE CASCADE is applied to this relationship, so if a user account is deleted, all of their workouts are automatically removed as well. This keeps the data clean and avoids orphaned records.</w:t>
+      </w:r>
+    </w:p>
+    <w:p>
+      <w:pPr>
+        <w:spacing w:after="200"/>
+        <w:ind w:firstLine="720"/>
+      </w:pPr>
+      <w:r>
+        <w:rPr>
+          <w:rFonts w:ascii="Times New Roman" w:cs="Times New Roman" w:eastAsia="Times New Roman" w:hAnsi="Times New Roman"/>
+          <w:sz w:val="24"/>
+          <w:szCs w:val="24"/>
+        </w:rPr>
+        <w:t xml:space="preserve">Every query that reads, updates or deletes workout data includes a WHERE user_id = ? condition alongside the workout ID. This ensures that even if someone guesses another user's workout ID in the URL, the query will not return or affect that record.</w:t>
       </w:r>
     </w:p>
     <w:p>
@@ -834,7 +848,7 @@
           <w:sz w:val="20"/>
           <w:szCs w:val="20"/>
         </w:rPr>
-        <w:t xml:space="preserve">Figure 2 — Entity Relationship Diagram</w:t>
+        <w:t xml:space="preserve">Figure 2 - Entity Relationship Diagram</w:t>
       </w:r>
     </w:p>
     <w:tbl>
@@ -942,7 +956,7 @@
                 <w:sz w:val="20"/>
                 <w:szCs w:val="20"/>
               </w:rPr>
-              <w:t xml:space="preserve">id INT — PRIMARY KEY</w:t>
+              <w:t xml:space="preserve">id INT  PRIMARY KEY</w:t>
             </w:r>
           </w:p>
         </w:tc>
@@ -972,7 +986,7 @@
                 <w:sz w:val="20"/>
                 <w:szCs w:val="20"/>
               </w:rPr>
-              <w:t xml:space="preserve">id INT — PRIMARY KEY</w:t>
+              <w:t xml:space="preserve">id INT  PRIMARY KEY</w:t>
             </w:r>
           </w:p>
         </w:tc>
@@ -1034,7 +1048,7 @@
                 <w:sz w:val="20"/>
                 <w:szCs w:val="20"/>
               </w:rPr>
-              <w:t xml:space="preserve">user_id INT — FOREIGN KEY</w:t>
+              <w:t xml:space="preserve">user_id INT  FOREIGN KEY</w:t>
             </w:r>
           </w:p>
         </w:tc>
@@ -1438,7 +1452,7 @@
                 <w:sz w:val="20"/>
                 <w:szCs w:val="20"/>
               </w:rPr>
-              <w:t xml:space="preserve">Relationship: 1 user : many workouts — ON DELETE CASCADE</w:t>
+              <w:t xml:space="preserve">Relationship: one user to many workouts, with ON DELETE CASCADE</w:t>
             </w:r>
           </w:p>
         </w:tc>
@@ -1509,7 +1523,7 @@
           <w:sz w:val="24"/>
           <w:szCs w:val="24"/>
         </w:rPr>
-        <w:t xml:space="preserve">The following section describes the user-facing functionality of the FitTrack application, illustrated with screenshots from the deployed instance.</w:t>
+        <w:t xml:space="preserve">This section describes each page of the application and what it does, supported by screenshots from the live deployed version.</w:t>
       </w:r>
     </w:p>
     <w:p>
@@ -1538,7 +1552,7 @@
           <w:sz w:val="24"/>
           <w:szCs w:val="24"/>
         </w:rPr>
-        <w:t xml:space="preserve">The home page serves as the public entry point to the application. It presents the FitTrack branding, a concise description of the service, and context-sensitive navigation controls. Unauthenticated users are presented with Register and Login options, whilst authenticated users are directed toward their personal dashboard and workout management features (see Figure 3).</w:t>
+        <w:t xml:space="preserve">The home page is the first thing a visitor sees. It introduces FitTrack and shows different options depending on whether the user is logged in. Visitors who are not logged in see a Register button and a Login button. Users who are already logged in see links to their Dashboard and to add a new workout (see Figure 3).</w:t>
       </w:r>
     </w:p>
     <w:p>
@@ -1601,7 +1615,7 @@
           <w:sz w:val="20"/>
           <w:szCs w:val="20"/>
         </w:rPr>
-        <w:t xml:space="preserve">Figure 3 — Application home page</w:t>
+        <w:t xml:space="preserve">Figure 3 - Home page</w:t>
       </w:r>
     </w:p>
     <w:p>
@@ -1630,7 +1644,7 @@
           <w:sz w:val="24"/>
           <w:szCs w:val="24"/>
         </w:rPr>
-        <w:t xml:space="preserve">The about page provides an overview of the application's purpose and enumerates the technologies employed in its development, offering transparency regarding the technical implementation (see Figure 4).</w:t>
+        <w:t xml:space="preserve">The about page gives a short description of what FitTrack does and lists the technologies it was built with. It is accessible to everyone, whether logged in or not (see Figure 4).</w:t>
       </w:r>
     </w:p>
     <w:p>
@@ -1693,7 +1707,7 @@
           <w:sz w:val="20"/>
           <w:szCs w:val="20"/>
         </w:rPr>
-        <w:t xml:space="preserve">Figure 4 — About page</w:t>
+        <w:t xml:space="preserve">Figure 4 - About page</w:t>
       </w:r>
     </w:p>
     <w:p>
@@ -1708,7 +1722,7 @@
           <w:sz w:val="24"/>
           <w:szCs w:val="24"/>
         </w:rPr>
-        <w:t xml:space="preserve">User Authentication — Login</w:t>
+        <w:t xml:space="preserve">Login</w:t>
       </w:r>
     </w:p>
     <w:p>
@@ -1722,7 +1736,7 @@
           <w:sz w:val="24"/>
           <w:szCs w:val="24"/>
         </w:rPr>
-        <w:t xml:space="preserve">The login form accepts a username and password. Submitted credentials are validated server-side by comparing the supplied password against the stored bcrypt hash using a constant-time comparison function. In the event of invalid credentials, a generic error message is returned that does not disclose which specific field was incorrect, thereby mitigating username enumeration attacks (see Figure 5).</w:t>
+        <w:t xml:space="preserve">The login form takes a username and password. The server checks the password against the stored bcrypt hash. If the credentials are wrong, the user sees a generic error message that does not say whether the username or the password was incorrect. This is intentional and helps prevent attackers from guessing valid usernames (see Figure 5).</w:t>
       </w:r>
     </w:p>
     <w:p>
@@ -1785,7 +1799,7 @@
           <w:sz w:val="20"/>
           <w:szCs w:val="20"/>
         </w:rPr>
-        <w:t xml:space="preserve">Figure 5 — Login page</w:t>
+        <w:t xml:space="preserve">Figure 5 - Login page</w:t>
       </w:r>
     </w:p>
     <w:p>
@@ -1814,7 +1828,7 @@
           <w:sz w:val="24"/>
           <w:szCs w:val="24"/>
         </w:rPr>
-        <w:t xml:space="preserve">The dashboard constitutes the primary authenticated landing page. Three summary statistic cards are computed via SQL aggregate functions — total workouts logged (COUNT), total minutes trained (SUM with COALESCE null handling), and total training time formatted as hours and minutes. The five most recent workout entries are presented in a tabular format below the statistics (see Figure 6).</w:t>
+        <w:t xml:space="preserve">After logging in, the user is taken to their dashboard. Three cards at the top show the total number of workouts they have logged, the total minutes trained, and that time shown as hours and minutes. Below that, a table lists their five most recent workouts (see Figure 6).</w:t>
       </w:r>
     </w:p>
     <w:p>
@@ -1877,7 +1891,7 @@
           <w:sz w:val="20"/>
           <w:szCs w:val="20"/>
         </w:rPr>
-        <w:t xml:space="preserve">Figure 6 — User dashboard with aggregate statistics</w:t>
+        <w:t xml:space="preserve">Figure 6 - User dashboard</w:t>
       </w:r>
     </w:p>
     <w:p>
@@ -1906,7 +1920,7 @@
           <w:sz w:val="24"/>
           <w:szCs w:val="24"/>
         </w:rPr>
-        <w:t xml:space="preserve">The add workout form collects the exercise name, category (selected from a predefined dropdown), duration in minutes, date and optional session notes. Server-side validation rejects incomplete or invalid submissions and re-renders the form with previously submitted field values preserved, accompanied by a descriptive error message (see Figure 7).</w:t>
+        <w:t xml:space="preserve">The add workout form lets users log a new session. They fill in the exercise name, pick a category from a dropdown, enter a duration, select a date, and optionally add notes. If required fields are left empty or an invalid duration is entered, the form is shown again with the previously typed values still in place and an error message explaining what went wrong (see Figure 7).</w:t>
       </w:r>
     </w:p>
     <w:p>
@@ -1969,7 +1983,7 @@
           <w:sz w:val="20"/>
           <w:szCs w:val="20"/>
         </w:rPr>
-        <w:t xml:space="preserve">Figure 7 — Add workout form with validation</w:t>
+        <w:t xml:space="preserve">Figure 7 - Add workout form</w:t>
       </w:r>
     </w:p>
     <w:p>
@@ -1998,7 +2012,7 @@
           <w:sz w:val="24"/>
           <w:szCs w:val="24"/>
         </w:rPr>
-        <w:t xml:space="preserve">The workouts page presents all entries associated with the authenticated user in descending chronological order. A search bar facilitates real-time filtering by exercise name or category, executing a parameterised LIKE query against the database. Full CRUD operations — create, read, update and delete — are available on each entry. Successful operations redirect with a query parameter that triggers a contextual confirmation message (see Figure 8).</w:t>
+        <w:t xml:space="preserve">The workouts page lists all of the logged-in user's entries, sorted by date with the most recent at the top. There is a search bar that filters results by exercise name or category by running a LIKE query against the database. Each workout card has an Edit and a Delete button. When a workout is added, updated or deleted successfully, a green message appears at the top of the page to confirm the action (see Figure 8).</w:t>
       </w:r>
     </w:p>
     <w:p>
@@ -2061,7 +2075,7 @@
           <w:sz w:val="20"/>
           <w:szCs w:val="20"/>
         </w:rPr>
-        <w:t xml:space="preserve">Figure 8 — My Workouts page with search functionality and success notification</w:t>
+        <w:t xml:space="preserve">Figure 8 - My Workouts page</w:t>
       </w:r>
     </w:p>
     <w:p>
@@ -2091,7 +2105,7 @@
           <w:sz w:val="24"/>
           <w:szCs w:val="24"/>
         </w:rPr>
-        <w:t xml:space="preserve">This section details the more technically sophisticated implementation decisions made during the development of FitTrack, accompanied by illustrative code extracts and references to the relevant source files.</w:t>
+        <w:t xml:space="preserve">This section covers the more technically involved parts of the application, with code examples and references to the files where they can be found.</w:t>
       </w:r>
     </w:p>
     <w:p>
@@ -2106,7 +2120,7 @@
           <w:sz w:val="24"/>
           <w:szCs w:val="24"/>
         </w:rPr>
-        <w:t xml:space="preserve">1. Bcrypt Adaptive Password Hashing (controllers/authController.js)</w:t>
+        <w:t xml:space="preserve">1. Bcrypt Password Hashing (controllers/authController.js)</w:t>
       </w:r>
     </w:p>
     <w:p>
@@ -2120,7 +2134,7 @@
           <w:sz w:val="24"/>
           <w:szCs w:val="24"/>
         </w:rPr>
-        <w:t xml:space="preserve">Passwords are stored exclusively as bcrypt hashes, never in plain text. Bcrypt was selected over simpler hashing algorithms such as MD5 or SHA-1 due to its intentionally slow computation — a configurable cost factor (salt rounds) of 10 renders brute-force and rainbow table attacks computationally infeasible (Provos and Mazieres, 1999). Authentication employs bcrypt.compare, which performs a constant-time comparison to prevent timing attacks.</w:t>
+        <w:t xml:space="preserve">Passwords are never stored in plain text. Instead, bcrypt is used to generate a one-way hash before saving the password to the database. The cost factor of 10 means the hashing process is deliberately slow, which makes brute-force attacks much harder (Provos and Mazieres, 1999). When a user tries to log in, bcrypt.compare checks whether the submitted password matches the stored hash without ever decrypting it.</w:t>
       </w:r>
     </w:p>
     <w:p>
@@ -2173,7 +2187,7 @@
           <w:sz w:val="24"/>
           <w:szCs w:val="24"/>
         </w:rPr>
-        <w:t xml:space="preserve">2. Centralised Template Variables via Express Middleware (index.js)</w:t>
+        <w:t xml:space="preserve">2. Shared Template Variables via Middleware (index.js)</w:t>
       </w:r>
     </w:p>
     <w:p>
@@ -2187,7 +2201,7 @@
           <w:sz w:val="24"/>
           <w:szCs w:val="24"/>
         </w:rPr>
-        <w:t xml:space="preserve">Rather than explicitly passing the authenticated username to each individual render invocation, a custom middleware function assigns it to the res.locals object at the request level. As res.locals is automatically accessible within all EJS templates for the duration of a request, this eliminates repetitive parameter passing and reduces the likelihood of omission errors across the view layer.</w:t>
+        <w:t xml:space="preserve">Instead of passing the logged-in username to every single render call manually, a middleware function adds it to res.locals once per request. Because EJS templates have automatic access to res.locals, the username is available on every page without any extra work in the individual route handlers.</w:t>
       </w:r>
     </w:p>
     <w:p>
@@ -2270,7 +2284,7 @@
           <w:sz w:val="24"/>
           <w:szCs w:val="24"/>
         </w:rPr>
-        <w:t xml:space="preserve">3. Password Strength Enforcement via Regular Expression (controllers/authController.js)</w:t>
+        <w:t xml:space="preserve">3. Password Strength Validation with Regex (controllers/authController.js)</w:t>
       </w:r>
     </w:p>
     <w:p>
@@ -2284,7 +2298,7 @@
           <w:sz w:val="24"/>
           <w:szCs w:val="24"/>
         </w:rPr>
-        <w:t xml:space="preserve">User registration enforces a strong password policy validated by a single regular expression employing multiple lookahead assertions. The pattern requires a minimum length of eight characters and mandates the presence of at least one lowercase letter, one uppercase letter, one digit and one special character — all evaluated within a single traversal of the input string, avoiding multiple sequential conditional checks.</w:t>
+        <w:t xml:space="preserve">When a user registers, their password is checked against a regular expression that uses lookahead assertions to verify that the password contains at least one lowercase letter, one uppercase letter, one number and one special character, with a minimum length of eight characters. All of these checks happen in a single pass through the input.</w:t>
       </w:r>
     </w:p>
     <w:p>
@@ -2322,7 +2336,7 @@
           <w:sz w:val="24"/>
           <w:szCs w:val="24"/>
         </w:rPr>
-        <w:t xml:space="preserve">4. Parameterised Queries for SQL Injection Prevention (all controllers)</w:t>
+        <w:t xml:space="preserve">4. Parameterised Queries to Prevent SQL Injection (all controllers)</w:t>
       </w:r>
     </w:p>
     <w:p>
@@ -2336,7 +2350,7 @@
           <w:sz w:val="24"/>
           <w:szCs w:val="24"/>
         </w:rPr>
-        <w:t xml:space="preserve">All database interactions are executed via the mysql2 parameterised query interface, utilising ? placeholder tokens. User-supplied input is transmitted to the database engine as a separate parameter rather than being interpolated into the SQL string, rendering SQL injection attacks structurally impossible irrespective of the content of user input (OWASP, 2021).</w:t>
+        <w:t xml:space="preserve">Every database query in the application uses the mysql2 parameterised query format with ? placeholders. User input is passed separately from the SQL string, which means it is never interpreted as part of the query. This prevents SQL injection attacks completely, regardless of what the user types (OWASP, 2021).</w:t>
       </w:r>
     </w:p>
     <w:p>
@@ -2374,7 +2388,7 @@
           <w:sz w:val="24"/>
           <w:szCs w:val="24"/>
         </w:rPr>
-        <w:t xml:space="preserve">5. COALESCE for Null-Safe SQL Aggregation (controllers/dashboardController.js)</w:t>
+        <w:t xml:space="preserve">5. COALESCE to Handle Empty Results Safely (controllers/dashboardController.js)</w:t>
       </w:r>
     </w:p>
     <w:p>
@@ -2388,7 +2402,7 @@
           <w:sz w:val="24"/>
           <w:szCs w:val="24"/>
         </w:rPr>
-        <w:t xml:space="preserve">The SQL SUM aggregate function returns NULL rather than zero when applied to an empty result set. Without mitigation, this null value would propagate into the view layer and potentially cause rendering errors. The COALESCE function is employed to substitute a default value of zero, ensuring correct behaviour for newly registered users who have not yet logged any workout entries.</w:t>
+        <w:t xml:space="preserve">When a new user has not logged any workouts yet, running SUM on an empty set returns NULL in MySQL. To prevent this null value from causing problems in the view, COALESCE is used to return 0 as a default. This means the dashboard always shows a valid number rather than crashing or displaying nothing.</w:t>
       </w:r>
     </w:p>
     <w:p>
@@ -2426,7 +2440,7 @@
           <w:sz w:val="24"/>
           <w:szCs w:val="24"/>
         </w:rPr>
-        <w:t xml:space="preserve">6. Database-Level Ownership Enforcement (controllers/workoutController.js)</w:t>
+        <w:t xml:space="preserve">6. Ownership Checks on Every Write Operation (controllers/workoutController.js)</w:t>
       </w:r>
     </w:p>
     <w:p>
@@ -2440,7 +2454,7 @@
           <w:sz w:val="24"/>
           <w:szCs w:val="24"/>
         </w:rPr>
-        <w:t xml:space="preserve">Every write operation — update and delete — incorporates an AND user_id = ? predicate in addition to the record primary key. This approach enforces ownership validation at the database query level rather than relying solely on application-layer session checks. Consequently, even if an authenticated user manually constructs a URL referencing another user's workout identifier, the query will match zero rows and the operation will produce no effect, preventing insecure direct object reference (IDOR) vulnerabilities (OWASP, 2021).</w:t>
+        <w:t xml:space="preserve">Every update and delete query includes AND user_id = ? alongside the workout ID. This means the query will only affect a record if it belongs to the currently logged-in user. Even if someone types another user's workout URL directly into the browser, the query returns no rows and nothing happens. This approach guards against insecure direct object reference vulnerabilities (OWASP, 2021).</w:t>
       </w:r>
     </w:p>
     <w:p>
@@ -2490,7 +2504,7 @@
           <w:sz w:val="24"/>
           <w:szCs w:val="24"/>
         </w:rPr>
-        <w:t xml:space="preserve">Artificial intelligence tooling, specifically the Claude assistant developed by Anthropic, was utilised as a supplementary resource during the development of this project. The AI was consulted to assist with the initial structuring of the project directory, to suggest implementation approaches for Express.js routing conventions and MySQL query patterns, and to review code for potential defects.</w:t>
+        <w:t xml:space="preserve">I used Claude, an AI assistant made by Anthropic, as a tool during the development of this project. I used it to help plan the folder structure at the start, to get suggestions on how to implement certain Express and MySQL patterns I was not familiar with, and to review my code for mistakes.</w:t>
       </w:r>
     </w:p>
     <w:p>
@@ -2504,7 +2518,7 @@
           <w:sz w:val="24"/>
           <w:szCs w:val="24"/>
         </w:rPr>
-        <w:t xml:space="preserve">All AI-generated code suggestions were reviewed, evaluated and, where appropriate, modified prior to incorporation into the codebase. The written content of this report represents the author's own understanding and analysis of the implemented system. The use of AI tooling in this context is considered analogous to the use of official documentation, academic textbooks and online reference materials as development aids.</w:t>
+        <w:t xml:space="preserve">Every piece of code that came from AI suggestions was read, tested and often adjusted before I included it. Writing this report and understanding how the application works is my own. Using AI in this way is similar to looking things up in documentation or following along with a tutorial, and I have been transparent about that here.</w:t>
       </w:r>
     </w:p>
     <w:p>
@@ -2559,7 +2573,7 @@
           <w:sz w:val="24"/>
           <w:szCs w:val="24"/>
         </w:rPr>
-        <w:t xml:space="preserve">OpenJS Foundation (2024) Express.js — Fast, unopinionated, minimalist web framework for Node.js. Available at: https://expressjs.com (Accessed: 6 June 2026).</w:t>
+        <w:t xml:space="preserve">OpenJS Foundation (2024) Express.js. Available at: https://expressjs.com (Accessed: 6 June 2026).</w:t>
       </w:r>
     </w:p>
     <w:p>
@@ -2601,7 +2615,7 @@
           <w:sz w:val="24"/>
           <w:szCs w:val="24"/>
         </w:rPr>
-        <w:t xml:space="preserve">OWASP (2021) OWASP Top Ten — A03: Injection and A01: Broken Access Control. Available at: https://owasp.org/Top10 (Accessed: 6 June 2026).</w:t>
+        <w:t xml:space="preserve">OWASP (2021) OWASP Top Ten. Available at: https://owasp.org/Top10 (Accessed: 6 June 2026).</w:t>
       </w:r>
     </w:p>
     <w:p>
@@ -2622,7 +2636,7 @@
           <w:sz w:val="24"/>
           <w:szCs w:val="24"/>
         </w:rPr>
-        <w:t xml:space="preserve">Provos, N. and Mazieres, D. (1999) 'A Future-Adaptable Password Scheme', Proceedings of the USENIX Annual Technical Conference, Monterey, CA, pp. 81–91.</w:t>
+        <w:t xml:space="preserve">Provos, N. and Mazieres, D. (1999) A Future-Adaptable Password Scheme. Proceedings of the USENIX Annual Technical Conference, Monterey, CA, pp. 81-91.</w:t>
       </w:r>
     </w:p>
     <w:p>

</xml_diff>

<commit_message>
update AI declaration to match module format
</commit_message>
<xml_diff>
--- a/report.docx
+++ b/report.docx
@@ -2504,7 +2504,77 @@
           <w:sz w:val="24"/>
           <w:szCs w:val="24"/>
         </w:rPr>
-        <w:t xml:space="preserve">During this project I used AI tools, mainly ChatGPT and Claude, to help me when I got stuck. I asked questions about how certain things work in Express and MySQL, used them to check my code for errors, and got ideas on how to structure parts of the project. I also used ChatGPT to help me think through the layout of the report.</w:t>
+        <w:t xml:space="preserve">I acknowledge the use of ChatGPT (https://chat.openai.com/) and Claude (https://claude.ai/) to support my learning during the development of this project. The prompts used include:</w:t>
+      </w:r>
+    </w:p>
+    <w:p>
+      <w:pPr>
+        <w:spacing w:after="100"/>
+        <w:ind w:left="720"/>
+      </w:pPr>
+      <w:r>
+        <w:rPr>
+          <w:rFonts w:ascii="Times New Roman" w:cs="Times New Roman" w:eastAsia="Times New Roman" w:hAnsi="Times New Roman"/>
+          <w:sz w:val="24"/>
+          <w:szCs w:val="24"/>
+        </w:rPr>
+        <w:t xml:space="preserve">• “How do I set up an Express app with EJS and MySQL?”</w:t>
+      </w:r>
+    </w:p>
+    <w:p>
+      <w:pPr>
+        <w:spacing w:after="100"/>
+        <w:ind w:left="720"/>
+      </w:pPr>
+      <w:r>
+        <w:rPr>
+          <w:rFonts w:ascii="Times New Roman" w:cs="Times New Roman" w:eastAsia="Times New Roman" w:hAnsi="Times New Roman"/>
+          <w:sz w:val="24"/>
+          <w:szCs w:val="24"/>
+        </w:rPr>
+        <w:t xml:space="preserve">• “How does bcrypt password hashing work in Node.js?”</w:t>
+      </w:r>
+    </w:p>
+    <w:p>
+      <w:pPr>
+        <w:spacing w:after="100"/>
+        <w:ind w:left="720"/>
+      </w:pPr>
+      <w:r>
+        <w:rPr>
+          <w:rFonts w:ascii="Times New Roman" w:cs="Times New Roman" w:eastAsia="Times New Roman" w:hAnsi="Times New Roman"/>
+          <w:sz w:val="24"/>
+          <w:szCs w:val="24"/>
+        </w:rPr>
+        <w:t xml:space="preserve">• “How do I protect routes in Express using session middleware?”</w:t>
+      </w:r>
+    </w:p>
+    <w:p>
+      <w:pPr>
+        <w:spacing w:after="100"/>
+        <w:ind w:left="720"/>
+      </w:pPr>
+      <w:r>
+        <w:rPr>
+          <w:rFonts w:ascii="Times New Roman" w:cs="Times New Roman" w:eastAsia="Times New Roman" w:hAnsi="Times New Roman"/>
+          <w:sz w:val="24"/>
+          <w:szCs w:val="24"/>
+        </w:rPr>
+        <w:t xml:space="preserve">• “What is the MVC pattern and how do I structure my files?”</w:t>
+      </w:r>
+    </w:p>
+    <w:p>
+      <w:pPr>
+        <w:spacing w:after="200"/>
+        <w:ind w:left="720"/>
+      </w:pPr>
+      <w:r>
+        <w:rPr>
+          <w:rFonts w:ascii="Times New Roman" w:cs="Times New Roman" w:eastAsia="Times New Roman" w:hAnsi="Times New Roman"/>
+          <w:sz w:val="24"/>
+          <w:szCs w:val="24"/>
+        </w:rPr>
+        <w:t xml:space="preserve">• “How do I use parameterised queries in mysql2?”</w:t>
       </w:r>
     </w:p>
     <w:p>
@@ -2518,7 +2588,7 @@
           <w:sz w:val="24"/>
           <w:szCs w:val="24"/>
         </w:rPr>
-        <w:t xml:space="preserve">Any code suggested by AI was checked, tested and changed where needed before I used it. The understanding of how the application works, and the decisions made throughout the project, are my own. I treated these tools the same way I would use Stack Overflow or official documentation.</w:t>
+        <w:t xml:space="preserve">The output from these prompts was used to understand concepts and learn how different parts of the application fit together. No AI-generated code or text was copied directly into the final submission. All code was written and adapted by me, and tested to make sure it worked correctly.</w:t>
       </w:r>
     </w:p>
     <w:p>

</xml_diff>